<commit_message>
Update thesis to v2 results
- λ=2.0/9.3% → λ=10.0/20.7% (dev-selected)
- All tables updated with v2 numbers
- Enc L1 description: "CER悪化/過学習" → "TAPSとほぼ同等/改善限定的"
- Cross-ASR: "汎用性実証" → "Whisper系列の別サイズに改善が転移"
- Wilcoxon: p=2.75e-25 → p=3.38e-93
- Ablation: CE only 0.237→0.205, CE+recon 0.229→0.200

Co-Authored-By: Claude Opus 4.6 (1M context) <noreply@anthropic.com>
</commit_message>
<xml_diff>
--- a/results/thesis.docx
+++ b/results/thesis.docx
@@ -151,7 +151,7 @@
           <w:sz w:val="20"/>
           <w:szCs w:val="20"/>
         </w:rPr>
-        <w:t xml:space="preserve">(1) 提案手法はベースラインSEのCERを9.3%改善した。</w:t>
+        <w:t xml:space="preserve">(1) 提案手法はベースラインSEのCERを20.7%改善した（0.252→0.200）。</w:t>
       </w:r>
     </w:p>
     <w:p>
@@ -164,7 +164,7 @@
           <w:sz w:val="20"/>
           <w:szCs w:val="20"/>
         </w:rPr>
-        <w:t xml:space="preserve">(2) 学習に使用していないASRモデルでも改善が確認された。</w:t>
+        <w:t xml:space="preserve">(2) 学習に使用していないWhisper系列の別サイズモデルでも改善が転移した。</w:t>
       </w:r>
     </w:p>
     <w:p>
@@ -1019,7 +1019,7 @@
           <w:sz w:val="20"/>
           <w:szCs w:val="20"/>
         </w:rPr>
-        <w:t xml:space="preserve"> = 2.0で最良のCER 0.2285を達成し、TAPS pretrainedベースラインと比較して9.3%の改善となった。Wilcoxon符号順位検定の結果、</w:t>
+        <w:t xml:space="preserve">の選択はdev CERに基づいて行い、testセットは最終評価のみに使用した。</w:t>
       </w:r>
       <w:r>
         <w:rPr>
@@ -1029,32 +1029,15 @@
           <w:sz w:val="20"/>
           <w:szCs w:val="20"/>
         </w:rPr>
-        <w:t xml:space="preserve">p</w:t>
-      </w:r>
-      <w:r>
-        <w:rPr>
-          <w:rFonts w:ascii="MS Mincho" w:cs="MS Mincho" w:eastAsia="MS Mincho" w:hAnsi="MS Mincho"/>
-          <w:sz w:val="20"/>
-          <w:szCs w:val="20"/>
-        </w:rPr>
-        <w:t xml:space="preserve"> = 2.75×10</w:t>
-      </w:r>
-      <w:r>
-        <w:rPr>
-          <w:rFonts w:ascii="MS Mincho" w:cs="MS Mincho" w:eastAsia="MS Mincho" w:hAnsi="MS Mincho"/>
-          <w:sz w:val="20"/>
-          <w:szCs w:val="20"/>
-          <w:vertAlign w:val="superscript"/>
-        </w:rPr>
-        <w:t xml:space="preserve">-25</w:t>
-      </w:r>
-      <w:r>
-        <w:rPr>
-          <w:rFonts w:ascii="MS Mincho" w:cs="MS Mincho" w:eastAsia="MS Mincho" w:hAnsi="MS Mincho"/>
-          <w:sz w:val="20"/>
-          <w:szCs w:val="20"/>
-        </w:rPr>
-        <w:t xml:space="preserve">であり統計的に極めて有意な差が確認された。また、testセットの全10話者において提案手法のCERがベースラインを下回り、改善は話者に依存しない一貫したものである。</w:t>
+        <w:t xml:space="preserve">λ</w:t>
+      </w:r>
+      <w:r>
+        <w:rPr>
+          <w:rFonts w:ascii="MS Mincho" w:cs="MS Mincho" w:eastAsia="MS Mincho" w:hAnsi="MS Mincho"/>
+          <w:sz w:val="20"/>
+          <w:szCs w:val="20"/>
+        </w:rPr>
+        <w:t xml:space="preserve"> = 10.0がdev上で最良であり、対応するtest CERは0.200で、TAPS pretrainedベースラインと比較して20.7%の改善となった。Wilcoxon符号順位検定の結果、</w:t>
       </w:r>
       <w:r>
         <w:rPr>
@@ -1064,724 +1047,32 @@
           <w:sz w:val="20"/>
           <w:szCs w:val="20"/>
         </w:rPr>
-        <w:t xml:space="preserve">λ</w:t>
-      </w:r>
-      <w:r>
-        <w:rPr>
-          <w:rFonts w:ascii="MS Mincho" w:cs="MS Mincho" w:eastAsia="MS Mincho" w:hAnsi="MS Mincho"/>
-          <w:sz w:val="20"/>
-          <w:szCs w:val="20"/>
-        </w:rPr>
-        <w:t xml:space="preserve">が大きすぎると（</w:t>
-      </w:r>
-      <w:r>
-        <w:rPr>
-          <w:rFonts w:ascii="Cambria Math" w:cs="Cambria Math" w:eastAsia="Cambria Math" w:hAnsi="Cambria Math"/>
-          <w:i/>
-          <w:iCs/>
-          <w:sz w:val="20"/>
-          <w:szCs w:val="20"/>
-        </w:rPr>
-        <w:t xml:space="preserve">λ</w:t>
-      </w:r>
-      <w:r>
-        <w:rPr>
-          <w:rFonts w:ascii="MS Mincho" w:cs="MS Mincho" w:eastAsia="MS Mincho" w:hAnsi="MS Mincho"/>
-          <w:sz w:val="20"/>
-          <w:szCs w:val="20"/>
-        </w:rPr>
-        <w:t xml:space="preserve"> = 5.0以降）CERが悪化に転じる。これはASR損失への偏重により波形品質が崩壊するためと考えられる。</w:t>
-      </w:r>
-    </w:p>
-    <w:tbl>
-      <w:tblPr>
-        <w:tblW w:type="dxa" w:w="4200"/>
-        <w:tblBorders>
-          <w:top w:val="single" w:color="auto" w:sz="4"/>
-          <w:left w:val="single" w:color="auto" w:sz="4"/>
-          <w:bottom w:val="single" w:color="auto" w:sz="4"/>
-          <w:right w:val="single" w:color="auto" w:sz="4"/>
-          <w:insideH w:val="single" w:color="auto" w:sz="4"/>
-          <w:insideV w:val="single" w:color="auto" w:sz="4"/>
-        </w:tblBorders>
-      </w:tblPr>
-      <w:tblGrid>
-        <w:gridCol w:w="1600"/>
-        <w:gridCol w:w="1300"/>
-        <w:gridCol w:w="1300"/>
-      </w:tblGrid>
-      <w:tr>
-        <w:tc>
-          <w:tcPr>
-            <w:tcW w:type="dxa" w:w="1600"/>
-            <w:tcBorders>
-              <w:top w:val="single" w:color="888888" w:sz="1"/>
-              <w:left w:val="single" w:color="888888" w:sz="1"/>
-              <w:bottom w:val="single" w:color="888888" w:sz="1"/>
-              <w:right w:val="single" w:color="888888" w:sz="1"/>
-            </w:tcBorders>
-            <w:shd w:fill="D9E2F3" w:val="clear"/>
-            <w:tcMar>
-              <w:top w:type="dxa" w:w="20"/>
-              <w:left w:type="dxa" w:w="60"/>
-              <w:bottom w:type="dxa" w:w="20"/>
-              <w:right w:type="dxa" w:w="60"/>
-            </w:tcMar>
-          </w:tcPr>
-          <w:p>
-            <w:pPr>
-              <w:spacing w:after="0" w:line="240"/>
-              <w:jc w:val="center"/>
-            </w:pPr>
-            <w:r>
-              <w:rPr>
-                <w:rFonts w:ascii="MS Mincho" w:cs="MS Mincho" w:eastAsia="MS Mincho" w:hAnsi="MS Mincho"/>
-                <w:b/>
-                <w:bCs/>
-                <w:sz w:val="17"/>
-                <w:szCs w:val="17"/>
-              </w:rPr>
-              <w:t xml:space="preserve">λ</w:t>
-            </w:r>
-          </w:p>
-        </w:tc>
-        <w:tc>
-          <w:tcPr>
-            <w:tcW w:type="dxa" w:w="1300"/>
-            <w:tcBorders>
-              <w:top w:val="single" w:color="888888" w:sz="1"/>
-              <w:left w:val="single" w:color="888888" w:sz="1"/>
-              <w:bottom w:val="single" w:color="888888" w:sz="1"/>
-              <w:right w:val="single" w:color="888888" w:sz="1"/>
-            </w:tcBorders>
-            <w:shd w:fill="D9E2F3" w:val="clear"/>
-            <w:tcMar>
-              <w:top w:type="dxa" w:w="20"/>
-              <w:left w:type="dxa" w:w="60"/>
-              <w:bottom w:type="dxa" w:w="20"/>
-              <w:right w:type="dxa" w:w="60"/>
-            </w:tcMar>
-          </w:tcPr>
-          <w:p>
-            <w:pPr>
-              <w:spacing w:after="0" w:line="240"/>
-              <w:jc w:val="center"/>
-            </w:pPr>
-            <w:r>
-              <w:rPr>
-                <w:rFonts w:ascii="MS Mincho" w:cs="MS Mincho" w:eastAsia="MS Mincho" w:hAnsi="MS Mincho"/>
-                <w:b/>
-                <w:bCs/>
-                <w:sz w:val="17"/>
-                <w:szCs w:val="17"/>
-              </w:rPr>
-              <w:t xml:space="preserve">CER</w:t>
-            </w:r>
-          </w:p>
-        </w:tc>
-        <w:tc>
-          <w:tcPr>
-            <w:tcW w:type="dxa" w:w="1300"/>
-            <w:tcBorders>
-              <w:top w:val="single" w:color="888888" w:sz="1"/>
-              <w:left w:val="single" w:color="888888" w:sz="1"/>
-              <w:bottom w:val="single" w:color="888888" w:sz="1"/>
-              <w:right w:val="single" w:color="888888" w:sz="1"/>
-            </w:tcBorders>
-            <w:shd w:fill="D9E2F3" w:val="clear"/>
-            <w:tcMar>
-              <w:top w:type="dxa" w:w="20"/>
-              <w:left w:type="dxa" w:w="60"/>
-              <w:bottom w:type="dxa" w:w="20"/>
-              <w:right w:type="dxa" w:w="60"/>
-            </w:tcMar>
-          </w:tcPr>
-          <w:p>
-            <w:pPr>
-              <w:spacing w:after="0" w:line="240"/>
-              <w:jc w:val="center"/>
-            </w:pPr>
-            <w:r>
-              <w:rPr>
-                <w:rFonts w:ascii="MS Mincho" w:cs="MS Mincho" w:eastAsia="MS Mincho" w:hAnsi="MS Mincho"/>
-                <w:b/>
-                <w:bCs/>
-                <w:sz w:val="17"/>
-                <w:szCs w:val="17"/>
-              </w:rPr>
-              <w:t xml:space="preserve">Δ vs TAPS</w:t>
-            </w:r>
-          </w:p>
-        </w:tc>
-      </w:tr>
-      <w:tr>
-        <w:tc>
-          <w:tcPr>
-            <w:tcW w:type="dxa" w:w="1600"/>
-            <w:tcBorders>
-              <w:top w:val="single" w:color="888888" w:sz="1"/>
-              <w:left w:val="single" w:color="888888" w:sz="1"/>
-              <w:bottom w:val="single" w:color="888888" w:sz="1"/>
-              <w:right w:val="single" w:color="888888" w:sz="1"/>
-            </w:tcBorders>
-            <w:tcMar>
-              <w:top w:type="dxa" w:w="20"/>
-              <w:left w:type="dxa" w:w="60"/>
-              <w:bottom w:type="dxa" w:w="20"/>
-              <w:right w:type="dxa" w:w="60"/>
-            </w:tcMar>
-          </w:tcPr>
-          <w:p>
-            <w:pPr>
-              <w:spacing w:after="0" w:line="240"/>
-              <w:jc w:val="left"/>
-            </w:pPr>
-            <w:r>
-              <w:rPr>
-                <w:rFonts w:ascii="MS Mincho" w:cs="MS Mincho" w:eastAsia="MS Mincho" w:hAnsi="MS Mincho"/>
-                <w:sz w:val="17"/>
-                <w:szCs w:val="17"/>
-              </w:rPr>
-              <w:t xml:space="preserve">TAPS pretrained</w:t>
-            </w:r>
-          </w:p>
-        </w:tc>
-        <w:tc>
-          <w:tcPr>
-            <w:tcW w:type="dxa" w:w="1300"/>
-            <w:tcBorders>
-              <w:top w:val="single" w:color="888888" w:sz="1"/>
-              <w:left w:val="single" w:color="888888" w:sz="1"/>
-              <w:bottom w:val="single" w:color="888888" w:sz="1"/>
-              <w:right w:val="single" w:color="888888" w:sz="1"/>
-            </w:tcBorders>
-            <w:tcMar>
-              <w:top w:type="dxa" w:w="20"/>
-              <w:left w:type="dxa" w:w="60"/>
-              <w:bottom w:type="dxa" w:w="20"/>
-              <w:right w:type="dxa" w:w="60"/>
-            </w:tcMar>
-          </w:tcPr>
-          <w:p>
-            <w:pPr>
-              <w:spacing w:after="0" w:line="240"/>
-              <w:jc w:val="center"/>
-            </w:pPr>
-            <w:r>
-              <w:rPr>
-                <w:rFonts w:ascii="MS Mincho" w:cs="MS Mincho" w:eastAsia="MS Mincho" w:hAnsi="MS Mincho"/>
-                <w:sz w:val="17"/>
-                <w:szCs w:val="17"/>
-              </w:rPr>
-              <w:t xml:space="preserve">0.2518</w:t>
-            </w:r>
-          </w:p>
-        </w:tc>
-        <w:tc>
-          <w:tcPr>
-            <w:tcW w:type="dxa" w:w="1300"/>
-            <w:tcBorders>
-              <w:top w:val="single" w:color="888888" w:sz="1"/>
-              <w:left w:val="single" w:color="888888" w:sz="1"/>
-              <w:bottom w:val="single" w:color="888888" w:sz="1"/>
-              <w:right w:val="single" w:color="888888" w:sz="1"/>
-            </w:tcBorders>
-            <w:tcMar>
-              <w:top w:type="dxa" w:w="20"/>
-              <w:left w:type="dxa" w:w="60"/>
-              <w:bottom w:type="dxa" w:w="20"/>
-              <w:right w:type="dxa" w:w="60"/>
-            </w:tcMar>
-          </w:tcPr>
-          <w:p>
-            <w:pPr>
-              <w:spacing w:after="0" w:line="240"/>
-              <w:jc w:val="center"/>
-            </w:pPr>
-            <w:r>
-              <w:rPr>
-                <w:rFonts w:ascii="MS Mincho" w:cs="MS Mincho" w:eastAsia="MS Mincho" w:hAnsi="MS Mincho"/>
-                <w:sz w:val="17"/>
-                <w:szCs w:val="17"/>
-              </w:rPr>
-              <w:t xml:space="preserve">—</w:t>
-            </w:r>
-          </w:p>
-        </w:tc>
-      </w:tr>
-      <w:tr>
-        <w:tc>
-          <w:tcPr>
-            <w:tcW w:type="dxa" w:w="1600"/>
-            <w:tcBorders>
-              <w:top w:val="single" w:color="888888" w:sz="1"/>
-              <w:left w:val="single" w:color="888888" w:sz="1"/>
-              <w:bottom w:val="single" w:color="888888" w:sz="1"/>
-              <w:right w:val="single" w:color="888888" w:sz="1"/>
-            </w:tcBorders>
-            <w:tcMar>
-              <w:top w:type="dxa" w:w="20"/>
-              <w:left w:type="dxa" w:w="60"/>
-              <w:bottom w:type="dxa" w:w="20"/>
-              <w:right w:type="dxa" w:w="60"/>
-            </w:tcMar>
-          </w:tcPr>
-          <w:p>
-            <w:pPr>
-              <w:spacing w:after="0" w:line="240"/>
-              <w:jc w:val="left"/>
-            </w:pPr>
-            <w:r>
-              <w:rPr>
-                <w:rFonts w:ascii="MS Mincho" w:cs="MS Mincho" w:eastAsia="MS Mincho" w:hAnsi="MS Mincho"/>
-                <w:sz w:val="17"/>
-                <w:szCs w:val="17"/>
-              </w:rPr>
-              <w:t xml:space="preserve">CE λ=0.5</w:t>
-            </w:r>
-          </w:p>
-        </w:tc>
-        <w:tc>
-          <w:tcPr>
-            <w:tcW w:type="dxa" w:w="1300"/>
-            <w:tcBorders>
-              <w:top w:val="single" w:color="888888" w:sz="1"/>
-              <w:left w:val="single" w:color="888888" w:sz="1"/>
-              <w:bottom w:val="single" w:color="888888" w:sz="1"/>
-              <w:right w:val="single" w:color="888888" w:sz="1"/>
-            </w:tcBorders>
-            <w:tcMar>
-              <w:top w:type="dxa" w:w="20"/>
-              <w:left w:type="dxa" w:w="60"/>
-              <w:bottom w:type="dxa" w:w="20"/>
-              <w:right w:type="dxa" w:w="60"/>
-            </w:tcMar>
-          </w:tcPr>
-          <w:p>
-            <w:pPr>
-              <w:spacing w:after="0" w:line="240"/>
-              <w:jc w:val="center"/>
-            </w:pPr>
-            <w:r>
-              <w:rPr>
-                <w:rFonts w:ascii="MS Mincho" w:cs="MS Mincho" w:eastAsia="MS Mincho" w:hAnsi="MS Mincho"/>
-                <w:sz w:val="17"/>
-                <w:szCs w:val="17"/>
-              </w:rPr>
-              <w:t xml:space="preserve">0.2360</w:t>
-            </w:r>
-          </w:p>
-        </w:tc>
-        <w:tc>
-          <w:tcPr>
-            <w:tcW w:type="dxa" w:w="1300"/>
-            <w:tcBorders>
-              <w:top w:val="single" w:color="888888" w:sz="1"/>
-              <w:left w:val="single" w:color="888888" w:sz="1"/>
-              <w:bottom w:val="single" w:color="888888" w:sz="1"/>
-              <w:right w:val="single" w:color="888888" w:sz="1"/>
-            </w:tcBorders>
-            <w:tcMar>
-              <w:top w:type="dxa" w:w="20"/>
-              <w:left w:type="dxa" w:w="60"/>
-              <w:bottom w:type="dxa" w:w="20"/>
-              <w:right w:type="dxa" w:w="60"/>
-            </w:tcMar>
-          </w:tcPr>
-          <w:p>
-            <w:pPr>
-              <w:spacing w:after="0" w:line="240"/>
-              <w:jc w:val="center"/>
-            </w:pPr>
-            <w:r>
-              <w:rPr>
-                <w:rFonts w:ascii="MS Mincho" w:cs="MS Mincho" w:eastAsia="MS Mincho" w:hAnsi="MS Mincho"/>
-                <w:sz w:val="17"/>
-                <w:szCs w:val="17"/>
-              </w:rPr>
-              <w:t xml:space="preserve">-6.3%</w:t>
-            </w:r>
-          </w:p>
-        </w:tc>
-      </w:tr>
-      <w:tr>
-        <w:tc>
-          <w:tcPr>
-            <w:tcW w:type="dxa" w:w="1600"/>
-            <w:tcBorders>
-              <w:top w:val="single" w:color="888888" w:sz="1"/>
-              <w:left w:val="single" w:color="888888" w:sz="1"/>
-              <w:bottom w:val="single" w:color="888888" w:sz="1"/>
-              <w:right w:val="single" w:color="888888" w:sz="1"/>
-            </w:tcBorders>
-            <w:tcMar>
-              <w:top w:type="dxa" w:w="20"/>
-              <w:left w:type="dxa" w:w="60"/>
-              <w:bottom w:type="dxa" w:w="20"/>
-              <w:right w:type="dxa" w:w="60"/>
-            </w:tcMar>
-          </w:tcPr>
-          <w:p>
-            <w:pPr>
-              <w:spacing w:after="0" w:line="240"/>
-              <w:jc w:val="left"/>
-            </w:pPr>
-            <w:r>
-              <w:rPr>
-                <w:rFonts w:ascii="MS Mincho" w:cs="MS Mincho" w:eastAsia="MS Mincho" w:hAnsi="MS Mincho"/>
-                <w:sz w:val="17"/>
-                <w:szCs w:val="17"/>
-              </w:rPr>
-              <w:t xml:space="preserve">CE λ=1.0</w:t>
-            </w:r>
-          </w:p>
-        </w:tc>
-        <w:tc>
-          <w:tcPr>
-            <w:tcW w:type="dxa" w:w="1300"/>
-            <w:tcBorders>
-              <w:top w:val="single" w:color="888888" w:sz="1"/>
-              <w:left w:val="single" w:color="888888" w:sz="1"/>
-              <w:bottom w:val="single" w:color="888888" w:sz="1"/>
-              <w:right w:val="single" w:color="888888" w:sz="1"/>
-            </w:tcBorders>
-            <w:tcMar>
-              <w:top w:type="dxa" w:w="20"/>
-              <w:left w:type="dxa" w:w="60"/>
-              <w:bottom w:type="dxa" w:w="20"/>
-              <w:right w:type="dxa" w:w="60"/>
-            </w:tcMar>
-          </w:tcPr>
-          <w:p>
-            <w:pPr>
-              <w:spacing w:after="0" w:line="240"/>
-              <w:jc w:val="center"/>
-            </w:pPr>
-            <w:r>
-              <w:rPr>
-                <w:rFonts w:ascii="MS Mincho" w:cs="MS Mincho" w:eastAsia="MS Mincho" w:hAnsi="MS Mincho"/>
-                <w:sz w:val="17"/>
-                <w:szCs w:val="17"/>
-              </w:rPr>
-              <w:t xml:space="preserve">0.2294</w:t>
-            </w:r>
-          </w:p>
-        </w:tc>
-        <w:tc>
-          <w:tcPr>
-            <w:tcW w:type="dxa" w:w="1300"/>
-            <w:tcBorders>
-              <w:top w:val="single" w:color="888888" w:sz="1"/>
-              <w:left w:val="single" w:color="888888" w:sz="1"/>
-              <w:bottom w:val="single" w:color="888888" w:sz="1"/>
-              <w:right w:val="single" w:color="888888" w:sz="1"/>
-            </w:tcBorders>
-            <w:tcMar>
-              <w:top w:type="dxa" w:w="20"/>
-              <w:left w:type="dxa" w:w="60"/>
-              <w:bottom w:type="dxa" w:w="20"/>
-              <w:right w:type="dxa" w:w="60"/>
-            </w:tcMar>
-          </w:tcPr>
-          <w:p>
-            <w:pPr>
-              <w:spacing w:after="0" w:line="240"/>
-              <w:jc w:val="center"/>
-            </w:pPr>
-            <w:r>
-              <w:rPr>
-                <w:rFonts w:ascii="MS Mincho" w:cs="MS Mincho" w:eastAsia="MS Mincho" w:hAnsi="MS Mincho"/>
-                <w:sz w:val="17"/>
-                <w:szCs w:val="17"/>
-              </w:rPr>
-              <w:t xml:space="preserve">-8.9%</w:t>
-            </w:r>
-          </w:p>
-        </w:tc>
-      </w:tr>
-      <w:tr>
-        <w:tc>
-          <w:tcPr>
-            <w:tcW w:type="dxa" w:w="1600"/>
-            <w:tcBorders>
-              <w:top w:val="single" w:color="888888" w:sz="1"/>
-              <w:left w:val="single" w:color="888888" w:sz="1"/>
-              <w:bottom w:val="single" w:color="888888" w:sz="1"/>
-              <w:right w:val="single" w:color="888888" w:sz="1"/>
-            </w:tcBorders>
-            <w:tcMar>
-              <w:top w:type="dxa" w:w="20"/>
-              <w:left w:type="dxa" w:w="60"/>
-              <w:bottom w:type="dxa" w:w="20"/>
-              <w:right w:type="dxa" w:w="60"/>
-            </w:tcMar>
-          </w:tcPr>
-          <w:p>
-            <w:pPr>
-              <w:spacing w:after="0" w:line="240"/>
-              <w:jc w:val="left"/>
-            </w:pPr>
-            <w:r>
-              <w:rPr>
-                <w:rFonts w:ascii="MS Mincho" w:cs="MS Mincho" w:eastAsia="MS Mincho" w:hAnsi="MS Mincho"/>
-                <w:sz w:val="17"/>
-                <w:szCs w:val="17"/>
-              </w:rPr>
-              <w:t xml:space="preserve">CE λ=2.0（最良）</w:t>
-            </w:r>
-          </w:p>
-        </w:tc>
-        <w:tc>
-          <w:tcPr>
-            <w:tcW w:type="dxa" w:w="1300"/>
-            <w:tcBorders>
-              <w:top w:val="single" w:color="888888" w:sz="1"/>
-              <w:left w:val="single" w:color="888888" w:sz="1"/>
-              <w:bottom w:val="single" w:color="888888" w:sz="1"/>
-              <w:right w:val="single" w:color="888888" w:sz="1"/>
-            </w:tcBorders>
-            <w:tcMar>
-              <w:top w:type="dxa" w:w="20"/>
-              <w:left w:type="dxa" w:w="60"/>
-              <w:bottom w:type="dxa" w:w="20"/>
-              <w:right w:type="dxa" w:w="60"/>
-            </w:tcMar>
-          </w:tcPr>
-          <w:p>
-            <w:pPr>
-              <w:spacing w:after="0" w:line="240"/>
-              <w:jc w:val="center"/>
-            </w:pPr>
-            <w:r>
-              <w:rPr>
-                <w:rFonts w:ascii="MS Mincho" w:cs="MS Mincho" w:eastAsia="MS Mincho" w:hAnsi="MS Mincho"/>
-                <w:sz w:val="17"/>
-                <w:szCs w:val="17"/>
-              </w:rPr>
-              <w:t xml:space="preserve">0.2285</w:t>
-            </w:r>
-          </w:p>
-        </w:tc>
-        <w:tc>
-          <w:tcPr>
-            <w:tcW w:type="dxa" w:w="1300"/>
-            <w:tcBorders>
-              <w:top w:val="single" w:color="888888" w:sz="1"/>
-              <w:left w:val="single" w:color="888888" w:sz="1"/>
-              <w:bottom w:val="single" w:color="888888" w:sz="1"/>
-              <w:right w:val="single" w:color="888888" w:sz="1"/>
-            </w:tcBorders>
-            <w:tcMar>
-              <w:top w:type="dxa" w:w="20"/>
-              <w:left w:type="dxa" w:w="60"/>
-              <w:bottom w:type="dxa" w:w="20"/>
-              <w:right w:type="dxa" w:w="60"/>
-            </w:tcMar>
-          </w:tcPr>
-          <w:p>
-            <w:pPr>
-              <w:spacing w:after="0" w:line="240"/>
-              <w:jc w:val="center"/>
-            </w:pPr>
-            <w:r>
-              <w:rPr>
-                <w:rFonts w:ascii="MS Mincho" w:cs="MS Mincho" w:eastAsia="MS Mincho" w:hAnsi="MS Mincho"/>
-                <w:sz w:val="17"/>
-                <w:szCs w:val="17"/>
-              </w:rPr>
-              <w:t xml:space="preserve">-9.3%</w:t>
-            </w:r>
-          </w:p>
-        </w:tc>
-      </w:tr>
-      <w:tr>
-        <w:tc>
-          <w:tcPr>
-            <w:tcW w:type="dxa" w:w="1600"/>
-            <w:tcBorders>
-              <w:top w:val="single" w:color="888888" w:sz="1"/>
-              <w:left w:val="single" w:color="888888" w:sz="1"/>
-              <w:bottom w:val="single" w:color="888888" w:sz="1"/>
-              <w:right w:val="single" w:color="888888" w:sz="1"/>
-            </w:tcBorders>
-            <w:tcMar>
-              <w:top w:type="dxa" w:w="20"/>
-              <w:left w:type="dxa" w:w="60"/>
-              <w:bottom w:type="dxa" w:w="20"/>
-              <w:right w:type="dxa" w:w="60"/>
-            </w:tcMar>
-          </w:tcPr>
-          <w:p>
-            <w:pPr>
-              <w:spacing w:after="0" w:line="240"/>
-              <w:jc w:val="left"/>
-            </w:pPr>
-            <w:r>
-              <w:rPr>
-                <w:rFonts w:ascii="MS Mincho" w:cs="MS Mincho" w:eastAsia="MS Mincho" w:hAnsi="MS Mincho"/>
-                <w:sz w:val="17"/>
-                <w:szCs w:val="17"/>
-              </w:rPr>
-              <w:t xml:space="preserve">CE λ=5.0</w:t>
-            </w:r>
-          </w:p>
-        </w:tc>
-        <w:tc>
-          <w:tcPr>
-            <w:tcW w:type="dxa" w:w="1300"/>
-            <w:tcBorders>
-              <w:top w:val="single" w:color="888888" w:sz="1"/>
-              <w:left w:val="single" w:color="888888" w:sz="1"/>
-              <w:bottom w:val="single" w:color="888888" w:sz="1"/>
-              <w:right w:val="single" w:color="888888" w:sz="1"/>
-            </w:tcBorders>
-            <w:tcMar>
-              <w:top w:type="dxa" w:w="20"/>
-              <w:left w:type="dxa" w:w="60"/>
-              <w:bottom w:type="dxa" w:w="20"/>
-              <w:right w:type="dxa" w:w="60"/>
-            </w:tcMar>
-          </w:tcPr>
-          <w:p>
-            <w:pPr>
-              <w:spacing w:after="0" w:line="240"/>
-              <w:jc w:val="center"/>
-            </w:pPr>
-            <w:r>
-              <w:rPr>
-                <w:rFonts w:ascii="MS Mincho" w:cs="MS Mincho" w:eastAsia="MS Mincho" w:hAnsi="MS Mincho"/>
-                <w:sz w:val="17"/>
-                <w:szCs w:val="17"/>
-              </w:rPr>
-              <w:t xml:space="preserve">0.2404</w:t>
-            </w:r>
-          </w:p>
-        </w:tc>
-        <w:tc>
-          <w:tcPr>
-            <w:tcW w:type="dxa" w:w="1300"/>
-            <w:tcBorders>
-              <w:top w:val="single" w:color="888888" w:sz="1"/>
-              <w:left w:val="single" w:color="888888" w:sz="1"/>
-              <w:bottom w:val="single" w:color="888888" w:sz="1"/>
-              <w:right w:val="single" w:color="888888" w:sz="1"/>
-            </w:tcBorders>
-            <w:tcMar>
-              <w:top w:type="dxa" w:w="20"/>
-              <w:left w:type="dxa" w:w="60"/>
-              <w:bottom w:type="dxa" w:w="20"/>
-              <w:right w:type="dxa" w:w="60"/>
-            </w:tcMar>
-          </w:tcPr>
-          <w:p>
-            <w:pPr>
-              <w:spacing w:after="0" w:line="240"/>
-              <w:jc w:val="center"/>
-            </w:pPr>
-            <w:r>
-              <w:rPr>
-                <w:rFonts w:ascii="MS Mincho" w:cs="MS Mincho" w:eastAsia="MS Mincho" w:hAnsi="MS Mincho"/>
-                <w:sz w:val="17"/>
-                <w:szCs w:val="17"/>
-              </w:rPr>
-              <w:t xml:space="preserve">-4.5%</w:t>
-            </w:r>
-          </w:p>
-        </w:tc>
-      </w:tr>
-    </w:tbl>
-    <w:p>
-      <w:pPr>
-        <w:spacing w:after="140" w:before="30"/>
-        <w:jc w:val="center"/>
-      </w:pPr>
-      <w:r>
-        <w:rPr>
-          <w:rFonts w:ascii="MS Mincho" w:cs="MS Mincho" w:eastAsia="MS Mincho" w:hAnsi="MS Mincho"/>
-          <w:i/>
-          <w:iCs/>
-          <w:sz w:val="17"/>
-          <w:szCs w:val="17"/>
-        </w:rPr>
-        <w:t xml:space="preserve">表1: CE損失のλ値とCER（Whisper-small、test 1,000発話）</w:t>
-      </w:r>
-    </w:p>
-    <w:p>
-      <w:pPr>
-        <w:spacing w:after="60" w:line="300"/>
-      </w:pPr>
-      <w:r>
-        <w:rPr>
-          <w:rFonts w:ascii="MS Mincho" w:cs="MS Mincho" w:eastAsia="MS Mincho" w:hAnsi="MS Mincho"/>
-          <w:sz w:val="20"/>
-          <w:szCs w:val="20"/>
-        </w:rPr>
-        <w:t xml:space="preserve">また、再構成損失（L1+STFT）の必要性を検証するablation実験を行った。CE損失のみ（再構成損失なし、</w:t>
-      </w:r>
-      <w:r>
-        <w:rPr>
-          <w:rFonts w:ascii="Cambria Math" w:cs="Cambria Math" w:eastAsia="Cambria Math" w:hAnsi="Cambria Math"/>
-          <w:i/>
-          <w:iCs/>
-          <w:sz w:val="20"/>
-          <w:szCs w:val="20"/>
-        </w:rPr>
-        <w:t xml:space="preserve">λ</w:t>
-      </w:r>
-      <w:r>
-        <w:rPr>
-          <w:rFonts w:ascii="MS Mincho" w:cs="MS Mincho" w:eastAsia="MS Mincho" w:hAnsi="MS Mincho"/>
-          <w:sz w:val="20"/>
-          <w:szCs w:val="20"/>
-        </w:rPr>
-        <w:t xml:space="preserve"> = 2.0）で学習した場合のCERは0.237であり、TAPS pretrained（0.252）を上回るものの、再構成損失を加えた場合（0.229）と比較すると劣る。この結果は、再構成損失による波形品質の維持がASR精度にも寄与しており、両損失が相補的に機能していることを示している。</w:t>
-      </w:r>
-    </w:p>
-    <w:p>
-      <w:pPr>
-        <w:pStyle w:val="Heading2"/>
-        <w:spacing w:after="80" w:before="160"/>
-      </w:pPr>
-      <w:r>
-        <w:rPr>
-          <w:rFonts w:ascii="MS Gothic" w:cs="MS Gothic" w:eastAsia="MS Gothic" w:hAnsi="MS Gothic"/>
-          <w:b/>
-          <w:bCs/>
-          <w:sz w:val="22"/>
-          <w:szCs w:val="22"/>
-        </w:rPr>
-        <w:t xml:space="preserve">4.2 別ASRモデルでの評価</w:t>
-      </w:r>
-    </w:p>
-    <w:p>
-      <w:pPr>
-        <w:spacing w:after="60" w:line="300"/>
-      </w:pPr>
-      <w:r>
-        <w:rPr>
-          <w:rFonts w:ascii="MS Mincho" w:cs="MS Mincho" w:eastAsia="MS Mincho" w:hAnsi="MS Mincho"/>
-          <w:sz w:val="20"/>
-          <w:szCs w:val="20"/>
-        </w:rPr>
-        <w:t xml:space="preserve">表2に、Whisper-smallで学習したCE-aware SEを異なるASRモデルで評価した結果を示す。提案手法（CE </w:t>
-      </w:r>
-      <w:r>
-        <w:rPr>
-          <w:rFonts w:ascii="Cambria Math" w:cs="Cambria Math" w:eastAsia="Cambria Math" w:hAnsi="Cambria Math"/>
-          <w:i/>
-          <w:iCs/>
-          <w:sz w:val="20"/>
-          <w:szCs w:val="20"/>
-        </w:rPr>
-        <w:t xml:space="preserve">λ</w:t>
-      </w:r>
-      <w:r>
-        <w:rPr>
-          <w:rFonts w:ascii="MS Mincho" w:cs="MS Mincho" w:eastAsia="MS Mincho" w:hAnsi="MS Mincho"/>
-          <w:sz w:val="20"/>
-          <w:szCs w:val="20"/>
-        </w:rPr>
-        <w:t xml:space="preserve"> = 2.0）は全3モデルでTAPS pretrainedを上回っており、学習に使用した特定のASRモデルへの過学習は確認されなかった。一方、encoder距離損失（Enc L1）はWhisper-baseおよびWhisper-smallでTAPSよりCERが悪化している。</w:t>
+        <w:t xml:space="preserve">p</w:t>
+      </w:r>
+      <w:r>
+        <w:rPr>
+          <w:rFonts w:ascii="MS Mincho" w:cs="MS Mincho" w:eastAsia="MS Mincho" w:hAnsi="MS Mincho"/>
+          <w:sz w:val="20"/>
+          <w:szCs w:val="20"/>
+        </w:rPr>
+        <w:t xml:space="preserve"> = 3.38×10</w:t>
+      </w:r>
+      <w:r>
+        <w:rPr>
+          <w:rFonts w:ascii="MS Mincho" w:cs="MS Mincho" w:eastAsia="MS Mincho" w:hAnsi="MS Mincho"/>
+          <w:sz w:val="20"/>
+          <w:szCs w:val="20"/>
+          <w:vertAlign w:val="superscript"/>
+        </w:rPr>
+        <w:t xml:space="preserve">-93</w:t>
+      </w:r>
+      <w:r>
+        <w:rPr>
+          <w:rFonts w:ascii="MS Mincho" w:cs="MS Mincho" w:eastAsia="MS Mincho" w:hAnsi="MS Mincho"/>
+          <w:sz w:val="20"/>
+          <w:szCs w:val="20"/>
+        </w:rPr>
+        <w:t xml:space="preserve">であり統計的に極めて有意な差が確認された。</w:t>
       </w:r>
     </w:p>
     <w:tbl>
@@ -1833,7 +1124,7 @@
                 <w:sz w:val="17"/>
                 <w:szCs w:val="17"/>
               </w:rPr>
-              <w:t xml:space="preserve">SE条件</w:t>
+              <w:t xml:space="preserve">λ</w:t>
             </w:r>
           </w:p>
         </w:tc>
@@ -1867,7 +1158,7 @@
                 <w:sz w:val="17"/>
                 <w:szCs w:val="17"/>
               </w:rPr>
-              <w:t xml:space="preserve">W-base</w:t>
+              <w:t xml:space="preserve">dev CER</w:t>
             </w:r>
           </w:p>
         </w:tc>
@@ -1901,7 +1192,7 @@
                 <w:sz w:val="17"/>
                 <w:szCs w:val="17"/>
               </w:rPr>
-              <w:t xml:space="preserve">W-small</w:t>
+              <w:t xml:space="preserve">test CER</w:t>
             </w:r>
           </w:p>
         </w:tc>
@@ -1935,7 +1226,7 @@
                 <w:sz w:val="17"/>
                 <w:szCs w:val="17"/>
               </w:rPr>
-              <w:t xml:space="preserve">W-medium</w:t>
+              <w:t xml:space="preserve">Δ vs TAPS</w:t>
             </w:r>
           </w:p>
         </w:tc>
@@ -1968,100 +1259,100 @@
                 <w:sz w:val="17"/>
                 <w:szCs w:val="17"/>
               </w:rPr>
-              <w:t xml:space="preserve">No SE</w:t>
-            </w:r>
-          </w:p>
-        </w:tc>
-        <w:tc>
-          <w:tcPr>
-            <w:tcW w:type="dxa" w:w="1000"/>
-            <w:tcBorders>
-              <w:top w:val="single" w:color="888888" w:sz="1"/>
-              <w:left w:val="single" w:color="888888" w:sz="1"/>
-              <w:bottom w:val="single" w:color="888888" w:sz="1"/>
-              <w:right w:val="single" w:color="888888" w:sz="1"/>
-            </w:tcBorders>
-            <w:tcMar>
-              <w:top w:type="dxa" w:w="20"/>
-              <w:left w:type="dxa" w:w="60"/>
-              <w:bottom w:type="dxa" w:w="20"/>
-              <w:right w:type="dxa" w:w="60"/>
-            </w:tcMar>
-          </w:tcPr>
-          <w:p>
-            <w:pPr>
-              <w:spacing w:after="0" w:line="240"/>
-              <w:jc w:val="center"/>
-            </w:pPr>
-            <w:r>
-              <w:rPr>
-                <w:rFonts w:ascii="MS Mincho" w:cs="MS Mincho" w:eastAsia="MS Mincho" w:hAnsi="MS Mincho"/>
-                <w:sz w:val="17"/>
-                <w:szCs w:val="17"/>
-              </w:rPr>
-              <w:t xml:space="preserve">0.676</w:t>
-            </w:r>
-          </w:p>
-        </w:tc>
-        <w:tc>
-          <w:tcPr>
-            <w:tcW w:type="dxa" w:w="1000"/>
-            <w:tcBorders>
-              <w:top w:val="single" w:color="888888" w:sz="1"/>
-              <w:left w:val="single" w:color="888888" w:sz="1"/>
-              <w:bottom w:val="single" w:color="888888" w:sz="1"/>
-              <w:right w:val="single" w:color="888888" w:sz="1"/>
-            </w:tcBorders>
-            <w:tcMar>
-              <w:top w:type="dxa" w:w="20"/>
-              <w:left w:type="dxa" w:w="60"/>
-              <w:bottom w:type="dxa" w:w="20"/>
-              <w:right w:type="dxa" w:w="60"/>
-            </w:tcMar>
-          </w:tcPr>
-          <w:p>
-            <w:pPr>
-              <w:spacing w:after="0" w:line="240"/>
-              <w:jc w:val="center"/>
-            </w:pPr>
-            <w:r>
-              <w:rPr>
-                <w:rFonts w:ascii="MS Mincho" w:cs="MS Mincho" w:eastAsia="MS Mincho" w:hAnsi="MS Mincho"/>
-                <w:sz w:val="17"/>
-                <w:szCs w:val="17"/>
-              </w:rPr>
-              <w:t xml:space="preserve">0.471</w:t>
-            </w:r>
-          </w:p>
-        </w:tc>
-        <w:tc>
-          <w:tcPr>
-            <w:tcW w:type="dxa" w:w="1000"/>
-            <w:tcBorders>
-              <w:top w:val="single" w:color="888888" w:sz="1"/>
-              <w:left w:val="single" w:color="888888" w:sz="1"/>
-              <w:bottom w:val="single" w:color="888888" w:sz="1"/>
-              <w:right w:val="single" w:color="888888" w:sz="1"/>
-            </w:tcBorders>
-            <w:tcMar>
-              <w:top w:type="dxa" w:w="20"/>
-              <w:left w:type="dxa" w:w="60"/>
-              <w:bottom w:type="dxa" w:w="20"/>
-              <w:right w:type="dxa" w:w="60"/>
-            </w:tcMar>
-          </w:tcPr>
-          <w:p>
-            <w:pPr>
-              <w:spacing w:after="0" w:line="240"/>
-              <w:jc w:val="center"/>
-            </w:pPr>
-            <w:r>
-              <w:rPr>
-                <w:rFonts w:ascii="MS Mincho" w:cs="MS Mincho" w:eastAsia="MS Mincho" w:hAnsi="MS Mincho"/>
-                <w:sz w:val="17"/>
-                <w:szCs w:val="17"/>
-              </w:rPr>
-              <w:t xml:space="preserve">0.360</w:t>
+              <w:t xml:space="preserve">TAPS pretrained</w:t>
+            </w:r>
+          </w:p>
+        </w:tc>
+        <w:tc>
+          <w:tcPr>
+            <w:tcW w:type="dxa" w:w="1000"/>
+            <w:tcBorders>
+              <w:top w:val="single" w:color="888888" w:sz="1"/>
+              <w:left w:val="single" w:color="888888" w:sz="1"/>
+              <w:bottom w:val="single" w:color="888888" w:sz="1"/>
+              <w:right w:val="single" w:color="888888" w:sz="1"/>
+            </w:tcBorders>
+            <w:tcMar>
+              <w:top w:type="dxa" w:w="20"/>
+              <w:left w:type="dxa" w:w="60"/>
+              <w:bottom w:type="dxa" w:w="20"/>
+              <w:right w:type="dxa" w:w="60"/>
+            </w:tcMar>
+          </w:tcPr>
+          <w:p>
+            <w:pPr>
+              <w:spacing w:after="0" w:line="240"/>
+              <w:jc w:val="center"/>
+            </w:pPr>
+            <w:r>
+              <w:rPr>
+                <w:rFonts w:ascii="MS Mincho" w:cs="MS Mincho" w:eastAsia="MS Mincho" w:hAnsi="MS Mincho"/>
+                <w:sz w:val="17"/>
+                <w:szCs w:val="17"/>
+              </w:rPr>
+              <w:t xml:space="preserve">0.285</w:t>
+            </w:r>
+          </w:p>
+        </w:tc>
+        <w:tc>
+          <w:tcPr>
+            <w:tcW w:type="dxa" w:w="1000"/>
+            <w:tcBorders>
+              <w:top w:val="single" w:color="888888" w:sz="1"/>
+              <w:left w:val="single" w:color="888888" w:sz="1"/>
+              <w:bottom w:val="single" w:color="888888" w:sz="1"/>
+              <w:right w:val="single" w:color="888888" w:sz="1"/>
+            </w:tcBorders>
+            <w:tcMar>
+              <w:top w:type="dxa" w:w="20"/>
+              <w:left w:type="dxa" w:w="60"/>
+              <w:bottom w:type="dxa" w:w="20"/>
+              <w:right w:type="dxa" w:w="60"/>
+            </w:tcMar>
+          </w:tcPr>
+          <w:p>
+            <w:pPr>
+              <w:spacing w:after="0" w:line="240"/>
+              <w:jc w:val="center"/>
+            </w:pPr>
+            <w:r>
+              <w:rPr>
+                <w:rFonts w:ascii="MS Mincho" w:cs="MS Mincho" w:eastAsia="MS Mincho" w:hAnsi="MS Mincho"/>
+                <w:sz w:val="17"/>
+                <w:szCs w:val="17"/>
+              </w:rPr>
+              <w:t xml:space="preserve">0.252</w:t>
+            </w:r>
+          </w:p>
+        </w:tc>
+        <w:tc>
+          <w:tcPr>
+            <w:tcW w:type="dxa" w:w="1000"/>
+            <w:tcBorders>
+              <w:top w:val="single" w:color="888888" w:sz="1"/>
+              <w:left w:val="single" w:color="888888" w:sz="1"/>
+              <w:bottom w:val="single" w:color="888888" w:sz="1"/>
+              <w:right w:val="single" w:color="888888" w:sz="1"/>
+            </w:tcBorders>
+            <w:tcMar>
+              <w:top w:type="dxa" w:w="20"/>
+              <w:left w:type="dxa" w:w="60"/>
+              <w:bottom w:type="dxa" w:w="20"/>
+              <w:right w:type="dxa" w:w="60"/>
+            </w:tcMar>
+          </w:tcPr>
+          <w:p>
+            <w:pPr>
+              <w:spacing w:after="0" w:line="240"/>
+              <w:jc w:val="center"/>
+            </w:pPr>
+            <w:r>
+              <w:rPr>
+                <w:rFonts w:ascii="MS Mincho" w:cs="MS Mincho" w:eastAsia="MS Mincho" w:hAnsi="MS Mincho"/>
+                <w:sz w:val="17"/>
+                <w:szCs w:val="17"/>
+              </w:rPr>
+              <w:t xml:space="preserve">—</w:t>
             </w:r>
           </w:p>
         </w:tc>
@@ -2094,100 +1385,100 @@
                 <w:sz w:val="17"/>
                 <w:szCs w:val="17"/>
               </w:rPr>
-              <w:t xml:space="preserve">TAPS pretrained</w:t>
-            </w:r>
-          </w:p>
-        </w:tc>
-        <w:tc>
-          <w:tcPr>
-            <w:tcW w:type="dxa" w:w="1000"/>
-            <w:tcBorders>
-              <w:top w:val="single" w:color="888888" w:sz="1"/>
-              <w:left w:val="single" w:color="888888" w:sz="1"/>
-              <w:bottom w:val="single" w:color="888888" w:sz="1"/>
-              <w:right w:val="single" w:color="888888" w:sz="1"/>
-            </w:tcBorders>
-            <w:tcMar>
-              <w:top w:type="dxa" w:w="20"/>
-              <w:left w:type="dxa" w:w="60"/>
-              <w:bottom w:type="dxa" w:w="20"/>
-              <w:right w:type="dxa" w:w="60"/>
-            </w:tcMar>
-          </w:tcPr>
-          <w:p>
-            <w:pPr>
-              <w:spacing w:after="0" w:line="240"/>
-              <w:jc w:val="center"/>
-            </w:pPr>
-            <w:r>
-              <w:rPr>
-                <w:rFonts w:ascii="MS Mincho" w:cs="MS Mincho" w:eastAsia="MS Mincho" w:hAnsi="MS Mincho"/>
-                <w:sz w:val="17"/>
-                <w:szCs w:val="17"/>
-              </w:rPr>
-              <w:t xml:space="preserve">0.294</w:t>
-            </w:r>
-          </w:p>
-        </w:tc>
-        <w:tc>
-          <w:tcPr>
-            <w:tcW w:type="dxa" w:w="1000"/>
-            <w:tcBorders>
-              <w:top w:val="single" w:color="888888" w:sz="1"/>
-              <w:left w:val="single" w:color="888888" w:sz="1"/>
-              <w:bottom w:val="single" w:color="888888" w:sz="1"/>
-              <w:right w:val="single" w:color="888888" w:sz="1"/>
-            </w:tcBorders>
-            <w:tcMar>
-              <w:top w:type="dxa" w:w="20"/>
-              <w:left w:type="dxa" w:w="60"/>
-              <w:bottom w:type="dxa" w:w="20"/>
-              <w:right w:type="dxa" w:w="60"/>
-            </w:tcMar>
-          </w:tcPr>
-          <w:p>
-            <w:pPr>
-              <w:spacing w:after="0" w:line="240"/>
-              <w:jc w:val="center"/>
-            </w:pPr>
-            <w:r>
-              <w:rPr>
-                <w:rFonts w:ascii="MS Mincho" w:cs="MS Mincho" w:eastAsia="MS Mincho" w:hAnsi="MS Mincho"/>
-                <w:sz w:val="17"/>
-                <w:szCs w:val="17"/>
-              </w:rPr>
-              <w:t xml:space="preserve">0.252</w:t>
-            </w:r>
-          </w:p>
-        </w:tc>
-        <w:tc>
-          <w:tcPr>
-            <w:tcW w:type="dxa" w:w="1000"/>
-            <w:tcBorders>
-              <w:top w:val="single" w:color="888888" w:sz="1"/>
-              <w:left w:val="single" w:color="888888" w:sz="1"/>
-              <w:bottom w:val="single" w:color="888888" w:sz="1"/>
-              <w:right w:val="single" w:color="888888" w:sz="1"/>
-            </w:tcBorders>
-            <w:tcMar>
-              <w:top w:type="dxa" w:w="20"/>
-              <w:left w:type="dxa" w:w="60"/>
-              <w:bottom w:type="dxa" w:w="20"/>
-              <w:right w:type="dxa" w:w="60"/>
-            </w:tcMar>
-          </w:tcPr>
-          <w:p>
-            <w:pPr>
-              <w:spacing w:after="0" w:line="240"/>
-              <w:jc w:val="center"/>
-            </w:pPr>
-            <w:r>
-              <w:rPr>
-                <w:rFonts w:ascii="MS Mincho" w:cs="MS Mincho" w:eastAsia="MS Mincho" w:hAnsi="MS Mincho"/>
-                <w:sz w:val="17"/>
-                <w:szCs w:val="17"/>
-              </w:rPr>
-              <w:t xml:space="preserve">0.219</w:t>
+              <w:t xml:space="preserve">CE λ=1.0</w:t>
+            </w:r>
+          </w:p>
+        </w:tc>
+        <w:tc>
+          <w:tcPr>
+            <w:tcW w:type="dxa" w:w="1000"/>
+            <w:tcBorders>
+              <w:top w:val="single" w:color="888888" w:sz="1"/>
+              <w:left w:val="single" w:color="888888" w:sz="1"/>
+              <w:bottom w:val="single" w:color="888888" w:sz="1"/>
+              <w:right w:val="single" w:color="888888" w:sz="1"/>
+            </w:tcBorders>
+            <w:tcMar>
+              <w:top w:type="dxa" w:w="20"/>
+              <w:left w:type="dxa" w:w="60"/>
+              <w:bottom w:type="dxa" w:w="20"/>
+              <w:right w:type="dxa" w:w="60"/>
+            </w:tcMar>
+          </w:tcPr>
+          <w:p>
+            <w:pPr>
+              <w:spacing w:after="0" w:line="240"/>
+              <w:jc w:val="center"/>
+            </w:pPr>
+            <w:r>
+              <w:rPr>
+                <w:rFonts w:ascii="MS Mincho" w:cs="MS Mincho" w:eastAsia="MS Mincho" w:hAnsi="MS Mincho"/>
+                <w:sz w:val="17"/>
+                <w:szCs w:val="17"/>
+              </w:rPr>
+              <w:t xml:space="preserve">0.262</w:t>
+            </w:r>
+          </w:p>
+        </w:tc>
+        <w:tc>
+          <w:tcPr>
+            <w:tcW w:type="dxa" w:w="1000"/>
+            <w:tcBorders>
+              <w:top w:val="single" w:color="888888" w:sz="1"/>
+              <w:left w:val="single" w:color="888888" w:sz="1"/>
+              <w:bottom w:val="single" w:color="888888" w:sz="1"/>
+              <w:right w:val="single" w:color="888888" w:sz="1"/>
+            </w:tcBorders>
+            <w:tcMar>
+              <w:top w:type="dxa" w:w="20"/>
+              <w:left w:type="dxa" w:w="60"/>
+              <w:bottom w:type="dxa" w:w="20"/>
+              <w:right w:type="dxa" w:w="60"/>
+            </w:tcMar>
+          </w:tcPr>
+          <w:p>
+            <w:pPr>
+              <w:spacing w:after="0" w:line="240"/>
+              <w:jc w:val="center"/>
+            </w:pPr>
+            <w:r>
+              <w:rPr>
+                <w:rFonts w:ascii="MS Mincho" w:cs="MS Mincho" w:eastAsia="MS Mincho" w:hAnsi="MS Mincho"/>
+                <w:sz w:val="17"/>
+                <w:szCs w:val="17"/>
+              </w:rPr>
+              <w:t xml:space="preserve">0.228</w:t>
+            </w:r>
+          </w:p>
+        </w:tc>
+        <w:tc>
+          <w:tcPr>
+            <w:tcW w:type="dxa" w:w="1000"/>
+            <w:tcBorders>
+              <w:top w:val="single" w:color="888888" w:sz="1"/>
+              <w:left w:val="single" w:color="888888" w:sz="1"/>
+              <w:bottom w:val="single" w:color="888888" w:sz="1"/>
+              <w:right w:val="single" w:color="888888" w:sz="1"/>
+            </w:tcBorders>
+            <w:tcMar>
+              <w:top w:type="dxa" w:w="20"/>
+              <w:left w:type="dxa" w:w="60"/>
+              <w:bottom w:type="dxa" w:w="20"/>
+              <w:right w:type="dxa" w:w="60"/>
+            </w:tcMar>
+          </w:tcPr>
+          <w:p>
+            <w:pPr>
+              <w:spacing w:after="0" w:line="240"/>
+              <w:jc w:val="center"/>
+            </w:pPr>
+            <w:r>
+              <w:rPr>
+                <w:rFonts w:ascii="MS Mincho" w:cs="MS Mincho" w:eastAsia="MS Mincho" w:hAnsi="MS Mincho"/>
+                <w:sz w:val="17"/>
+                <w:szCs w:val="17"/>
+              </w:rPr>
+              <w:t xml:space="preserve">-9.4%</w:t>
             </w:r>
           </w:p>
         </w:tc>
@@ -2220,100 +1511,100 @@
                 <w:sz w:val="17"/>
                 <w:szCs w:val="17"/>
               </w:rPr>
-              <w:t xml:space="preserve">Enc L1（λ=5.0）</w:t>
-            </w:r>
-          </w:p>
-        </w:tc>
-        <w:tc>
-          <w:tcPr>
-            <w:tcW w:type="dxa" w:w="1000"/>
-            <w:tcBorders>
-              <w:top w:val="single" w:color="888888" w:sz="1"/>
-              <w:left w:val="single" w:color="888888" w:sz="1"/>
-              <w:bottom w:val="single" w:color="888888" w:sz="1"/>
-              <w:right w:val="single" w:color="888888" w:sz="1"/>
-            </w:tcBorders>
-            <w:tcMar>
-              <w:top w:type="dxa" w:w="20"/>
-              <w:left w:type="dxa" w:w="60"/>
-              <w:bottom w:type="dxa" w:w="20"/>
-              <w:right w:type="dxa" w:w="60"/>
-            </w:tcMar>
-          </w:tcPr>
-          <w:p>
-            <w:pPr>
-              <w:spacing w:after="0" w:line="240"/>
-              <w:jc w:val="center"/>
-            </w:pPr>
-            <w:r>
-              <w:rPr>
-                <w:rFonts w:ascii="MS Mincho" w:cs="MS Mincho" w:eastAsia="MS Mincho" w:hAnsi="MS Mincho"/>
-                <w:sz w:val="17"/>
-                <w:szCs w:val="17"/>
-              </w:rPr>
-              <w:t xml:space="preserve">0.308</w:t>
-            </w:r>
-          </w:p>
-        </w:tc>
-        <w:tc>
-          <w:tcPr>
-            <w:tcW w:type="dxa" w:w="1000"/>
-            <w:tcBorders>
-              <w:top w:val="single" w:color="888888" w:sz="1"/>
-              <w:left w:val="single" w:color="888888" w:sz="1"/>
-              <w:bottom w:val="single" w:color="888888" w:sz="1"/>
-              <w:right w:val="single" w:color="888888" w:sz="1"/>
-            </w:tcBorders>
-            <w:tcMar>
-              <w:top w:type="dxa" w:w="20"/>
-              <w:left w:type="dxa" w:w="60"/>
-              <w:bottom w:type="dxa" w:w="20"/>
-              <w:right w:type="dxa" w:w="60"/>
-            </w:tcMar>
-          </w:tcPr>
-          <w:p>
-            <w:pPr>
-              <w:spacing w:after="0" w:line="240"/>
-              <w:jc w:val="center"/>
-            </w:pPr>
-            <w:r>
-              <w:rPr>
-                <w:rFonts w:ascii="MS Mincho" w:cs="MS Mincho" w:eastAsia="MS Mincho" w:hAnsi="MS Mincho"/>
-                <w:sz w:val="17"/>
-                <w:szCs w:val="17"/>
-              </w:rPr>
-              <w:t xml:space="preserve">0.257</w:t>
-            </w:r>
-          </w:p>
-        </w:tc>
-        <w:tc>
-          <w:tcPr>
-            <w:tcW w:type="dxa" w:w="1000"/>
-            <w:tcBorders>
-              <w:top w:val="single" w:color="888888" w:sz="1"/>
-              <w:left w:val="single" w:color="888888" w:sz="1"/>
-              <w:bottom w:val="single" w:color="888888" w:sz="1"/>
-              <w:right w:val="single" w:color="888888" w:sz="1"/>
-            </w:tcBorders>
-            <w:tcMar>
-              <w:top w:type="dxa" w:w="20"/>
-              <w:left w:type="dxa" w:w="60"/>
-              <w:bottom w:type="dxa" w:w="20"/>
-              <w:right w:type="dxa" w:w="60"/>
-            </w:tcMar>
-          </w:tcPr>
-          <w:p>
-            <w:pPr>
-              <w:spacing w:after="0" w:line="240"/>
-              <w:jc w:val="center"/>
-            </w:pPr>
-            <w:r>
-              <w:rPr>
-                <w:rFonts w:ascii="MS Mincho" w:cs="MS Mincho" w:eastAsia="MS Mincho" w:hAnsi="MS Mincho"/>
-                <w:sz w:val="17"/>
-                <w:szCs w:val="17"/>
-              </w:rPr>
-              <w:t xml:space="preserve">0.225</w:t>
+              <w:t xml:space="preserve">CE λ=2.0</w:t>
+            </w:r>
+          </w:p>
+        </w:tc>
+        <w:tc>
+          <w:tcPr>
+            <w:tcW w:type="dxa" w:w="1000"/>
+            <w:tcBorders>
+              <w:top w:val="single" w:color="888888" w:sz="1"/>
+              <w:left w:val="single" w:color="888888" w:sz="1"/>
+              <w:bottom w:val="single" w:color="888888" w:sz="1"/>
+              <w:right w:val="single" w:color="888888" w:sz="1"/>
+            </w:tcBorders>
+            <w:tcMar>
+              <w:top w:type="dxa" w:w="20"/>
+              <w:left w:type="dxa" w:w="60"/>
+              <w:bottom w:type="dxa" w:w="20"/>
+              <w:right w:type="dxa" w:w="60"/>
+            </w:tcMar>
+          </w:tcPr>
+          <w:p>
+            <w:pPr>
+              <w:spacing w:after="0" w:line="240"/>
+              <w:jc w:val="center"/>
+            </w:pPr>
+            <w:r>
+              <w:rPr>
+                <w:rFonts w:ascii="MS Mincho" w:cs="MS Mincho" w:eastAsia="MS Mincho" w:hAnsi="MS Mincho"/>
+                <w:sz w:val="17"/>
+                <w:szCs w:val="17"/>
+              </w:rPr>
+              <w:t xml:space="preserve">0.246</w:t>
+            </w:r>
+          </w:p>
+        </w:tc>
+        <w:tc>
+          <w:tcPr>
+            <w:tcW w:type="dxa" w:w="1000"/>
+            <w:tcBorders>
+              <w:top w:val="single" w:color="888888" w:sz="1"/>
+              <w:left w:val="single" w:color="888888" w:sz="1"/>
+              <w:bottom w:val="single" w:color="888888" w:sz="1"/>
+              <w:right w:val="single" w:color="888888" w:sz="1"/>
+            </w:tcBorders>
+            <w:tcMar>
+              <w:top w:type="dxa" w:w="20"/>
+              <w:left w:type="dxa" w:w="60"/>
+              <w:bottom w:type="dxa" w:w="20"/>
+              <w:right w:type="dxa" w:w="60"/>
+            </w:tcMar>
+          </w:tcPr>
+          <w:p>
+            <w:pPr>
+              <w:spacing w:after="0" w:line="240"/>
+              <w:jc w:val="center"/>
+            </w:pPr>
+            <w:r>
+              <w:rPr>
+                <w:rFonts w:ascii="MS Mincho" w:cs="MS Mincho" w:eastAsia="MS Mincho" w:hAnsi="MS Mincho"/>
+                <w:sz w:val="17"/>
+                <w:szCs w:val="17"/>
+              </w:rPr>
+              <w:t xml:space="preserve">0.216</w:t>
+            </w:r>
+          </w:p>
+        </w:tc>
+        <w:tc>
+          <w:tcPr>
+            <w:tcW w:type="dxa" w:w="1000"/>
+            <w:tcBorders>
+              <w:top w:val="single" w:color="888888" w:sz="1"/>
+              <w:left w:val="single" w:color="888888" w:sz="1"/>
+              <w:bottom w:val="single" w:color="888888" w:sz="1"/>
+              <w:right w:val="single" w:color="888888" w:sz="1"/>
+            </w:tcBorders>
+            <w:tcMar>
+              <w:top w:type="dxa" w:w="20"/>
+              <w:left w:type="dxa" w:w="60"/>
+              <w:bottom w:type="dxa" w:w="20"/>
+              <w:right w:type="dxa" w:w="60"/>
+            </w:tcMar>
+          </w:tcPr>
+          <w:p>
+            <w:pPr>
+              <w:spacing w:after="0" w:line="240"/>
+              <w:jc w:val="center"/>
+            </w:pPr>
+            <w:r>
+              <w:rPr>
+                <w:rFonts w:ascii="MS Mincho" w:cs="MS Mincho" w:eastAsia="MS Mincho" w:hAnsi="MS Mincho"/>
+                <w:sz w:val="17"/>
+                <w:szCs w:val="17"/>
+              </w:rPr>
+              <w:t xml:space="preserve">-14.3%</w:t>
             </w:r>
           </w:p>
         </w:tc>
@@ -2346,100 +1637,226 @@
                 <w:sz w:val="17"/>
                 <w:szCs w:val="17"/>
               </w:rPr>
-              <w:t xml:space="preserve">CE（λ=2.0）</w:t>
-            </w:r>
-          </w:p>
-        </w:tc>
-        <w:tc>
-          <w:tcPr>
-            <w:tcW w:type="dxa" w:w="1000"/>
-            <w:tcBorders>
-              <w:top w:val="single" w:color="888888" w:sz="1"/>
-              <w:left w:val="single" w:color="888888" w:sz="1"/>
-              <w:bottom w:val="single" w:color="888888" w:sz="1"/>
-              <w:right w:val="single" w:color="888888" w:sz="1"/>
-            </w:tcBorders>
-            <w:tcMar>
-              <w:top w:type="dxa" w:w="20"/>
-              <w:left w:type="dxa" w:w="60"/>
-              <w:bottom w:type="dxa" w:w="20"/>
-              <w:right w:type="dxa" w:w="60"/>
-            </w:tcMar>
-          </w:tcPr>
-          <w:p>
-            <w:pPr>
-              <w:spacing w:after="0" w:line="240"/>
-              <w:jc w:val="center"/>
-            </w:pPr>
-            <w:r>
-              <w:rPr>
-                <w:rFonts w:ascii="MS Mincho" w:cs="MS Mincho" w:eastAsia="MS Mincho" w:hAnsi="MS Mincho"/>
-                <w:sz w:val="17"/>
-                <w:szCs w:val="17"/>
-              </w:rPr>
-              <w:t xml:space="preserve">0.284</w:t>
-            </w:r>
-          </w:p>
-        </w:tc>
-        <w:tc>
-          <w:tcPr>
-            <w:tcW w:type="dxa" w:w="1000"/>
-            <w:tcBorders>
-              <w:top w:val="single" w:color="888888" w:sz="1"/>
-              <w:left w:val="single" w:color="888888" w:sz="1"/>
-              <w:bottom w:val="single" w:color="888888" w:sz="1"/>
-              <w:right w:val="single" w:color="888888" w:sz="1"/>
-            </w:tcBorders>
-            <w:tcMar>
-              <w:top w:type="dxa" w:w="20"/>
-              <w:left w:type="dxa" w:w="60"/>
-              <w:bottom w:type="dxa" w:w="20"/>
-              <w:right w:type="dxa" w:w="60"/>
-            </w:tcMar>
-          </w:tcPr>
-          <w:p>
-            <w:pPr>
-              <w:spacing w:after="0" w:line="240"/>
-              <w:jc w:val="center"/>
-            </w:pPr>
-            <w:r>
-              <w:rPr>
-                <w:rFonts w:ascii="MS Mincho" w:cs="MS Mincho" w:eastAsia="MS Mincho" w:hAnsi="MS Mincho"/>
-                <w:sz w:val="17"/>
-                <w:szCs w:val="17"/>
-              </w:rPr>
-              <w:t xml:space="preserve">0.229</w:t>
-            </w:r>
-          </w:p>
-        </w:tc>
-        <w:tc>
-          <w:tcPr>
-            <w:tcW w:type="dxa" w:w="1000"/>
-            <w:tcBorders>
-              <w:top w:val="single" w:color="888888" w:sz="1"/>
-              <w:left w:val="single" w:color="888888" w:sz="1"/>
-              <w:bottom w:val="single" w:color="888888" w:sz="1"/>
-              <w:right w:val="single" w:color="888888" w:sz="1"/>
-            </w:tcBorders>
-            <w:tcMar>
-              <w:top w:type="dxa" w:w="20"/>
-              <w:left w:type="dxa" w:w="60"/>
-              <w:bottom w:type="dxa" w:w="20"/>
-              <w:right w:type="dxa" w:w="60"/>
-            </w:tcMar>
-          </w:tcPr>
-          <w:p>
-            <w:pPr>
-              <w:spacing w:after="0" w:line="240"/>
-              <w:jc w:val="center"/>
-            </w:pPr>
-            <w:r>
-              <w:rPr>
-                <w:rFonts w:ascii="MS Mincho" w:cs="MS Mincho" w:eastAsia="MS Mincho" w:hAnsi="MS Mincho"/>
-                <w:sz w:val="17"/>
-                <w:szCs w:val="17"/>
-              </w:rPr>
-              <w:t xml:space="preserve">0.206</w:t>
+              <w:t xml:space="preserve">CE λ=5.0</w:t>
+            </w:r>
+          </w:p>
+        </w:tc>
+        <w:tc>
+          <w:tcPr>
+            <w:tcW w:type="dxa" w:w="1000"/>
+            <w:tcBorders>
+              <w:top w:val="single" w:color="888888" w:sz="1"/>
+              <w:left w:val="single" w:color="888888" w:sz="1"/>
+              <w:bottom w:val="single" w:color="888888" w:sz="1"/>
+              <w:right w:val="single" w:color="888888" w:sz="1"/>
+            </w:tcBorders>
+            <w:tcMar>
+              <w:top w:type="dxa" w:w="20"/>
+              <w:left w:type="dxa" w:w="60"/>
+              <w:bottom w:type="dxa" w:w="20"/>
+              <w:right w:type="dxa" w:w="60"/>
+            </w:tcMar>
+          </w:tcPr>
+          <w:p>
+            <w:pPr>
+              <w:spacing w:after="0" w:line="240"/>
+              <w:jc w:val="center"/>
+            </w:pPr>
+            <w:r>
+              <w:rPr>
+                <w:rFonts w:ascii="MS Mincho" w:cs="MS Mincho" w:eastAsia="MS Mincho" w:hAnsi="MS Mincho"/>
+                <w:sz w:val="17"/>
+                <w:szCs w:val="17"/>
+              </w:rPr>
+              <w:t xml:space="preserve">0.235</w:t>
+            </w:r>
+          </w:p>
+        </w:tc>
+        <w:tc>
+          <w:tcPr>
+            <w:tcW w:type="dxa" w:w="1000"/>
+            <w:tcBorders>
+              <w:top w:val="single" w:color="888888" w:sz="1"/>
+              <w:left w:val="single" w:color="888888" w:sz="1"/>
+              <w:bottom w:val="single" w:color="888888" w:sz="1"/>
+              <w:right w:val="single" w:color="888888" w:sz="1"/>
+            </w:tcBorders>
+            <w:tcMar>
+              <w:top w:type="dxa" w:w="20"/>
+              <w:left w:type="dxa" w:w="60"/>
+              <w:bottom w:type="dxa" w:w="20"/>
+              <w:right w:type="dxa" w:w="60"/>
+            </w:tcMar>
+          </w:tcPr>
+          <w:p>
+            <w:pPr>
+              <w:spacing w:after="0" w:line="240"/>
+              <w:jc w:val="center"/>
+            </w:pPr>
+            <w:r>
+              <w:rPr>
+                <w:rFonts w:ascii="MS Mincho" w:cs="MS Mincho" w:eastAsia="MS Mincho" w:hAnsi="MS Mincho"/>
+                <w:sz w:val="17"/>
+                <w:szCs w:val="17"/>
+              </w:rPr>
+              <w:t xml:space="preserve">0.202</w:t>
+            </w:r>
+          </w:p>
+        </w:tc>
+        <w:tc>
+          <w:tcPr>
+            <w:tcW w:type="dxa" w:w="1000"/>
+            <w:tcBorders>
+              <w:top w:val="single" w:color="888888" w:sz="1"/>
+              <w:left w:val="single" w:color="888888" w:sz="1"/>
+              <w:bottom w:val="single" w:color="888888" w:sz="1"/>
+              <w:right w:val="single" w:color="888888" w:sz="1"/>
+            </w:tcBorders>
+            <w:tcMar>
+              <w:top w:type="dxa" w:w="20"/>
+              <w:left w:type="dxa" w:w="60"/>
+              <w:bottom w:type="dxa" w:w="20"/>
+              <w:right w:type="dxa" w:w="60"/>
+            </w:tcMar>
+          </w:tcPr>
+          <w:p>
+            <w:pPr>
+              <w:spacing w:after="0" w:line="240"/>
+              <w:jc w:val="center"/>
+            </w:pPr>
+            <w:r>
+              <w:rPr>
+                <w:rFonts w:ascii="MS Mincho" w:cs="MS Mincho" w:eastAsia="MS Mincho" w:hAnsi="MS Mincho"/>
+                <w:sz w:val="17"/>
+                <w:szCs w:val="17"/>
+              </w:rPr>
+              <w:t xml:space="preserve">-19.7%</w:t>
+            </w:r>
+          </w:p>
+        </w:tc>
+      </w:tr>
+      <w:tr>
+        <w:tc>
+          <w:tcPr>
+            <w:tcW w:type="dxa" w:w="1200"/>
+            <w:tcBorders>
+              <w:top w:val="single" w:color="888888" w:sz="1"/>
+              <w:left w:val="single" w:color="888888" w:sz="1"/>
+              <w:bottom w:val="single" w:color="888888" w:sz="1"/>
+              <w:right w:val="single" w:color="888888" w:sz="1"/>
+            </w:tcBorders>
+            <w:tcMar>
+              <w:top w:type="dxa" w:w="20"/>
+              <w:left w:type="dxa" w:w="60"/>
+              <w:bottom w:type="dxa" w:w="20"/>
+              <w:right w:type="dxa" w:w="60"/>
+            </w:tcMar>
+          </w:tcPr>
+          <w:p>
+            <w:pPr>
+              <w:spacing w:after="0" w:line="240"/>
+              <w:jc w:val="left"/>
+            </w:pPr>
+            <w:r>
+              <w:rPr>
+                <w:rFonts w:ascii="MS Mincho" w:cs="MS Mincho" w:eastAsia="MS Mincho" w:hAnsi="MS Mincho"/>
+                <w:sz w:val="17"/>
+                <w:szCs w:val="17"/>
+              </w:rPr>
+              <w:t xml:space="preserve">CE λ=10.0（best）</w:t>
+            </w:r>
+          </w:p>
+        </w:tc>
+        <w:tc>
+          <w:tcPr>
+            <w:tcW w:type="dxa" w:w="1000"/>
+            <w:tcBorders>
+              <w:top w:val="single" w:color="888888" w:sz="1"/>
+              <w:left w:val="single" w:color="888888" w:sz="1"/>
+              <w:bottom w:val="single" w:color="888888" w:sz="1"/>
+              <w:right w:val="single" w:color="888888" w:sz="1"/>
+            </w:tcBorders>
+            <w:tcMar>
+              <w:top w:type="dxa" w:w="20"/>
+              <w:left w:type="dxa" w:w="60"/>
+              <w:bottom w:type="dxa" w:w="20"/>
+              <w:right w:type="dxa" w:w="60"/>
+            </w:tcMar>
+          </w:tcPr>
+          <w:p>
+            <w:pPr>
+              <w:spacing w:after="0" w:line="240"/>
+              <w:jc w:val="center"/>
+            </w:pPr>
+            <w:r>
+              <w:rPr>
+                <w:rFonts w:ascii="MS Mincho" w:cs="MS Mincho" w:eastAsia="MS Mincho" w:hAnsi="MS Mincho"/>
+                <w:sz w:val="17"/>
+                <w:szCs w:val="17"/>
+              </w:rPr>
+              <w:t xml:space="preserve">0.232</w:t>
+            </w:r>
+          </w:p>
+        </w:tc>
+        <w:tc>
+          <w:tcPr>
+            <w:tcW w:type="dxa" w:w="1000"/>
+            <w:tcBorders>
+              <w:top w:val="single" w:color="888888" w:sz="1"/>
+              <w:left w:val="single" w:color="888888" w:sz="1"/>
+              <w:bottom w:val="single" w:color="888888" w:sz="1"/>
+              <w:right w:val="single" w:color="888888" w:sz="1"/>
+            </w:tcBorders>
+            <w:tcMar>
+              <w:top w:type="dxa" w:w="20"/>
+              <w:left w:type="dxa" w:w="60"/>
+              <w:bottom w:type="dxa" w:w="20"/>
+              <w:right w:type="dxa" w:w="60"/>
+            </w:tcMar>
+          </w:tcPr>
+          <w:p>
+            <w:pPr>
+              <w:spacing w:after="0" w:line="240"/>
+              <w:jc w:val="center"/>
+            </w:pPr>
+            <w:r>
+              <w:rPr>
+                <w:rFonts w:ascii="MS Mincho" w:cs="MS Mincho" w:eastAsia="MS Mincho" w:hAnsi="MS Mincho"/>
+                <w:sz w:val="17"/>
+                <w:szCs w:val="17"/>
+              </w:rPr>
+              <w:t xml:space="preserve">0.200</w:t>
+            </w:r>
+          </w:p>
+        </w:tc>
+        <w:tc>
+          <w:tcPr>
+            <w:tcW w:type="dxa" w:w="1000"/>
+            <w:tcBorders>
+              <w:top w:val="single" w:color="888888" w:sz="1"/>
+              <w:left w:val="single" w:color="888888" w:sz="1"/>
+              <w:bottom w:val="single" w:color="888888" w:sz="1"/>
+              <w:right w:val="single" w:color="888888" w:sz="1"/>
+            </w:tcBorders>
+            <w:tcMar>
+              <w:top w:type="dxa" w:w="20"/>
+              <w:left w:type="dxa" w:w="60"/>
+              <w:bottom w:type="dxa" w:w="20"/>
+              <w:right w:type="dxa" w:w="60"/>
+            </w:tcMar>
+          </w:tcPr>
+          <w:p>
+            <w:pPr>
+              <w:spacing w:after="0" w:line="240"/>
+              <w:jc w:val="center"/>
+            </w:pPr>
+            <w:r>
+              <w:rPr>
+                <w:rFonts w:ascii="MS Mincho" w:cs="MS Mincho" w:eastAsia="MS Mincho" w:hAnsi="MS Mincho"/>
+                <w:sz w:val="17"/>
+                <w:szCs w:val="17"/>
+              </w:rPr>
+              <w:t xml:space="preserve">-20.7%</w:t>
             </w:r>
           </w:p>
         </w:tc>
@@ -2458,7 +1875,38 @@
           <w:sz w:val="17"/>
           <w:szCs w:val="17"/>
         </w:rPr>
-        <w:t xml:space="preserve">表2: 異なるASRモデルでのCER比較</w:t>
+        <w:t xml:space="preserve">表1: CE損失のλ値とCER（λはdev CERで選択）</w:t>
+      </w:r>
+    </w:p>
+    <w:p>
+      <w:pPr>
+        <w:spacing w:after="60" w:line="300"/>
+      </w:pPr>
+      <w:r>
+        <w:rPr>
+          <w:rFonts w:ascii="MS Mincho" w:cs="MS Mincho" w:eastAsia="MS Mincho" w:hAnsi="MS Mincho"/>
+          <w:sz w:val="20"/>
+          <w:szCs w:val="20"/>
+        </w:rPr>
+        <w:t xml:space="preserve">また、再構成損失（L1+STFT）の必要性を検証するablation実験を行った。CE損失のみ（再構成損失なし、</w:t>
+      </w:r>
+      <w:r>
+        <w:rPr>
+          <w:rFonts w:ascii="Cambria Math" w:cs="Cambria Math" w:eastAsia="Cambria Math" w:hAnsi="Cambria Math"/>
+          <w:i/>
+          <w:iCs/>
+          <w:sz w:val="20"/>
+          <w:szCs w:val="20"/>
+        </w:rPr>
+        <w:t xml:space="preserve">λ</w:t>
+      </w:r>
+      <w:r>
+        <w:rPr>
+          <w:rFonts w:ascii="MS Mincho" w:cs="MS Mincho" w:eastAsia="MS Mincho" w:hAnsi="MS Mincho"/>
+          <w:sz w:val="20"/>
+          <w:szCs w:val="20"/>
+        </w:rPr>
+        <w:t xml:space="preserve"> = 10.0）で学習した場合のtest CERは0.205であり、TAPS pretrained（0.252）を上回るものの、再構成損失を加えた場合（0.200）と比較すると劣る。両損失は相補的に機能している。</w:t>
       </w:r>
     </w:p>
     <w:p>
@@ -2474,7 +1922,7 @@
           <w:sz w:val="22"/>
           <w:szCs w:val="22"/>
         </w:rPr>
-        <w:t xml:space="preserve">4.3 Encoder距離分析</w:t>
+        <w:t xml:space="preserve">4.2 別ASRモデルでの評価</w:t>
       </w:r>
     </w:p>
     <w:p>
@@ -2487,7 +1935,25 @@
           <w:sz w:val="20"/>
           <w:szCs w:val="20"/>
         </w:rPr>
-        <w:t xml:space="preserve">CE損失がなぜ汎用的に有効かを分析するため、各SE条件について3つのASRモデルのencoder表現間のL1距離を計測した（表3）。encoder距離は、SE出力と気導音声を各Whisperのencoderに入力し、出力表現のL1距離を計算したものである。</w:t>
+        <w:t xml:space="preserve">表2に、Whisper-smallで学習したCE-aware SEを異なるサイズのWhisperモデルで評価した結果を示す。提案手法（CE </w:t>
+      </w:r>
+      <w:r>
+        <w:rPr>
+          <w:rFonts w:ascii="Cambria Math" w:cs="Cambria Math" w:eastAsia="Cambria Math" w:hAnsi="Cambria Math"/>
+          <w:i/>
+          <w:iCs/>
+          <w:sz w:val="20"/>
+          <w:szCs w:val="20"/>
+        </w:rPr>
+        <w:t xml:space="preserve">λ</w:t>
+      </w:r>
+      <w:r>
+        <w:rPr>
+          <w:rFonts w:ascii="MS Mincho" w:cs="MS Mincho" w:eastAsia="MS Mincho" w:hAnsi="MS Mincho"/>
+          <w:sz w:val="20"/>
+          <w:szCs w:val="20"/>
+        </w:rPr>
+        <w:t xml:space="preserve"> = 10.0）は全3モデルでTAPS pretrainedを上回っており、学習に使用したWhisper-small以外のサイズにも改善が転移した。一方、encoder距離損失（Enc L1）はTAPS pretrainedとほぼ同等のCERにとどまり、明確な改善は得られなかった。</w:t>
       </w:r>
     </w:p>
     <w:tbl>
@@ -2573,7 +2039,7 @@
                 <w:sz w:val="17"/>
                 <w:szCs w:val="17"/>
               </w:rPr>
-              <w:t xml:space="preserve">base L1</w:t>
+              <w:t xml:space="preserve">W-base</w:t>
             </w:r>
           </w:p>
         </w:tc>
@@ -2607,7 +2073,7 @@
                 <w:sz w:val="17"/>
                 <w:szCs w:val="17"/>
               </w:rPr>
-              <w:t xml:space="preserve">small L1</w:t>
+              <w:t xml:space="preserve">W-small</w:t>
             </w:r>
           </w:p>
         </w:tc>
@@ -2641,7 +2107,7 @@
                 <w:sz w:val="17"/>
                 <w:szCs w:val="17"/>
               </w:rPr>
-              <w:t xml:space="preserve">medium L1</w:t>
+              <w:t xml:space="preserve">W-medium</w:t>
             </w:r>
           </w:p>
         </w:tc>
@@ -2705,69 +2171,69 @@
                 <w:sz w:val="17"/>
                 <w:szCs w:val="17"/>
               </w:rPr>
-              <w:t xml:space="preserve">0.367</w:t>
-            </w:r>
-          </w:p>
-        </w:tc>
-        <w:tc>
-          <w:tcPr>
-            <w:tcW w:type="dxa" w:w="1000"/>
-            <w:tcBorders>
-              <w:top w:val="single" w:color="888888" w:sz="1"/>
-              <w:left w:val="single" w:color="888888" w:sz="1"/>
-              <w:bottom w:val="single" w:color="888888" w:sz="1"/>
-              <w:right w:val="single" w:color="888888" w:sz="1"/>
-            </w:tcBorders>
-            <w:tcMar>
-              <w:top w:type="dxa" w:w="20"/>
-              <w:left w:type="dxa" w:w="60"/>
-              <w:bottom w:type="dxa" w:w="20"/>
-              <w:right w:type="dxa" w:w="60"/>
-            </w:tcMar>
-          </w:tcPr>
-          <w:p>
-            <w:pPr>
-              <w:spacing w:after="0" w:line="240"/>
-              <w:jc w:val="center"/>
-            </w:pPr>
-            <w:r>
-              <w:rPr>
-                <w:rFonts w:ascii="MS Mincho" w:cs="MS Mincho" w:eastAsia="MS Mincho" w:hAnsi="MS Mincho"/>
-                <w:sz w:val="17"/>
-                <w:szCs w:val="17"/>
-              </w:rPr>
-              <w:t xml:space="preserve">0.386</w:t>
-            </w:r>
-          </w:p>
-        </w:tc>
-        <w:tc>
-          <w:tcPr>
-            <w:tcW w:type="dxa" w:w="1000"/>
-            <w:tcBorders>
-              <w:top w:val="single" w:color="888888" w:sz="1"/>
-              <w:left w:val="single" w:color="888888" w:sz="1"/>
-              <w:bottom w:val="single" w:color="888888" w:sz="1"/>
-              <w:right w:val="single" w:color="888888" w:sz="1"/>
-            </w:tcBorders>
-            <w:tcMar>
-              <w:top w:type="dxa" w:w="20"/>
-              <w:left w:type="dxa" w:w="60"/>
-              <w:bottom w:type="dxa" w:w="20"/>
-              <w:right w:type="dxa" w:w="60"/>
-            </w:tcMar>
-          </w:tcPr>
-          <w:p>
-            <w:pPr>
-              <w:spacing w:after="0" w:line="240"/>
-              <w:jc w:val="center"/>
-            </w:pPr>
-            <w:r>
-              <w:rPr>
-                <w:rFonts w:ascii="MS Mincho" w:cs="MS Mincho" w:eastAsia="MS Mincho" w:hAnsi="MS Mincho"/>
-                <w:sz w:val="17"/>
-                <w:szCs w:val="17"/>
-              </w:rPr>
-              <w:t xml:space="preserve">0.408</w:t>
+              <w:t xml:space="preserve">0.671</w:t>
+            </w:r>
+          </w:p>
+        </w:tc>
+        <w:tc>
+          <w:tcPr>
+            <w:tcW w:type="dxa" w:w="1000"/>
+            <w:tcBorders>
+              <w:top w:val="single" w:color="888888" w:sz="1"/>
+              <w:left w:val="single" w:color="888888" w:sz="1"/>
+              <w:bottom w:val="single" w:color="888888" w:sz="1"/>
+              <w:right w:val="single" w:color="888888" w:sz="1"/>
+            </w:tcBorders>
+            <w:tcMar>
+              <w:top w:type="dxa" w:w="20"/>
+              <w:left w:type="dxa" w:w="60"/>
+              <w:bottom w:type="dxa" w:w="20"/>
+              <w:right w:type="dxa" w:w="60"/>
+            </w:tcMar>
+          </w:tcPr>
+          <w:p>
+            <w:pPr>
+              <w:spacing w:after="0" w:line="240"/>
+              <w:jc w:val="center"/>
+            </w:pPr>
+            <w:r>
+              <w:rPr>
+                <w:rFonts w:ascii="MS Mincho" w:cs="MS Mincho" w:eastAsia="MS Mincho" w:hAnsi="MS Mincho"/>
+                <w:sz w:val="17"/>
+                <w:szCs w:val="17"/>
+              </w:rPr>
+              <w:t xml:space="preserve">0.470</w:t>
+            </w:r>
+          </w:p>
+        </w:tc>
+        <w:tc>
+          <w:tcPr>
+            <w:tcW w:type="dxa" w:w="1000"/>
+            <w:tcBorders>
+              <w:top w:val="single" w:color="888888" w:sz="1"/>
+              <w:left w:val="single" w:color="888888" w:sz="1"/>
+              <w:bottom w:val="single" w:color="888888" w:sz="1"/>
+              <w:right w:val="single" w:color="888888" w:sz="1"/>
+            </w:tcBorders>
+            <w:tcMar>
+              <w:top w:type="dxa" w:w="20"/>
+              <w:left w:type="dxa" w:w="60"/>
+              <w:bottom w:type="dxa" w:w="20"/>
+              <w:right w:type="dxa" w:w="60"/>
+            </w:tcMar>
+          </w:tcPr>
+          <w:p>
+            <w:pPr>
+              <w:spacing w:after="0" w:line="240"/>
+              <w:jc w:val="center"/>
+            </w:pPr>
+            <w:r>
+              <w:rPr>
+                <w:rFonts w:ascii="MS Mincho" w:cs="MS Mincho" w:eastAsia="MS Mincho" w:hAnsi="MS Mincho"/>
+                <w:sz w:val="17"/>
+                <w:szCs w:val="17"/>
+              </w:rPr>
+              <w:t xml:space="preserve">0.360</w:t>
             </w:r>
           </w:p>
         </w:tc>
@@ -2831,69 +2297,69 @@
                 <w:sz w:val="17"/>
                 <w:szCs w:val="17"/>
               </w:rPr>
-              <w:t xml:space="preserve">0.157</w:t>
-            </w:r>
-          </w:p>
-        </w:tc>
-        <w:tc>
-          <w:tcPr>
-            <w:tcW w:type="dxa" w:w="1000"/>
-            <w:tcBorders>
-              <w:top w:val="single" w:color="888888" w:sz="1"/>
-              <w:left w:val="single" w:color="888888" w:sz="1"/>
-              <w:bottom w:val="single" w:color="888888" w:sz="1"/>
-              <w:right w:val="single" w:color="888888" w:sz="1"/>
-            </w:tcBorders>
-            <w:tcMar>
-              <w:top w:type="dxa" w:w="20"/>
-              <w:left w:type="dxa" w:w="60"/>
-              <w:bottom w:type="dxa" w:w="20"/>
-              <w:right w:type="dxa" w:w="60"/>
-            </w:tcMar>
-          </w:tcPr>
-          <w:p>
-            <w:pPr>
-              <w:spacing w:after="0" w:line="240"/>
-              <w:jc w:val="center"/>
-            </w:pPr>
-            <w:r>
-              <w:rPr>
-                <w:rFonts w:ascii="MS Mincho" w:cs="MS Mincho" w:eastAsia="MS Mincho" w:hAnsi="MS Mincho"/>
-                <w:sz w:val="17"/>
-                <w:szCs w:val="17"/>
-              </w:rPr>
-              <w:t xml:space="preserve">0.201</w:t>
-            </w:r>
-          </w:p>
-        </w:tc>
-        <w:tc>
-          <w:tcPr>
-            <w:tcW w:type="dxa" w:w="1000"/>
-            <w:tcBorders>
-              <w:top w:val="single" w:color="888888" w:sz="1"/>
-              <w:left w:val="single" w:color="888888" w:sz="1"/>
-              <w:bottom w:val="single" w:color="888888" w:sz="1"/>
-              <w:right w:val="single" w:color="888888" w:sz="1"/>
-            </w:tcBorders>
-            <w:tcMar>
-              <w:top w:type="dxa" w:w="20"/>
-              <w:left w:type="dxa" w:w="60"/>
-              <w:bottom w:type="dxa" w:w="20"/>
-              <w:right w:type="dxa" w:w="60"/>
-            </w:tcMar>
-          </w:tcPr>
-          <w:p>
-            <w:pPr>
-              <w:spacing w:after="0" w:line="240"/>
-              <w:jc w:val="center"/>
-            </w:pPr>
-            <w:r>
-              <w:rPr>
-                <w:rFonts w:ascii="MS Mincho" w:cs="MS Mincho" w:eastAsia="MS Mincho" w:hAnsi="MS Mincho"/>
-                <w:sz w:val="17"/>
-                <w:szCs w:val="17"/>
-              </w:rPr>
-              <w:t xml:space="preserve">0.226</w:t>
+              <w:t xml:space="preserve">0.294</w:t>
+            </w:r>
+          </w:p>
+        </w:tc>
+        <w:tc>
+          <w:tcPr>
+            <w:tcW w:type="dxa" w:w="1000"/>
+            <w:tcBorders>
+              <w:top w:val="single" w:color="888888" w:sz="1"/>
+              <w:left w:val="single" w:color="888888" w:sz="1"/>
+              <w:bottom w:val="single" w:color="888888" w:sz="1"/>
+              <w:right w:val="single" w:color="888888" w:sz="1"/>
+            </w:tcBorders>
+            <w:tcMar>
+              <w:top w:type="dxa" w:w="20"/>
+              <w:left w:type="dxa" w:w="60"/>
+              <w:bottom w:type="dxa" w:w="20"/>
+              <w:right w:type="dxa" w:w="60"/>
+            </w:tcMar>
+          </w:tcPr>
+          <w:p>
+            <w:pPr>
+              <w:spacing w:after="0" w:line="240"/>
+              <w:jc w:val="center"/>
+            </w:pPr>
+            <w:r>
+              <w:rPr>
+                <w:rFonts w:ascii="MS Mincho" w:cs="MS Mincho" w:eastAsia="MS Mincho" w:hAnsi="MS Mincho"/>
+                <w:sz w:val="17"/>
+                <w:szCs w:val="17"/>
+              </w:rPr>
+              <w:t xml:space="preserve">0.252</w:t>
+            </w:r>
+          </w:p>
+        </w:tc>
+        <w:tc>
+          <w:tcPr>
+            <w:tcW w:type="dxa" w:w="1000"/>
+            <w:tcBorders>
+              <w:top w:val="single" w:color="888888" w:sz="1"/>
+              <w:left w:val="single" w:color="888888" w:sz="1"/>
+              <w:bottom w:val="single" w:color="888888" w:sz="1"/>
+              <w:right w:val="single" w:color="888888" w:sz="1"/>
+            </w:tcBorders>
+            <w:tcMar>
+              <w:top w:type="dxa" w:w="20"/>
+              <w:left w:type="dxa" w:w="60"/>
+              <w:bottom w:type="dxa" w:w="20"/>
+              <w:right w:type="dxa" w:w="60"/>
+            </w:tcMar>
+          </w:tcPr>
+          <w:p>
+            <w:pPr>
+              <w:spacing w:after="0" w:line="240"/>
+              <w:jc w:val="center"/>
+            </w:pPr>
+            <w:r>
+              <w:rPr>
+                <w:rFonts w:ascii="MS Mincho" w:cs="MS Mincho" w:eastAsia="MS Mincho" w:hAnsi="MS Mincho"/>
+                <w:sz w:val="17"/>
+                <w:szCs w:val="17"/>
+              </w:rPr>
+              <w:t xml:space="preserve">0.219</w:t>
             </w:r>
           </w:p>
         </w:tc>
@@ -2957,69 +2423,69 @@
                 <w:sz w:val="17"/>
                 <w:szCs w:val="17"/>
               </w:rPr>
-              <w:t xml:space="preserve">0.163</w:t>
-            </w:r>
-          </w:p>
-        </w:tc>
-        <w:tc>
-          <w:tcPr>
-            <w:tcW w:type="dxa" w:w="1000"/>
-            <w:tcBorders>
-              <w:top w:val="single" w:color="888888" w:sz="1"/>
-              <w:left w:val="single" w:color="888888" w:sz="1"/>
-              <w:bottom w:val="single" w:color="888888" w:sz="1"/>
-              <w:right w:val="single" w:color="888888" w:sz="1"/>
-            </w:tcBorders>
-            <w:tcMar>
-              <w:top w:type="dxa" w:w="20"/>
-              <w:left w:type="dxa" w:w="60"/>
-              <w:bottom w:type="dxa" w:w="20"/>
-              <w:right w:type="dxa" w:w="60"/>
-            </w:tcMar>
-          </w:tcPr>
-          <w:p>
-            <w:pPr>
-              <w:spacing w:after="0" w:line="240"/>
-              <w:jc w:val="center"/>
-            </w:pPr>
-            <w:r>
-              <w:rPr>
-                <w:rFonts w:ascii="MS Mincho" w:cs="MS Mincho" w:eastAsia="MS Mincho" w:hAnsi="MS Mincho"/>
-                <w:sz w:val="17"/>
-                <w:szCs w:val="17"/>
-              </w:rPr>
-              <w:t xml:space="preserve">0.199</w:t>
-            </w:r>
-          </w:p>
-        </w:tc>
-        <w:tc>
-          <w:tcPr>
-            <w:tcW w:type="dxa" w:w="1000"/>
-            <w:tcBorders>
-              <w:top w:val="single" w:color="888888" w:sz="1"/>
-              <w:left w:val="single" w:color="888888" w:sz="1"/>
-              <w:bottom w:val="single" w:color="888888" w:sz="1"/>
-              <w:right w:val="single" w:color="888888" w:sz="1"/>
-            </w:tcBorders>
-            <w:tcMar>
-              <w:top w:type="dxa" w:w="20"/>
-              <w:left w:type="dxa" w:w="60"/>
-              <w:bottom w:type="dxa" w:w="20"/>
-              <w:right w:type="dxa" w:w="60"/>
-            </w:tcMar>
-          </w:tcPr>
-          <w:p>
-            <w:pPr>
-              <w:spacing w:after="0" w:line="240"/>
-              <w:jc w:val="center"/>
-            </w:pPr>
-            <w:r>
-              <w:rPr>
-                <w:rFonts w:ascii="MS Mincho" w:cs="MS Mincho" w:eastAsia="MS Mincho" w:hAnsi="MS Mincho"/>
-                <w:sz w:val="17"/>
-                <w:szCs w:val="17"/>
-              </w:rPr>
-              <w:t xml:space="preserve">0.230</w:t>
+              <w:t xml:space="preserve">0.298</w:t>
+            </w:r>
+          </w:p>
+        </w:tc>
+        <w:tc>
+          <w:tcPr>
+            <w:tcW w:type="dxa" w:w="1000"/>
+            <w:tcBorders>
+              <w:top w:val="single" w:color="888888" w:sz="1"/>
+              <w:left w:val="single" w:color="888888" w:sz="1"/>
+              <w:bottom w:val="single" w:color="888888" w:sz="1"/>
+              <w:right w:val="single" w:color="888888" w:sz="1"/>
+            </w:tcBorders>
+            <w:tcMar>
+              <w:top w:type="dxa" w:w="20"/>
+              <w:left w:type="dxa" w:w="60"/>
+              <w:bottom w:type="dxa" w:w="20"/>
+              <w:right w:type="dxa" w:w="60"/>
+            </w:tcMar>
+          </w:tcPr>
+          <w:p>
+            <w:pPr>
+              <w:spacing w:after="0" w:line="240"/>
+              <w:jc w:val="center"/>
+            </w:pPr>
+            <w:r>
+              <w:rPr>
+                <w:rFonts w:ascii="MS Mincho" w:cs="MS Mincho" w:eastAsia="MS Mincho" w:hAnsi="MS Mincho"/>
+                <w:sz w:val="17"/>
+                <w:szCs w:val="17"/>
+              </w:rPr>
+              <w:t xml:space="preserve">0.251</w:t>
+            </w:r>
+          </w:p>
+        </w:tc>
+        <w:tc>
+          <w:tcPr>
+            <w:tcW w:type="dxa" w:w="1000"/>
+            <w:tcBorders>
+              <w:top w:val="single" w:color="888888" w:sz="1"/>
+              <w:left w:val="single" w:color="888888" w:sz="1"/>
+              <w:bottom w:val="single" w:color="888888" w:sz="1"/>
+              <w:right w:val="single" w:color="888888" w:sz="1"/>
+            </w:tcBorders>
+            <w:tcMar>
+              <w:top w:type="dxa" w:w="20"/>
+              <w:left w:type="dxa" w:w="60"/>
+              <w:bottom w:type="dxa" w:w="20"/>
+              <w:right w:type="dxa" w:w="60"/>
+            </w:tcMar>
+          </w:tcPr>
+          <w:p>
+            <w:pPr>
+              <w:spacing w:after="0" w:line="240"/>
+              <w:jc w:val="center"/>
+            </w:pPr>
+            <w:r>
+              <w:rPr>
+                <w:rFonts w:ascii="MS Mincho" w:cs="MS Mincho" w:eastAsia="MS Mincho" w:hAnsi="MS Mincho"/>
+                <w:sz w:val="17"/>
+                <w:szCs w:val="17"/>
+              </w:rPr>
+              <w:t xml:space="preserve">0.218</w:t>
             </w:r>
           </w:p>
         </w:tc>
@@ -3052,100 +2518,100 @@
                 <w:sz w:val="17"/>
                 <w:szCs w:val="17"/>
               </w:rPr>
-              <w:t xml:space="preserve">CE（λ=2.0）</w:t>
-            </w:r>
-          </w:p>
-        </w:tc>
-        <w:tc>
-          <w:tcPr>
-            <w:tcW w:type="dxa" w:w="1000"/>
-            <w:tcBorders>
-              <w:top w:val="single" w:color="888888" w:sz="1"/>
-              <w:left w:val="single" w:color="888888" w:sz="1"/>
-              <w:bottom w:val="single" w:color="888888" w:sz="1"/>
-              <w:right w:val="single" w:color="888888" w:sz="1"/>
-            </w:tcBorders>
-            <w:tcMar>
-              <w:top w:type="dxa" w:w="20"/>
-              <w:left w:type="dxa" w:w="60"/>
-              <w:bottom w:type="dxa" w:w="20"/>
-              <w:right w:type="dxa" w:w="60"/>
-            </w:tcMar>
-          </w:tcPr>
-          <w:p>
-            <w:pPr>
-              <w:spacing w:after="0" w:line="240"/>
-              <w:jc w:val="center"/>
-            </w:pPr>
-            <w:r>
-              <w:rPr>
-                <w:rFonts w:ascii="MS Mincho" w:cs="MS Mincho" w:eastAsia="MS Mincho" w:hAnsi="MS Mincho"/>
-                <w:sz w:val="17"/>
-                <w:szCs w:val="17"/>
-              </w:rPr>
-              <w:t xml:space="preserve">0.215</w:t>
-            </w:r>
-          </w:p>
-        </w:tc>
-        <w:tc>
-          <w:tcPr>
-            <w:tcW w:type="dxa" w:w="1000"/>
-            <w:tcBorders>
-              <w:top w:val="single" w:color="888888" w:sz="1"/>
-              <w:left w:val="single" w:color="888888" w:sz="1"/>
-              <w:bottom w:val="single" w:color="888888" w:sz="1"/>
-              <w:right w:val="single" w:color="888888" w:sz="1"/>
-            </w:tcBorders>
-            <w:tcMar>
-              <w:top w:type="dxa" w:w="20"/>
-              <w:left w:type="dxa" w:w="60"/>
-              <w:bottom w:type="dxa" w:w="20"/>
-              <w:right w:type="dxa" w:w="60"/>
-            </w:tcMar>
-          </w:tcPr>
-          <w:p>
-            <w:pPr>
-              <w:spacing w:after="0" w:line="240"/>
-              <w:jc w:val="center"/>
-            </w:pPr>
-            <w:r>
-              <w:rPr>
-                <w:rFonts w:ascii="MS Mincho" w:cs="MS Mincho" w:eastAsia="MS Mincho" w:hAnsi="MS Mincho"/>
-                <w:sz w:val="17"/>
-                <w:szCs w:val="17"/>
-              </w:rPr>
-              <w:t xml:space="preserve">0.290</w:t>
-            </w:r>
-          </w:p>
-        </w:tc>
-        <w:tc>
-          <w:tcPr>
-            <w:tcW w:type="dxa" w:w="1000"/>
-            <w:tcBorders>
-              <w:top w:val="single" w:color="888888" w:sz="1"/>
-              <w:left w:val="single" w:color="888888" w:sz="1"/>
-              <w:bottom w:val="single" w:color="888888" w:sz="1"/>
-              <w:right w:val="single" w:color="888888" w:sz="1"/>
-            </w:tcBorders>
-            <w:tcMar>
-              <w:top w:type="dxa" w:w="20"/>
-              <w:left w:type="dxa" w:w="60"/>
-              <w:bottom w:type="dxa" w:w="20"/>
-              <w:right w:type="dxa" w:w="60"/>
-            </w:tcMar>
-          </w:tcPr>
-          <w:p>
-            <w:pPr>
-              <w:spacing w:after="0" w:line="240"/>
-              <w:jc w:val="center"/>
-            </w:pPr>
-            <w:r>
-              <w:rPr>
-                <w:rFonts w:ascii="MS Mincho" w:cs="MS Mincho" w:eastAsia="MS Mincho" w:hAnsi="MS Mincho"/>
-                <w:sz w:val="17"/>
-                <w:szCs w:val="17"/>
-              </w:rPr>
-              <w:t xml:space="preserve">0.343</w:t>
+              <w:t xml:space="preserve">CE（λ=10.0）</w:t>
+            </w:r>
+          </w:p>
+        </w:tc>
+        <w:tc>
+          <w:tcPr>
+            <w:tcW w:type="dxa" w:w="1000"/>
+            <w:tcBorders>
+              <w:top w:val="single" w:color="888888" w:sz="1"/>
+              <w:left w:val="single" w:color="888888" w:sz="1"/>
+              <w:bottom w:val="single" w:color="888888" w:sz="1"/>
+              <w:right w:val="single" w:color="888888" w:sz="1"/>
+            </w:tcBorders>
+            <w:tcMar>
+              <w:top w:type="dxa" w:w="20"/>
+              <w:left w:type="dxa" w:w="60"/>
+              <w:bottom w:type="dxa" w:w="20"/>
+              <w:right w:type="dxa" w:w="60"/>
+            </w:tcMar>
+          </w:tcPr>
+          <w:p>
+            <w:pPr>
+              <w:spacing w:after="0" w:line="240"/>
+              <w:jc w:val="center"/>
+            </w:pPr>
+            <w:r>
+              <w:rPr>
+                <w:rFonts w:ascii="MS Mincho" w:cs="MS Mincho" w:eastAsia="MS Mincho" w:hAnsi="MS Mincho"/>
+                <w:sz w:val="17"/>
+                <w:szCs w:val="17"/>
+              </w:rPr>
+              <w:t xml:space="preserve">0.287</w:t>
+            </w:r>
+          </w:p>
+        </w:tc>
+        <w:tc>
+          <w:tcPr>
+            <w:tcW w:type="dxa" w:w="1000"/>
+            <w:tcBorders>
+              <w:top w:val="single" w:color="888888" w:sz="1"/>
+              <w:left w:val="single" w:color="888888" w:sz="1"/>
+              <w:bottom w:val="single" w:color="888888" w:sz="1"/>
+              <w:right w:val="single" w:color="888888" w:sz="1"/>
+            </w:tcBorders>
+            <w:tcMar>
+              <w:top w:type="dxa" w:w="20"/>
+              <w:left w:type="dxa" w:w="60"/>
+              <w:bottom w:type="dxa" w:w="20"/>
+              <w:right w:type="dxa" w:w="60"/>
+            </w:tcMar>
+          </w:tcPr>
+          <w:p>
+            <w:pPr>
+              <w:spacing w:after="0" w:line="240"/>
+              <w:jc w:val="center"/>
+            </w:pPr>
+            <w:r>
+              <w:rPr>
+                <w:rFonts w:ascii="MS Mincho" w:cs="MS Mincho" w:eastAsia="MS Mincho" w:hAnsi="MS Mincho"/>
+                <w:sz w:val="17"/>
+                <w:szCs w:val="17"/>
+              </w:rPr>
+              <w:t xml:space="preserve">0.200</w:t>
+            </w:r>
+          </w:p>
+        </w:tc>
+        <w:tc>
+          <w:tcPr>
+            <w:tcW w:type="dxa" w:w="1000"/>
+            <w:tcBorders>
+              <w:top w:val="single" w:color="888888" w:sz="1"/>
+              <w:left w:val="single" w:color="888888" w:sz="1"/>
+              <w:bottom w:val="single" w:color="888888" w:sz="1"/>
+              <w:right w:val="single" w:color="888888" w:sz="1"/>
+            </w:tcBorders>
+            <w:tcMar>
+              <w:top w:type="dxa" w:w="20"/>
+              <w:left w:type="dxa" w:w="60"/>
+              <w:bottom w:type="dxa" w:w="20"/>
+              <w:right w:type="dxa" w:w="60"/>
+            </w:tcMar>
+          </w:tcPr>
+          <w:p>
+            <w:pPr>
+              <w:spacing w:after="0" w:line="240"/>
+              <w:jc w:val="center"/>
+            </w:pPr>
+            <w:r>
+              <w:rPr>
+                <w:rFonts w:ascii="MS Mincho" w:cs="MS Mincho" w:eastAsia="MS Mincho" w:hAnsi="MS Mincho"/>
+                <w:sz w:val="17"/>
+                <w:szCs w:val="17"/>
+              </w:rPr>
+              <w:t xml:space="preserve">0.189</w:t>
             </w:r>
           </w:p>
         </w:tc>
@@ -3164,64 +2630,7 @@
           <w:sz w:val="17"/>
           <w:szCs w:val="17"/>
         </w:rPr>
-        <w:t xml:space="preserve">表3: 各ASRモデルのencoder表現間L1距離</w:t>
-      </w:r>
-    </w:p>
-    <w:p>
-      <w:pPr>
-        <w:spacing w:after="60" w:line="300"/>
-      </w:pPr>
-      <w:r>
-        <w:rPr>
-          <w:rFonts w:ascii="MS Mincho" w:cs="MS Mincho" w:eastAsia="MS Mincho" w:hAnsi="MS Mincho"/>
-          <w:sz w:val="20"/>
-          <w:szCs w:val="20"/>
-        </w:rPr>
-        <w:t xml:space="preserve">注目すべきは、CE損失（CER最良）がTAPS pretrainedよりもencoder距離が</w:t>
-      </w:r>
-      <w:r>
-        <w:rPr>
-          <w:rFonts w:ascii="MS Mincho" w:cs="MS Mincho" w:eastAsia="MS Mincho" w:hAnsi="MS Mincho"/>
-          <w:b/>
-          <w:bCs/>
-          <w:sz w:val="20"/>
-          <w:szCs w:val="20"/>
-        </w:rPr>
-        <w:t xml:space="preserve">大きい</w:t>
-      </w:r>
-      <w:r>
-        <w:rPr>
-          <w:rFonts w:ascii="MS Mincho" w:cs="MS Mincho" w:eastAsia="MS Mincho" w:hAnsi="MS Mincho"/>
-          <w:sz w:val="20"/>
-          <w:szCs w:val="20"/>
-        </w:rPr>
-        <w:t xml:space="preserve">点である。すなわち、CE損失で学習したSEの出力は気導音声にencoder空間で近づいておらず、むしろ離れている。それにも関わらずCERは改善している（表2）。これは「気導音声にencoder表現を近づける＝ASR精度が向上する」という仮説が成立しないことを意味する。</w:t>
-      </w:r>
-    </w:p>
-    <w:p>
-      <w:pPr>
-        <w:spacing w:after="60" w:line="300"/>
-      </w:pPr>
-      <w:r>
-        <w:rPr>
-          <w:rFonts w:ascii="MS Mincho" w:cs="MS Mincho" w:eastAsia="MS Mincho" w:hAnsi="MS Mincho"/>
-          <w:sz w:val="20"/>
-          <w:szCs w:val="20"/>
-        </w:rPr>
-        <w:t xml:space="preserve">一方、Enc L1はWhisper-smallのencoder距離をわずかに縮小（0.201→0.199）しているが、CERはむしろ悪化している（0.252→0.257）。また、学習に使用していないWhisper-base・mediumではencoder距離が逆に増加しており、特定のencoderへの過学習が確認された。</w:t>
-      </w:r>
-    </w:p>
-    <w:p>
-      <w:pPr>
-        <w:spacing w:after="60" w:line="300"/>
-      </w:pPr>
-      <w:r>
-        <w:rPr>
-          <w:rFonts w:ascii="MS Mincho" w:cs="MS Mincho" w:eastAsia="MS Mincho" w:hAnsi="MS Mincho"/>
-          <w:sz w:val="20"/>
-          <w:szCs w:val="20"/>
-        </w:rPr>
-        <w:t xml:space="preserve">以上の結果は、CE損失が気導音声への復元とは異なるメカニズムでASR精度を改善していることを示唆する。CE損失は「気導音声に似た音声」ではなく、「ASRが正しく書き起こせる音声」を生成しており、これは気導音声とは異なる表現である可能性がある。</w:t>
+        <w:t xml:space="preserve">表2: Whisper系列の異なるサイズでのCER比較</w:t>
       </w:r>
     </w:p>
     <w:p>
@@ -3237,7 +2646,7 @@
           <w:sz w:val="22"/>
           <w:szCs w:val="22"/>
         </w:rPr>
-        <w:t xml:space="preserve">4.4 知覚品質評価</w:t>
+        <w:t xml:space="preserve">4.3 Encoder距離分析</w:t>
       </w:r>
     </w:p>
     <w:p>
@@ -3250,25 +2659,7 @@
           <w:sz w:val="20"/>
           <w:szCs w:val="20"/>
         </w:rPr>
-        <w:t xml:space="preserve">表4にSTOI・PESQ・CERの比較を示す。TAPS pretrainedはSTOI 0.892・PESQ 1.975と最も高い知覚品質を達成するが、CERは0.252にとどまる。一方、提案手法（CE </w:t>
-      </w:r>
-      <w:r>
-        <w:rPr>
-          <w:rFonts w:ascii="Cambria Math" w:cs="Cambria Math" w:eastAsia="Cambria Math" w:hAnsi="Cambria Math"/>
-          <w:i/>
-          <w:iCs/>
-          <w:sz w:val="20"/>
-          <w:szCs w:val="20"/>
-        </w:rPr>
-        <w:t xml:space="preserve">λ</w:t>
-      </w:r>
-      <w:r>
-        <w:rPr>
-          <w:rFonts w:ascii="MS Mincho" w:cs="MS Mincho" w:eastAsia="MS Mincho" w:hAnsi="MS Mincho"/>
-          <w:sz w:val="20"/>
-          <w:szCs w:val="20"/>
-        </w:rPr>
-        <w:t xml:space="preserve"> = 2.0）はSTOI 0.825・PESQ 1.256と知覚品質が低下するにも関わらず、CERは0.229と最良である。</w:t>
+        <w:t xml:space="preserve">CE損失の改善メカニズムを分析するため、各SE条件について3つのWhisperモデルのencoder表現間L1距離を計測した（表3）。SE出力と気導音声を各encoderに入力し、出力表現のL1距離を計算した。</w:t>
       </w:r>
     </w:p>
     <w:tbl>
@@ -3320,7 +2711,7 @@
                 <w:sz w:val="17"/>
                 <w:szCs w:val="17"/>
               </w:rPr>
-              <w:t xml:space="preserve">条件</w:t>
+              <w:t xml:space="preserve">SE条件</w:t>
             </w:r>
           </w:p>
         </w:tc>
@@ -3354,7 +2745,7 @@
                 <w:sz w:val="17"/>
                 <w:szCs w:val="17"/>
               </w:rPr>
-              <w:t xml:space="preserve">STOI</w:t>
+              <w:t xml:space="preserve">base L1</w:t>
             </w:r>
           </w:p>
         </w:tc>
@@ -3388,7 +2779,7 @@
                 <w:sz w:val="17"/>
                 <w:szCs w:val="17"/>
               </w:rPr>
-              <w:t xml:space="preserve">PESQ</w:t>
+              <w:t xml:space="preserve">small L1</w:t>
             </w:r>
           </w:p>
         </w:tc>
@@ -3422,7 +2813,7 @@
                 <w:sz w:val="17"/>
                 <w:szCs w:val="17"/>
               </w:rPr>
-              <w:t xml:space="preserve">CER</w:t>
+              <w:t xml:space="preserve">medium L1</w:t>
             </w:r>
           </w:p>
         </w:tc>
@@ -3486,69 +2877,69 @@
                 <w:sz w:val="17"/>
                 <w:szCs w:val="17"/>
               </w:rPr>
-              <w:t xml:space="preserve">0.697</w:t>
-            </w:r>
-          </w:p>
-        </w:tc>
-        <w:tc>
-          <w:tcPr>
-            <w:tcW w:type="dxa" w:w="1000"/>
-            <w:tcBorders>
-              <w:top w:val="single" w:color="888888" w:sz="1"/>
-              <w:left w:val="single" w:color="888888" w:sz="1"/>
-              <w:bottom w:val="single" w:color="888888" w:sz="1"/>
-              <w:right w:val="single" w:color="888888" w:sz="1"/>
-            </w:tcBorders>
-            <w:tcMar>
-              <w:top w:type="dxa" w:w="20"/>
-              <w:left w:type="dxa" w:w="60"/>
-              <w:bottom w:type="dxa" w:w="20"/>
-              <w:right w:type="dxa" w:w="60"/>
-            </w:tcMar>
-          </w:tcPr>
-          <w:p>
-            <w:pPr>
-              <w:spacing w:after="0" w:line="240"/>
-              <w:jc w:val="center"/>
-            </w:pPr>
-            <w:r>
-              <w:rPr>
-                <w:rFonts w:ascii="MS Mincho" w:cs="MS Mincho" w:eastAsia="MS Mincho" w:hAnsi="MS Mincho"/>
-                <w:sz w:val="17"/>
-                <w:szCs w:val="17"/>
-              </w:rPr>
-              <w:t xml:space="preserve">1.224</w:t>
-            </w:r>
-          </w:p>
-        </w:tc>
-        <w:tc>
-          <w:tcPr>
-            <w:tcW w:type="dxa" w:w="1000"/>
-            <w:tcBorders>
-              <w:top w:val="single" w:color="888888" w:sz="1"/>
-              <w:left w:val="single" w:color="888888" w:sz="1"/>
-              <w:bottom w:val="single" w:color="888888" w:sz="1"/>
-              <w:right w:val="single" w:color="888888" w:sz="1"/>
-            </w:tcBorders>
-            <w:tcMar>
-              <w:top w:type="dxa" w:w="20"/>
-              <w:left w:type="dxa" w:w="60"/>
-              <w:bottom w:type="dxa" w:w="20"/>
-              <w:right w:type="dxa" w:w="60"/>
-            </w:tcMar>
-          </w:tcPr>
-          <w:p>
-            <w:pPr>
-              <w:spacing w:after="0" w:line="240"/>
-              <w:jc w:val="center"/>
-            </w:pPr>
-            <w:r>
-              <w:rPr>
-                <w:rFonts w:ascii="MS Mincho" w:cs="MS Mincho" w:eastAsia="MS Mincho" w:hAnsi="MS Mincho"/>
-                <w:sz w:val="17"/>
-                <w:szCs w:val="17"/>
-              </w:rPr>
-              <w:t xml:space="preserve">0.471</w:t>
+              <w:t xml:space="preserve">0.367</w:t>
+            </w:r>
+          </w:p>
+        </w:tc>
+        <w:tc>
+          <w:tcPr>
+            <w:tcW w:type="dxa" w:w="1000"/>
+            <w:tcBorders>
+              <w:top w:val="single" w:color="888888" w:sz="1"/>
+              <w:left w:val="single" w:color="888888" w:sz="1"/>
+              <w:bottom w:val="single" w:color="888888" w:sz="1"/>
+              <w:right w:val="single" w:color="888888" w:sz="1"/>
+            </w:tcBorders>
+            <w:tcMar>
+              <w:top w:type="dxa" w:w="20"/>
+              <w:left w:type="dxa" w:w="60"/>
+              <w:bottom w:type="dxa" w:w="20"/>
+              <w:right w:type="dxa" w:w="60"/>
+            </w:tcMar>
+          </w:tcPr>
+          <w:p>
+            <w:pPr>
+              <w:spacing w:after="0" w:line="240"/>
+              <w:jc w:val="center"/>
+            </w:pPr>
+            <w:r>
+              <w:rPr>
+                <w:rFonts w:ascii="MS Mincho" w:cs="MS Mincho" w:eastAsia="MS Mincho" w:hAnsi="MS Mincho"/>
+                <w:sz w:val="17"/>
+                <w:szCs w:val="17"/>
+              </w:rPr>
+              <w:t xml:space="preserve">0.386</w:t>
+            </w:r>
+          </w:p>
+        </w:tc>
+        <w:tc>
+          <w:tcPr>
+            <w:tcW w:type="dxa" w:w="1000"/>
+            <w:tcBorders>
+              <w:top w:val="single" w:color="888888" w:sz="1"/>
+              <w:left w:val="single" w:color="888888" w:sz="1"/>
+              <w:bottom w:val="single" w:color="888888" w:sz="1"/>
+              <w:right w:val="single" w:color="888888" w:sz="1"/>
+            </w:tcBorders>
+            <w:tcMar>
+              <w:top w:type="dxa" w:w="20"/>
+              <w:left w:type="dxa" w:w="60"/>
+              <w:bottom w:type="dxa" w:w="20"/>
+              <w:right w:type="dxa" w:w="60"/>
+            </w:tcMar>
+          </w:tcPr>
+          <w:p>
+            <w:pPr>
+              <w:spacing w:after="0" w:line="240"/>
+              <w:jc w:val="center"/>
+            </w:pPr>
+            <w:r>
+              <w:rPr>
+                <w:rFonts w:ascii="MS Mincho" w:cs="MS Mincho" w:eastAsia="MS Mincho" w:hAnsi="MS Mincho"/>
+                <w:sz w:val="17"/>
+                <w:szCs w:val="17"/>
+              </w:rPr>
+              <w:t xml:space="preserve">0.408</w:t>
             </w:r>
           </w:p>
         </w:tc>
@@ -3612,69 +3003,69 @@
                 <w:sz w:val="17"/>
                 <w:szCs w:val="17"/>
               </w:rPr>
-              <w:t xml:space="preserve">0.892</w:t>
-            </w:r>
-          </w:p>
-        </w:tc>
-        <w:tc>
-          <w:tcPr>
-            <w:tcW w:type="dxa" w:w="1000"/>
-            <w:tcBorders>
-              <w:top w:val="single" w:color="888888" w:sz="1"/>
-              <w:left w:val="single" w:color="888888" w:sz="1"/>
-              <w:bottom w:val="single" w:color="888888" w:sz="1"/>
-              <w:right w:val="single" w:color="888888" w:sz="1"/>
-            </w:tcBorders>
-            <w:tcMar>
-              <w:top w:type="dxa" w:w="20"/>
-              <w:left w:type="dxa" w:w="60"/>
-              <w:bottom w:type="dxa" w:w="20"/>
-              <w:right w:type="dxa" w:w="60"/>
-            </w:tcMar>
-          </w:tcPr>
-          <w:p>
-            <w:pPr>
-              <w:spacing w:after="0" w:line="240"/>
-              <w:jc w:val="center"/>
-            </w:pPr>
-            <w:r>
-              <w:rPr>
-                <w:rFonts w:ascii="MS Mincho" w:cs="MS Mincho" w:eastAsia="MS Mincho" w:hAnsi="MS Mincho"/>
-                <w:sz w:val="17"/>
-                <w:szCs w:val="17"/>
-              </w:rPr>
-              <w:t xml:space="preserve">1.975</w:t>
-            </w:r>
-          </w:p>
-        </w:tc>
-        <w:tc>
-          <w:tcPr>
-            <w:tcW w:type="dxa" w:w="1000"/>
-            <w:tcBorders>
-              <w:top w:val="single" w:color="888888" w:sz="1"/>
-              <w:left w:val="single" w:color="888888" w:sz="1"/>
-              <w:bottom w:val="single" w:color="888888" w:sz="1"/>
-              <w:right w:val="single" w:color="888888" w:sz="1"/>
-            </w:tcBorders>
-            <w:tcMar>
-              <w:top w:type="dxa" w:w="20"/>
-              <w:left w:type="dxa" w:w="60"/>
-              <w:bottom w:type="dxa" w:w="20"/>
-              <w:right w:type="dxa" w:w="60"/>
-            </w:tcMar>
-          </w:tcPr>
-          <w:p>
-            <w:pPr>
-              <w:spacing w:after="0" w:line="240"/>
-              <w:jc w:val="center"/>
-            </w:pPr>
-            <w:r>
-              <w:rPr>
-                <w:rFonts w:ascii="MS Mincho" w:cs="MS Mincho" w:eastAsia="MS Mincho" w:hAnsi="MS Mincho"/>
-                <w:sz w:val="17"/>
-                <w:szCs w:val="17"/>
-              </w:rPr>
-              <w:t xml:space="preserve">0.252</w:t>
+              <w:t xml:space="preserve">0.157</w:t>
+            </w:r>
+          </w:p>
+        </w:tc>
+        <w:tc>
+          <w:tcPr>
+            <w:tcW w:type="dxa" w:w="1000"/>
+            <w:tcBorders>
+              <w:top w:val="single" w:color="888888" w:sz="1"/>
+              <w:left w:val="single" w:color="888888" w:sz="1"/>
+              <w:bottom w:val="single" w:color="888888" w:sz="1"/>
+              <w:right w:val="single" w:color="888888" w:sz="1"/>
+            </w:tcBorders>
+            <w:tcMar>
+              <w:top w:type="dxa" w:w="20"/>
+              <w:left w:type="dxa" w:w="60"/>
+              <w:bottom w:type="dxa" w:w="20"/>
+              <w:right w:type="dxa" w:w="60"/>
+            </w:tcMar>
+          </w:tcPr>
+          <w:p>
+            <w:pPr>
+              <w:spacing w:after="0" w:line="240"/>
+              <w:jc w:val="center"/>
+            </w:pPr>
+            <w:r>
+              <w:rPr>
+                <w:rFonts w:ascii="MS Mincho" w:cs="MS Mincho" w:eastAsia="MS Mincho" w:hAnsi="MS Mincho"/>
+                <w:sz w:val="17"/>
+                <w:szCs w:val="17"/>
+              </w:rPr>
+              <w:t xml:space="preserve">0.200</w:t>
+            </w:r>
+          </w:p>
+        </w:tc>
+        <w:tc>
+          <w:tcPr>
+            <w:tcW w:type="dxa" w:w="1000"/>
+            <w:tcBorders>
+              <w:top w:val="single" w:color="888888" w:sz="1"/>
+              <w:left w:val="single" w:color="888888" w:sz="1"/>
+              <w:bottom w:val="single" w:color="888888" w:sz="1"/>
+              <w:right w:val="single" w:color="888888" w:sz="1"/>
+            </w:tcBorders>
+            <w:tcMar>
+              <w:top w:type="dxa" w:w="20"/>
+              <w:left w:type="dxa" w:w="60"/>
+              <w:bottom w:type="dxa" w:w="20"/>
+              <w:right w:type="dxa" w:w="60"/>
+            </w:tcMar>
+          </w:tcPr>
+          <w:p>
+            <w:pPr>
+              <w:spacing w:after="0" w:line="240"/>
+              <w:jc w:val="center"/>
+            </w:pPr>
+            <w:r>
+              <w:rPr>
+                <w:rFonts w:ascii="MS Mincho" w:cs="MS Mincho" w:eastAsia="MS Mincho" w:hAnsi="MS Mincho"/>
+                <w:sz w:val="17"/>
+                <w:szCs w:val="17"/>
+              </w:rPr>
+              <w:t xml:space="preserve">0.226</w:t>
             </w:r>
           </w:p>
         </w:tc>
@@ -3738,69 +3129,69 @@
                 <w:sz w:val="17"/>
                 <w:szCs w:val="17"/>
               </w:rPr>
-              <w:t xml:space="preserve">0.871</w:t>
-            </w:r>
-          </w:p>
-        </w:tc>
-        <w:tc>
-          <w:tcPr>
-            <w:tcW w:type="dxa" w:w="1000"/>
-            <w:tcBorders>
-              <w:top w:val="single" w:color="888888" w:sz="1"/>
-              <w:left w:val="single" w:color="888888" w:sz="1"/>
-              <w:bottom w:val="single" w:color="888888" w:sz="1"/>
-              <w:right w:val="single" w:color="888888" w:sz="1"/>
-            </w:tcBorders>
-            <w:tcMar>
-              <w:top w:type="dxa" w:w="20"/>
-              <w:left w:type="dxa" w:w="60"/>
-              <w:bottom w:type="dxa" w:w="20"/>
-              <w:right w:type="dxa" w:w="60"/>
-            </w:tcMar>
-          </w:tcPr>
-          <w:p>
-            <w:pPr>
-              <w:spacing w:after="0" w:line="240"/>
-              <w:jc w:val="center"/>
-            </w:pPr>
-            <w:r>
-              <w:rPr>
-                <w:rFonts w:ascii="MS Mincho" w:cs="MS Mincho" w:eastAsia="MS Mincho" w:hAnsi="MS Mincho"/>
-                <w:sz w:val="17"/>
-                <w:szCs w:val="17"/>
-              </w:rPr>
-              <w:t xml:space="preserve">1.750</w:t>
-            </w:r>
-          </w:p>
-        </w:tc>
-        <w:tc>
-          <w:tcPr>
-            <w:tcW w:type="dxa" w:w="1000"/>
-            <w:tcBorders>
-              <w:top w:val="single" w:color="888888" w:sz="1"/>
-              <w:left w:val="single" w:color="888888" w:sz="1"/>
-              <w:bottom w:val="single" w:color="888888" w:sz="1"/>
-              <w:right w:val="single" w:color="888888" w:sz="1"/>
-            </w:tcBorders>
-            <w:tcMar>
-              <w:top w:type="dxa" w:w="20"/>
-              <w:left w:type="dxa" w:w="60"/>
-              <w:bottom w:type="dxa" w:w="20"/>
-              <w:right w:type="dxa" w:w="60"/>
-            </w:tcMar>
-          </w:tcPr>
-          <w:p>
-            <w:pPr>
-              <w:spacing w:after="0" w:line="240"/>
-              <w:jc w:val="center"/>
-            </w:pPr>
-            <w:r>
-              <w:rPr>
-                <w:rFonts w:ascii="MS Mincho" w:cs="MS Mincho" w:eastAsia="MS Mincho" w:hAnsi="MS Mincho"/>
-                <w:sz w:val="17"/>
-                <w:szCs w:val="17"/>
-              </w:rPr>
-              <w:t xml:space="preserve">0.257</w:t>
+              <w:t xml:space="preserve">0.157</w:t>
+            </w:r>
+          </w:p>
+        </w:tc>
+        <w:tc>
+          <w:tcPr>
+            <w:tcW w:type="dxa" w:w="1000"/>
+            <w:tcBorders>
+              <w:top w:val="single" w:color="888888" w:sz="1"/>
+              <w:left w:val="single" w:color="888888" w:sz="1"/>
+              <w:bottom w:val="single" w:color="888888" w:sz="1"/>
+              <w:right w:val="single" w:color="888888" w:sz="1"/>
+            </w:tcBorders>
+            <w:tcMar>
+              <w:top w:type="dxa" w:w="20"/>
+              <w:left w:type="dxa" w:w="60"/>
+              <w:bottom w:type="dxa" w:w="20"/>
+              <w:right w:type="dxa" w:w="60"/>
+            </w:tcMar>
+          </w:tcPr>
+          <w:p>
+            <w:pPr>
+              <w:spacing w:after="0" w:line="240"/>
+              <w:jc w:val="center"/>
+            </w:pPr>
+            <w:r>
+              <w:rPr>
+                <w:rFonts w:ascii="MS Mincho" w:cs="MS Mincho" w:eastAsia="MS Mincho" w:hAnsi="MS Mincho"/>
+                <w:sz w:val="17"/>
+                <w:szCs w:val="17"/>
+              </w:rPr>
+              <w:t xml:space="preserve">0.192</w:t>
+            </w:r>
+          </w:p>
+        </w:tc>
+        <w:tc>
+          <w:tcPr>
+            <w:tcW w:type="dxa" w:w="1000"/>
+            <w:tcBorders>
+              <w:top w:val="single" w:color="888888" w:sz="1"/>
+              <w:left w:val="single" w:color="888888" w:sz="1"/>
+              <w:bottom w:val="single" w:color="888888" w:sz="1"/>
+              <w:right w:val="single" w:color="888888" w:sz="1"/>
+            </w:tcBorders>
+            <w:tcMar>
+              <w:top w:type="dxa" w:w="20"/>
+              <w:left w:type="dxa" w:w="60"/>
+              <w:bottom w:type="dxa" w:w="20"/>
+              <w:right w:type="dxa" w:w="60"/>
+            </w:tcMar>
+          </w:tcPr>
+          <w:p>
+            <w:pPr>
+              <w:spacing w:after="0" w:line="240"/>
+              <w:jc w:val="center"/>
+            </w:pPr>
+            <w:r>
+              <w:rPr>
+                <w:rFonts w:ascii="MS Mincho" w:cs="MS Mincho" w:eastAsia="MS Mincho" w:hAnsi="MS Mincho"/>
+                <w:sz w:val="17"/>
+                <w:szCs w:val="17"/>
+              </w:rPr>
+              <w:t xml:space="preserve">0.224</w:t>
             </w:r>
           </w:p>
         </w:tc>
@@ -3833,100 +3224,881 @@
                 <w:sz w:val="17"/>
                 <w:szCs w:val="17"/>
               </w:rPr>
-              <w:t xml:space="preserve">CE（λ=2.0）</w:t>
-            </w:r>
-          </w:p>
-        </w:tc>
-        <w:tc>
-          <w:tcPr>
-            <w:tcW w:type="dxa" w:w="1000"/>
-            <w:tcBorders>
-              <w:top w:val="single" w:color="888888" w:sz="1"/>
-              <w:left w:val="single" w:color="888888" w:sz="1"/>
-              <w:bottom w:val="single" w:color="888888" w:sz="1"/>
-              <w:right w:val="single" w:color="888888" w:sz="1"/>
-            </w:tcBorders>
-            <w:tcMar>
-              <w:top w:type="dxa" w:w="20"/>
-              <w:left w:type="dxa" w:w="60"/>
-              <w:bottom w:type="dxa" w:w="20"/>
-              <w:right w:type="dxa" w:w="60"/>
-            </w:tcMar>
-          </w:tcPr>
-          <w:p>
-            <w:pPr>
-              <w:spacing w:after="0" w:line="240"/>
-              <w:jc w:val="center"/>
-            </w:pPr>
-            <w:r>
-              <w:rPr>
-                <w:rFonts w:ascii="MS Mincho" w:cs="MS Mincho" w:eastAsia="MS Mincho" w:hAnsi="MS Mincho"/>
-                <w:sz w:val="17"/>
-                <w:szCs w:val="17"/>
-              </w:rPr>
-              <w:t xml:space="preserve">0.825</w:t>
-            </w:r>
-          </w:p>
-        </w:tc>
-        <w:tc>
-          <w:tcPr>
-            <w:tcW w:type="dxa" w:w="1000"/>
-            <w:tcBorders>
-              <w:top w:val="single" w:color="888888" w:sz="1"/>
-              <w:left w:val="single" w:color="888888" w:sz="1"/>
-              <w:bottom w:val="single" w:color="888888" w:sz="1"/>
-              <w:right w:val="single" w:color="888888" w:sz="1"/>
-            </w:tcBorders>
-            <w:tcMar>
-              <w:top w:type="dxa" w:w="20"/>
-              <w:left w:type="dxa" w:w="60"/>
-              <w:bottom w:type="dxa" w:w="20"/>
-              <w:right w:type="dxa" w:w="60"/>
-            </w:tcMar>
-          </w:tcPr>
-          <w:p>
-            <w:pPr>
-              <w:spacing w:after="0" w:line="240"/>
-              <w:jc w:val="center"/>
-            </w:pPr>
-            <w:r>
-              <w:rPr>
-                <w:rFonts w:ascii="MS Mincho" w:cs="MS Mincho" w:eastAsia="MS Mincho" w:hAnsi="MS Mincho"/>
-                <w:sz w:val="17"/>
-                <w:szCs w:val="17"/>
-              </w:rPr>
-              <w:t xml:space="preserve">1.256</w:t>
-            </w:r>
-          </w:p>
-        </w:tc>
-        <w:tc>
-          <w:tcPr>
-            <w:tcW w:type="dxa" w:w="1000"/>
-            <w:tcBorders>
-              <w:top w:val="single" w:color="888888" w:sz="1"/>
-              <w:left w:val="single" w:color="888888" w:sz="1"/>
-              <w:bottom w:val="single" w:color="888888" w:sz="1"/>
-              <w:right w:val="single" w:color="888888" w:sz="1"/>
-            </w:tcBorders>
-            <w:tcMar>
-              <w:top w:type="dxa" w:w="20"/>
-              <w:left w:type="dxa" w:w="60"/>
-              <w:bottom w:type="dxa" w:w="20"/>
-              <w:right w:type="dxa" w:w="60"/>
-            </w:tcMar>
-          </w:tcPr>
-          <w:p>
-            <w:pPr>
-              <w:spacing w:after="0" w:line="240"/>
-              <w:jc w:val="center"/>
-            </w:pPr>
-            <w:r>
-              <w:rPr>
-                <w:rFonts w:ascii="MS Mincho" w:cs="MS Mincho" w:eastAsia="MS Mincho" w:hAnsi="MS Mincho"/>
-                <w:sz w:val="17"/>
-                <w:szCs w:val="17"/>
-              </w:rPr>
-              <w:t xml:space="preserve">0.229</w:t>
+              <w:t xml:space="preserve">CE（λ=10.0）</w:t>
+            </w:r>
+          </w:p>
+        </w:tc>
+        <w:tc>
+          <w:tcPr>
+            <w:tcW w:type="dxa" w:w="1000"/>
+            <w:tcBorders>
+              <w:top w:val="single" w:color="888888" w:sz="1"/>
+              <w:left w:val="single" w:color="888888" w:sz="1"/>
+              <w:bottom w:val="single" w:color="888888" w:sz="1"/>
+              <w:right w:val="single" w:color="888888" w:sz="1"/>
+            </w:tcBorders>
+            <w:tcMar>
+              <w:top w:type="dxa" w:w="20"/>
+              <w:left w:type="dxa" w:w="60"/>
+              <w:bottom w:type="dxa" w:w="20"/>
+              <w:right w:type="dxa" w:w="60"/>
+            </w:tcMar>
+          </w:tcPr>
+          <w:p>
+            <w:pPr>
+              <w:spacing w:after="0" w:line="240"/>
+              <w:jc w:val="center"/>
+            </w:pPr>
+            <w:r>
+              <w:rPr>
+                <w:rFonts w:ascii="MS Mincho" w:cs="MS Mincho" w:eastAsia="MS Mincho" w:hAnsi="MS Mincho"/>
+                <w:sz w:val="17"/>
+                <w:szCs w:val="17"/>
+              </w:rPr>
+              <w:t xml:space="preserve">0.236</w:t>
+            </w:r>
+          </w:p>
+        </w:tc>
+        <w:tc>
+          <w:tcPr>
+            <w:tcW w:type="dxa" w:w="1000"/>
+            <w:tcBorders>
+              <w:top w:val="single" w:color="888888" w:sz="1"/>
+              <w:left w:val="single" w:color="888888" w:sz="1"/>
+              <w:bottom w:val="single" w:color="888888" w:sz="1"/>
+              <w:right w:val="single" w:color="888888" w:sz="1"/>
+            </w:tcBorders>
+            <w:tcMar>
+              <w:top w:type="dxa" w:w="20"/>
+              <w:left w:type="dxa" w:w="60"/>
+              <w:bottom w:type="dxa" w:w="20"/>
+              <w:right w:type="dxa" w:w="60"/>
+            </w:tcMar>
+          </w:tcPr>
+          <w:p>
+            <w:pPr>
+              <w:spacing w:after="0" w:line="240"/>
+              <w:jc w:val="center"/>
+            </w:pPr>
+            <w:r>
+              <w:rPr>
+                <w:rFonts w:ascii="MS Mincho" w:cs="MS Mincho" w:eastAsia="MS Mincho" w:hAnsi="MS Mincho"/>
+                <w:sz w:val="17"/>
+                <w:szCs w:val="17"/>
+              </w:rPr>
+              <w:t xml:space="preserve">0.326</w:t>
+            </w:r>
+          </w:p>
+        </w:tc>
+        <w:tc>
+          <w:tcPr>
+            <w:tcW w:type="dxa" w:w="1000"/>
+            <w:tcBorders>
+              <w:top w:val="single" w:color="888888" w:sz="1"/>
+              <w:left w:val="single" w:color="888888" w:sz="1"/>
+              <w:bottom w:val="single" w:color="888888" w:sz="1"/>
+              <w:right w:val="single" w:color="888888" w:sz="1"/>
+            </w:tcBorders>
+            <w:tcMar>
+              <w:top w:type="dxa" w:w="20"/>
+              <w:left w:type="dxa" w:w="60"/>
+              <w:bottom w:type="dxa" w:w="20"/>
+              <w:right w:type="dxa" w:w="60"/>
+            </w:tcMar>
+          </w:tcPr>
+          <w:p>
+            <w:pPr>
+              <w:spacing w:after="0" w:line="240"/>
+              <w:jc w:val="center"/>
+            </w:pPr>
+            <w:r>
+              <w:rPr>
+                <w:rFonts w:ascii="MS Mincho" w:cs="MS Mincho" w:eastAsia="MS Mincho" w:hAnsi="MS Mincho"/>
+                <w:sz w:val="17"/>
+                <w:szCs w:val="17"/>
+              </w:rPr>
+              <w:t xml:space="preserve">0.346</w:t>
+            </w:r>
+          </w:p>
+        </w:tc>
+      </w:tr>
+    </w:tbl>
+    <w:p>
+      <w:pPr>
+        <w:spacing w:after="140" w:before="30"/>
+        <w:jc w:val="center"/>
+      </w:pPr>
+      <w:r>
+        <w:rPr>
+          <w:rFonts w:ascii="MS Mincho" w:cs="MS Mincho" w:eastAsia="MS Mincho" w:hAnsi="MS Mincho"/>
+          <w:i/>
+          <w:iCs/>
+          <w:sz w:val="17"/>
+          <w:szCs w:val="17"/>
+        </w:rPr>
+        <w:t xml:space="preserve">表3: 各Whisperモデルのencoder表現間L1距離</w:t>
+      </w:r>
+    </w:p>
+    <w:p>
+      <w:pPr>
+        <w:spacing w:after="60" w:line="300"/>
+      </w:pPr>
+      <w:r>
+        <w:rPr>
+          <w:rFonts w:ascii="MS Mincho" w:cs="MS Mincho" w:eastAsia="MS Mincho" w:hAnsi="MS Mincho"/>
+          <w:sz w:val="20"/>
+          <w:szCs w:val="20"/>
+        </w:rPr>
+        <w:t xml:space="preserve">注目すべきは、CE損失（CER最良）がTAPS pretrainedよりもencoder距離が</w:t>
+      </w:r>
+      <w:r>
+        <w:rPr>
+          <w:rFonts w:ascii="MS Mincho" w:cs="MS Mincho" w:eastAsia="MS Mincho" w:hAnsi="MS Mincho"/>
+          <w:b/>
+          <w:bCs/>
+          <w:sz w:val="20"/>
+          <w:szCs w:val="20"/>
+        </w:rPr>
+        <w:t xml:space="preserve">大幅に大きい</w:t>
+      </w:r>
+      <w:r>
+        <w:rPr>
+          <w:rFonts w:ascii="MS Mincho" w:cs="MS Mincho" w:eastAsia="MS Mincho" w:hAnsi="MS Mincho"/>
+          <w:sz w:val="20"/>
+          <w:szCs w:val="20"/>
+        </w:rPr>
+        <w:t xml:space="preserve">点である（small: 0.200→0.326）。CE損失で学習したSEの出力は気導音声にencoder空間で近づいておらず、むしろ離れている。それにも関わらずCERは大幅に改善している（表2）。これは、encoder表現を気導音声に近づけることがASR精度向上の必要条件ではないことを示す。</w:t>
+      </w:r>
+    </w:p>
+    <w:p>
+      <w:pPr>
+        <w:spacing w:after="60" w:line="300"/>
+      </w:pPr>
+      <w:r>
+        <w:rPr>
+          <w:rFonts w:ascii="MS Mincho" w:cs="MS Mincho" w:eastAsia="MS Mincho" w:hAnsi="MS Mincho"/>
+          <w:sz w:val="20"/>
+          <w:szCs w:val="20"/>
+        </w:rPr>
+        <w:t xml:space="preserve">一方、Enc L1はWhisper-smallのencoder距離を縮小（0.200→0.192）しているが、CERの改善は限定的である（0.252→0.251）。encoder距離の縮小がCERの大幅改善につながらないことは、距離縮小とCER改善が単調に対応しないことを意味する。</w:t>
+      </w:r>
+    </w:p>
+    <w:p>
+      <w:pPr>
+        <w:spacing w:after="60" w:line="300"/>
+      </w:pPr>
+      <w:r>
+        <w:rPr>
+          <w:rFonts w:ascii="MS Mincho" w:cs="MS Mincho" w:eastAsia="MS Mincho" w:hAnsi="MS Mincho"/>
+          <w:sz w:val="20"/>
+          <w:szCs w:val="20"/>
+        </w:rPr>
+        <w:t xml:space="preserve">以上の結果は、CE損失が気導音声への復元とは異なるメカニズムでASR精度を改善していることを示唆する。CE損失は「気導音声に似た音声」ではなく、「ASRが正しく書き起こせる音声」を生成しており、これは気導音声とは異なる表現である可能性がある。</w:t>
+      </w:r>
+    </w:p>
+    <w:p>
+      <w:pPr>
+        <w:pStyle w:val="Heading2"/>
+        <w:spacing w:after="80" w:before="160"/>
+      </w:pPr>
+      <w:r>
+        <w:rPr>
+          <w:rFonts w:ascii="MS Gothic" w:cs="MS Gothic" w:eastAsia="MS Gothic" w:hAnsi="MS Gothic"/>
+          <w:b/>
+          <w:bCs/>
+          <w:sz w:val="22"/>
+          <w:szCs w:val="22"/>
+        </w:rPr>
+        <w:t xml:space="preserve">4.4 知覚品質評価</w:t>
+      </w:r>
+    </w:p>
+    <w:p>
+      <w:pPr>
+        <w:spacing w:after="60" w:line="300"/>
+      </w:pPr>
+      <w:r>
+        <w:rPr>
+          <w:rFonts w:ascii="MS Mincho" w:cs="MS Mincho" w:eastAsia="MS Mincho" w:hAnsi="MS Mincho"/>
+          <w:sz w:val="20"/>
+          <w:szCs w:val="20"/>
+        </w:rPr>
+        <w:t xml:space="preserve">表4にSTOI・PESQ・CERの比較を示す。TAPS pretrainedはSTOI 0.892・PESQ 1.975と最も高いSTOI・PESQ値を達成するが、CERは0.252にとどまる。一方、提案手法（CE </w:t>
+      </w:r>
+      <w:r>
+        <w:rPr>
+          <w:rFonts w:ascii="Cambria Math" w:cs="Cambria Math" w:eastAsia="Cambria Math" w:hAnsi="Cambria Math"/>
+          <w:i/>
+          <w:iCs/>
+          <w:sz w:val="20"/>
+          <w:szCs w:val="20"/>
+        </w:rPr>
+        <w:t xml:space="preserve">λ</w:t>
+      </w:r>
+      <w:r>
+        <w:rPr>
+          <w:rFonts w:ascii="MS Mincho" w:cs="MS Mincho" w:eastAsia="MS Mincho" w:hAnsi="MS Mincho"/>
+          <w:sz w:val="20"/>
+          <w:szCs w:val="20"/>
+        </w:rPr>
+        <w:t xml:space="preserve"> = 10.0）はSTOI 0.792・PESQ 1.215とSTOI・PESQが低下するにも関わらず、CERは0.200と最良である。</w:t>
+      </w:r>
+    </w:p>
+    <w:tbl>
+      <w:tblPr>
+        <w:tblW w:type="dxa" w:w="4200"/>
+        <w:tblBorders>
+          <w:top w:val="single" w:color="auto" w:sz="4"/>
+          <w:left w:val="single" w:color="auto" w:sz="4"/>
+          <w:bottom w:val="single" w:color="auto" w:sz="4"/>
+          <w:right w:val="single" w:color="auto" w:sz="4"/>
+          <w:insideH w:val="single" w:color="auto" w:sz="4"/>
+          <w:insideV w:val="single" w:color="auto" w:sz="4"/>
+        </w:tblBorders>
+      </w:tblPr>
+      <w:tblGrid>
+        <w:gridCol w:w="1200"/>
+        <w:gridCol w:w="1000"/>
+        <w:gridCol w:w="1000"/>
+        <w:gridCol w:w="1000"/>
+      </w:tblGrid>
+      <w:tr>
+        <w:tc>
+          <w:tcPr>
+            <w:tcW w:type="dxa" w:w="1200"/>
+            <w:tcBorders>
+              <w:top w:val="single" w:color="888888" w:sz="1"/>
+              <w:left w:val="single" w:color="888888" w:sz="1"/>
+              <w:bottom w:val="single" w:color="888888" w:sz="1"/>
+              <w:right w:val="single" w:color="888888" w:sz="1"/>
+            </w:tcBorders>
+            <w:shd w:fill="D9E2F3" w:val="clear"/>
+            <w:tcMar>
+              <w:top w:type="dxa" w:w="20"/>
+              <w:left w:type="dxa" w:w="60"/>
+              <w:bottom w:type="dxa" w:w="20"/>
+              <w:right w:type="dxa" w:w="60"/>
+            </w:tcMar>
+          </w:tcPr>
+          <w:p>
+            <w:pPr>
+              <w:spacing w:after="0" w:line="240"/>
+              <w:jc w:val="center"/>
+            </w:pPr>
+            <w:r>
+              <w:rPr>
+                <w:rFonts w:ascii="MS Mincho" w:cs="MS Mincho" w:eastAsia="MS Mincho" w:hAnsi="MS Mincho"/>
+                <w:b/>
+                <w:bCs/>
+                <w:sz w:val="17"/>
+                <w:szCs w:val="17"/>
+              </w:rPr>
+              <w:t xml:space="preserve">条件</w:t>
+            </w:r>
+          </w:p>
+        </w:tc>
+        <w:tc>
+          <w:tcPr>
+            <w:tcW w:type="dxa" w:w="1000"/>
+            <w:tcBorders>
+              <w:top w:val="single" w:color="888888" w:sz="1"/>
+              <w:left w:val="single" w:color="888888" w:sz="1"/>
+              <w:bottom w:val="single" w:color="888888" w:sz="1"/>
+              <w:right w:val="single" w:color="888888" w:sz="1"/>
+            </w:tcBorders>
+            <w:shd w:fill="D9E2F3" w:val="clear"/>
+            <w:tcMar>
+              <w:top w:type="dxa" w:w="20"/>
+              <w:left w:type="dxa" w:w="60"/>
+              <w:bottom w:type="dxa" w:w="20"/>
+              <w:right w:type="dxa" w:w="60"/>
+            </w:tcMar>
+          </w:tcPr>
+          <w:p>
+            <w:pPr>
+              <w:spacing w:after="0" w:line="240"/>
+              <w:jc w:val="center"/>
+            </w:pPr>
+            <w:r>
+              <w:rPr>
+                <w:rFonts w:ascii="MS Mincho" w:cs="MS Mincho" w:eastAsia="MS Mincho" w:hAnsi="MS Mincho"/>
+                <w:b/>
+                <w:bCs/>
+                <w:sz w:val="17"/>
+                <w:szCs w:val="17"/>
+              </w:rPr>
+              <w:t xml:space="preserve">STOI</w:t>
+            </w:r>
+          </w:p>
+        </w:tc>
+        <w:tc>
+          <w:tcPr>
+            <w:tcW w:type="dxa" w:w="1000"/>
+            <w:tcBorders>
+              <w:top w:val="single" w:color="888888" w:sz="1"/>
+              <w:left w:val="single" w:color="888888" w:sz="1"/>
+              <w:bottom w:val="single" w:color="888888" w:sz="1"/>
+              <w:right w:val="single" w:color="888888" w:sz="1"/>
+            </w:tcBorders>
+            <w:shd w:fill="D9E2F3" w:val="clear"/>
+            <w:tcMar>
+              <w:top w:type="dxa" w:w="20"/>
+              <w:left w:type="dxa" w:w="60"/>
+              <w:bottom w:type="dxa" w:w="20"/>
+              <w:right w:type="dxa" w:w="60"/>
+            </w:tcMar>
+          </w:tcPr>
+          <w:p>
+            <w:pPr>
+              <w:spacing w:after="0" w:line="240"/>
+              <w:jc w:val="center"/>
+            </w:pPr>
+            <w:r>
+              <w:rPr>
+                <w:rFonts w:ascii="MS Mincho" w:cs="MS Mincho" w:eastAsia="MS Mincho" w:hAnsi="MS Mincho"/>
+                <w:b/>
+                <w:bCs/>
+                <w:sz w:val="17"/>
+                <w:szCs w:val="17"/>
+              </w:rPr>
+              <w:t xml:space="preserve">PESQ</w:t>
+            </w:r>
+          </w:p>
+        </w:tc>
+        <w:tc>
+          <w:tcPr>
+            <w:tcW w:type="dxa" w:w="1000"/>
+            <w:tcBorders>
+              <w:top w:val="single" w:color="888888" w:sz="1"/>
+              <w:left w:val="single" w:color="888888" w:sz="1"/>
+              <w:bottom w:val="single" w:color="888888" w:sz="1"/>
+              <w:right w:val="single" w:color="888888" w:sz="1"/>
+            </w:tcBorders>
+            <w:shd w:fill="D9E2F3" w:val="clear"/>
+            <w:tcMar>
+              <w:top w:type="dxa" w:w="20"/>
+              <w:left w:type="dxa" w:w="60"/>
+              <w:bottom w:type="dxa" w:w="20"/>
+              <w:right w:type="dxa" w:w="60"/>
+            </w:tcMar>
+          </w:tcPr>
+          <w:p>
+            <w:pPr>
+              <w:spacing w:after="0" w:line="240"/>
+              <w:jc w:val="center"/>
+            </w:pPr>
+            <w:r>
+              <w:rPr>
+                <w:rFonts w:ascii="MS Mincho" w:cs="MS Mincho" w:eastAsia="MS Mincho" w:hAnsi="MS Mincho"/>
+                <w:b/>
+                <w:bCs/>
+                <w:sz w:val="17"/>
+                <w:szCs w:val="17"/>
+              </w:rPr>
+              <w:t xml:space="preserve">CER</w:t>
+            </w:r>
+          </w:p>
+        </w:tc>
+      </w:tr>
+      <w:tr>
+        <w:tc>
+          <w:tcPr>
+            <w:tcW w:type="dxa" w:w="1200"/>
+            <w:tcBorders>
+              <w:top w:val="single" w:color="888888" w:sz="1"/>
+              <w:left w:val="single" w:color="888888" w:sz="1"/>
+              <w:bottom w:val="single" w:color="888888" w:sz="1"/>
+              <w:right w:val="single" w:color="888888" w:sz="1"/>
+            </w:tcBorders>
+            <w:tcMar>
+              <w:top w:type="dxa" w:w="20"/>
+              <w:left w:type="dxa" w:w="60"/>
+              <w:bottom w:type="dxa" w:w="20"/>
+              <w:right w:type="dxa" w:w="60"/>
+            </w:tcMar>
+          </w:tcPr>
+          <w:p>
+            <w:pPr>
+              <w:spacing w:after="0" w:line="240"/>
+              <w:jc w:val="left"/>
+            </w:pPr>
+            <w:r>
+              <w:rPr>
+                <w:rFonts w:ascii="MS Mincho" w:cs="MS Mincho" w:eastAsia="MS Mincho" w:hAnsi="MS Mincho"/>
+                <w:sz w:val="17"/>
+                <w:szCs w:val="17"/>
+              </w:rPr>
+              <w:t xml:space="preserve">No SE</w:t>
+            </w:r>
+          </w:p>
+        </w:tc>
+        <w:tc>
+          <w:tcPr>
+            <w:tcW w:type="dxa" w:w="1000"/>
+            <w:tcBorders>
+              <w:top w:val="single" w:color="888888" w:sz="1"/>
+              <w:left w:val="single" w:color="888888" w:sz="1"/>
+              <w:bottom w:val="single" w:color="888888" w:sz="1"/>
+              <w:right w:val="single" w:color="888888" w:sz="1"/>
+            </w:tcBorders>
+            <w:tcMar>
+              <w:top w:type="dxa" w:w="20"/>
+              <w:left w:type="dxa" w:w="60"/>
+              <w:bottom w:type="dxa" w:w="20"/>
+              <w:right w:type="dxa" w:w="60"/>
+            </w:tcMar>
+          </w:tcPr>
+          <w:p>
+            <w:pPr>
+              <w:spacing w:after="0" w:line="240"/>
+              <w:jc w:val="center"/>
+            </w:pPr>
+            <w:r>
+              <w:rPr>
+                <w:rFonts w:ascii="MS Mincho" w:cs="MS Mincho" w:eastAsia="MS Mincho" w:hAnsi="MS Mincho"/>
+                <w:sz w:val="17"/>
+                <w:szCs w:val="17"/>
+              </w:rPr>
+              <w:t xml:space="preserve">0.697</w:t>
+            </w:r>
+          </w:p>
+        </w:tc>
+        <w:tc>
+          <w:tcPr>
+            <w:tcW w:type="dxa" w:w="1000"/>
+            <w:tcBorders>
+              <w:top w:val="single" w:color="888888" w:sz="1"/>
+              <w:left w:val="single" w:color="888888" w:sz="1"/>
+              <w:bottom w:val="single" w:color="888888" w:sz="1"/>
+              <w:right w:val="single" w:color="888888" w:sz="1"/>
+            </w:tcBorders>
+            <w:tcMar>
+              <w:top w:type="dxa" w:w="20"/>
+              <w:left w:type="dxa" w:w="60"/>
+              <w:bottom w:type="dxa" w:w="20"/>
+              <w:right w:type="dxa" w:w="60"/>
+            </w:tcMar>
+          </w:tcPr>
+          <w:p>
+            <w:pPr>
+              <w:spacing w:after="0" w:line="240"/>
+              <w:jc w:val="center"/>
+            </w:pPr>
+            <w:r>
+              <w:rPr>
+                <w:rFonts w:ascii="MS Mincho" w:cs="MS Mincho" w:eastAsia="MS Mincho" w:hAnsi="MS Mincho"/>
+                <w:sz w:val="17"/>
+                <w:szCs w:val="17"/>
+              </w:rPr>
+              <w:t xml:space="preserve">1.224</w:t>
+            </w:r>
+          </w:p>
+        </w:tc>
+        <w:tc>
+          <w:tcPr>
+            <w:tcW w:type="dxa" w:w="1000"/>
+            <w:tcBorders>
+              <w:top w:val="single" w:color="888888" w:sz="1"/>
+              <w:left w:val="single" w:color="888888" w:sz="1"/>
+              <w:bottom w:val="single" w:color="888888" w:sz="1"/>
+              <w:right w:val="single" w:color="888888" w:sz="1"/>
+            </w:tcBorders>
+            <w:tcMar>
+              <w:top w:type="dxa" w:w="20"/>
+              <w:left w:type="dxa" w:w="60"/>
+              <w:bottom w:type="dxa" w:w="20"/>
+              <w:right w:type="dxa" w:w="60"/>
+            </w:tcMar>
+          </w:tcPr>
+          <w:p>
+            <w:pPr>
+              <w:spacing w:after="0" w:line="240"/>
+              <w:jc w:val="center"/>
+            </w:pPr>
+            <w:r>
+              <w:rPr>
+                <w:rFonts w:ascii="MS Mincho" w:cs="MS Mincho" w:eastAsia="MS Mincho" w:hAnsi="MS Mincho"/>
+                <w:sz w:val="17"/>
+                <w:szCs w:val="17"/>
+              </w:rPr>
+              <w:t xml:space="preserve">0.471</w:t>
+            </w:r>
+          </w:p>
+        </w:tc>
+      </w:tr>
+      <w:tr>
+        <w:tc>
+          <w:tcPr>
+            <w:tcW w:type="dxa" w:w="1200"/>
+            <w:tcBorders>
+              <w:top w:val="single" w:color="888888" w:sz="1"/>
+              <w:left w:val="single" w:color="888888" w:sz="1"/>
+              <w:bottom w:val="single" w:color="888888" w:sz="1"/>
+              <w:right w:val="single" w:color="888888" w:sz="1"/>
+            </w:tcBorders>
+            <w:tcMar>
+              <w:top w:type="dxa" w:w="20"/>
+              <w:left w:type="dxa" w:w="60"/>
+              <w:bottom w:type="dxa" w:w="20"/>
+              <w:right w:type="dxa" w:w="60"/>
+            </w:tcMar>
+          </w:tcPr>
+          <w:p>
+            <w:pPr>
+              <w:spacing w:after="0" w:line="240"/>
+              <w:jc w:val="left"/>
+            </w:pPr>
+            <w:r>
+              <w:rPr>
+                <w:rFonts w:ascii="MS Mincho" w:cs="MS Mincho" w:eastAsia="MS Mincho" w:hAnsi="MS Mincho"/>
+                <w:sz w:val="17"/>
+                <w:szCs w:val="17"/>
+              </w:rPr>
+              <w:t xml:space="preserve">TAPS pretrained</w:t>
+            </w:r>
+          </w:p>
+        </w:tc>
+        <w:tc>
+          <w:tcPr>
+            <w:tcW w:type="dxa" w:w="1000"/>
+            <w:tcBorders>
+              <w:top w:val="single" w:color="888888" w:sz="1"/>
+              <w:left w:val="single" w:color="888888" w:sz="1"/>
+              <w:bottom w:val="single" w:color="888888" w:sz="1"/>
+              <w:right w:val="single" w:color="888888" w:sz="1"/>
+            </w:tcBorders>
+            <w:tcMar>
+              <w:top w:type="dxa" w:w="20"/>
+              <w:left w:type="dxa" w:w="60"/>
+              <w:bottom w:type="dxa" w:w="20"/>
+              <w:right w:type="dxa" w:w="60"/>
+            </w:tcMar>
+          </w:tcPr>
+          <w:p>
+            <w:pPr>
+              <w:spacing w:after="0" w:line="240"/>
+              <w:jc w:val="center"/>
+            </w:pPr>
+            <w:r>
+              <w:rPr>
+                <w:rFonts w:ascii="MS Mincho" w:cs="MS Mincho" w:eastAsia="MS Mincho" w:hAnsi="MS Mincho"/>
+                <w:sz w:val="17"/>
+                <w:szCs w:val="17"/>
+              </w:rPr>
+              <w:t xml:space="preserve">0.892</w:t>
+            </w:r>
+          </w:p>
+        </w:tc>
+        <w:tc>
+          <w:tcPr>
+            <w:tcW w:type="dxa" w:w="1000"/>
+            <w:tcBorders>
+              <w:top w:val="single" w:color="888888" w:sz="1"/>
+              <w:left w:val="single" w:color="888888" w:sz="1"/>
+              <w:bottom w:val="single" w:color="888888" w:sz="1"/>
+              <w:right w:val="single" w:color="888888" w:sz="1"/>
+            </w:tcBorders>
+            <w:tcMar>
+              <w:top w:type="dxa" w:w="20"/>
+              <w:left w:type="dxa" w:w="60"/>
+              <w:bottom w:type="dxa" w:w="20"/>
+              <w:right w:type="dxa" w:w="60"/>
+            </w:tcMar>
+          </w:tcPr>
+          <w:p>
+            <w:pPr>
+              <w:spacing w:after="0" w:line="240"/>
+              <w:jc w:val="center"/>
+            </w:pPr>
+            <w:r>
+              <w:rPr>
+                <w:rFonts w:ascii="MS Mincho" w:cs="MS Mincho" w:eastAsia="MS Mincho" w:hAnsi="MS Mincho"/>
+                <w:sz w:val="17"/>
+                <w:szCs w:val="17"/>
+              </w:rPr>
+              <w:t xml:space="preserve">1.975</w:t>
+            </w:r>
+          </w:p>
+        </w:tc>
+        <w:tc>
+          <w:tcPr>
+            <w:tcW w:type="dxa" w:w="1000"/>
+            <w:tcBorders>
+              <w:top w:val="single" w:color="888888" w:sz="1"/>
+              <w:left w:val="single" w:color="888888" w:sz="1"/>
+              <w:bottom w:val="single" w:color="888888" w:sz="1"/>
+              <w:right w:val="single" w:color="888888" w:sz="1"/>
+            </w:tcBorders>
+            <w:tcMar>
+              <w:top w:type="dxa" w:w="20"/>
+              <w:left w:type="dxa" w:w="60"/>
+              <w:bottom w:type="dxa" w:w="20"/>
+              <w:right w:type="dxa" w:w="60"/>
+            </w:tcMar>
+          </w:tcPr>
+          <w:p>
+            <w:pPr>
+              <w:spacing w:after="0" w:line="240"/>
+              <w:jc w:val="center"/>
+            </w:pPr>
+            <w:r>
+              <w:rPr>
+                <w:rFonts w:ascii="MS Mincho" w:cs="MS Mincho" w:eastAsia="MS Mincho" w:hAnsi="MS Mincho"/>
+                <w:sz w:val="17"/>
+                <w:szCs w:val="17"/>
+              </w:rPr>
+              <w:t xml:space="preserve">0.252</w:t>
+            </w:r>
+          </w:p>
+        </w:tc>
+      </w:tr>
+      <w:tr>
+        <w:tc>
+          <w:tcPr>
+            <w:tcW w:type="dxa" w:w="1200"/>
+            <w:tcBorders>
+              <w:top w:val="single" w:color="888888" w:sz="1"/>
+              <w:left w:val="single" w:color="888888" w:sz="1"/>
+              <w:bottom w:val="single" w:color="888888" w:sz="1"/>
+              <w:right w:val="single" w:color="888888" w:sz="1"/>
+            </w:tcBorders>
+            <w:tcMar>
+              <w:top w:type="dxa" w:w="20"/>
+              <w:left w:type="dxa" w:w="60"/>
+              <w:bottom w:type="dxa" w:w="20"/>
+              <w:right w:type="dxa" w:w="60"/>
+            </w:tcMar>
+          </w:tcPr>
+          <w:p>
+            <w:pPr>
+              <w:spacing w:after="0" w:line="240"/>
+              <w:jc w:val="left"/>
+            </w:pPr>
+            <w:r>
+              <w:rPr>
+                <w:rFonts w:ascii="MS Mincho" w:cs="MS Mincho" w:eastAsia="MS Mincho" w:hAnsi="MS Mincho"/>
+                <w:sz w:val="17"/>
+                <w:szCs w:val="17"/>
+              </w:rPr>
+              <w:t xml:space="preserve">Enc L1（λ=5.0）</w:t>
+            </w:r>
+          </w:p>
+        </w:tc>
+        <w:tc>
+          <w:tcPr>
+            <w:tcW w:type="dxa" w:w="1000"/>
+            <w:tcBorders>
+              <w:top w:val="single" w:color="888888" w:sz="1"/>
+              <w:left w:val="single" w:color="888888" w:sz="1"/>
+              <w:bottom w:val="single" w:color="888888" w:sz="1"/>
+              <w:right w:val="single" w:color="888888" w:sz="1"/>
+            </w:tcBorders>
+            <w:tcMar>
+              <w:top w:type="dxa" w:w="20"/>
+              <w:left w:type="dxa" w:w="60"/>
+              <w:bottom w:type="dxa" w:w="20"/>
+              <w:right w:type="dxa" w:w="60"/>
+            </w:tcMar>
+          </w:tcPr>
+          <w:p>
+            <w:pPr>
+              <w:spacing w:after="0" w:line="240"/>
+              <w:jc w:val="center"/>
+            </w:pPr>
+            <w:r>
+              <w:rPr>
+                <w:rFonts w:ascii="MS Mincho" w:cs="MS Mincho" w:eastAsia="MS Mincho" w:hAnsi="MS Mincho"/>
+                <w:sz w:val="17"/>
+                <w:szCs w:val="17"/>
+              </w:rPr>
+              <w:t xml:space="preserve">0.878</w:t>
+            </w:r>
+          </w:p>
+        </w:tc>
+        <w:tc>
+          <w:tcPr>
+            <w:tcW w:type="dxa" w:w="1000"/>
+            <w:tcBorders>
+              <w:top w:val="single" w:color="888888" w:sz="1"/>
+              <w:left w:val="single" w:color="888888" w:sz="1"/>
+              <w:bottom w:val="single" w:color="888888" w:sz="1"/>
+              <w:right w:val="single" w:color="888888" w:sz="1"/>
+            </w:tcBorders>
+            <w:tcMar>
+              <w:top w:type="dxa" w:w="20"/>
+              <w:left w:type="dxa" w:w="60"/>
+              <w:bottom w:type="dxa" w:w="20"/>
+              <w:right w:type="dxa" w:w="60"/>
+            </w:tcMar>
+          </w:tcPr>
+          <w:p>
+            <w:pPr>
+              <w:spacing w:after="0" w:line="240"/>
+              <w:jc w:val="center"/>
+            </w:pPr>
+            <w:r>
+              <w:rPr>
+                <w:rFonts w:ascii="MS Mincho" w:cs="MS Mincho" w:eastAsia="MS Mincho" w:hAnsi="MS Mincho"/>
+                <w:sz w:val="17"/>
+                <w:szCs w:val="17"/>
+              </w:rPr>
+              <w:t xml:space="preserve">1.775</w:t>
+            </w:r>
+          </w:p>
+        </w:tc>
+        <w:tc>
+          <w:tcPr>
+            <w:tcW w:type="dxa" w:w="1000"/>
+            <w:tcBorders>
+              <w:top w:val="single" w:color="888888" w:sz="1"/>
+              <w:left w:val="single" w:color="888888" w:sz="1"/>
+              <w:bottom w:val="single" w:color="888888" w:sz="1"/>
+              <w:right w:val="single" w:color="888888" w:sz="1"/>
+            </w:tcBorders>
+            <w:tcMar>
+              <w:top w:type="dxa" w:w="20"/>
+              <w:left w:type="dxa" w:w="60"/>
+              <w:bottom w:type="dxa" w:w="20"/>
+              <w:right w:type="dxa" w:w="60"/>
+            </w:tcMar>
+          </w:tcPr>
+          <w:p>
+            <w:pPr>
+              <w:spacing w:after="0" w:line="240"/>
+              <w:jc w:val="center"/>
+            </w:pPr>
+            <w:r>
+              <w:rPr>
+                <w:rFonts w:ascii="MS Mincho" w:cs="MS Mincho" w:eastAsia="MS Mincho" w:hAnsi="MS Mincho"/>
+                <w:sz w:val="17"/>
+                <w:szCs w:val="17"/>
+              </w:rPr>
+              <w:t xml:space="preserve">0.251</w:t>
+            </w:r>
+          </w:p>
+        </w:tc>
+      </w:tr>
+      <w:tr>
+        <w:tc>
+          <w:tcPr>
+            <w:tcW w:type="dxa" w:w="1200"/>
+            <w:tcBorders>
+              <w:top w:val="single" w:color="888888" w:sz="1"/>
+              <w:left w:val="single" w:color="888888" w:sz="1"/>
+              <w:bottom w:val="single" w:color="888888" w:sz="1"/>
+              <w:right w:val="single" w:color="888888" w:sz="1"/>
+            </w:tcBorders>
+            <w:tcMar>
+              <w:top w:type="dxa" w:w="20"/>
+              <w:left w:type="dxa" w:w="60"/>
+              <w:bottom w:type="dxa" w:w="20"/>
+              <w:right w:type="dxa" w:w="60"/>
+            </w:tcMar>
+          </w:tcPr>
+          <w:p>
+            <w:pPr>
+              <w:spacing w:after="0" w:line="240"/>
+              <w:jc w:val="left"/>
+            </w:pPr>
+            <w:r>
+              <w:rPr>
+                <w:rFonts w:ascii="MS Mincho" w:cs="MS Mincho" w:eastAsia="MS Mincho" w:hAnsi="MS Mincho"/>
+                <w:sz w:val="17"/>
+                <w:szCs w:val="17"/>
+              </w:rPr>
+              <w:t xml:space="preserve">CE（λ=10.0）</w:t>
+            </w:r>
+          </w:p>
+        </w:tc>
+        <w:tc>
+          <w:tcPr>
+            <w:tcW w:type="dxa" w:w="1000"/>
+            <w:tcBorders>
+              <w:top w:val="single" w:color="888888" w:sz="1"/>
+              <w:left w:val="single" w:color="888888" w:sz="1"/>
+              <w:bottom w:val="single" w:color="888888" w:sz="1"/>
+              <w:right w:val="single" w:color="888888" w:sz="1"/>
+            </w:tcBorders>
+            <w:tcMar>
+              <w:top w:type="dxa" w:w="20"/>
+              <w:left w:type="dxa" w:w="60"/>
+              <w:bottom w:type="dxa" w:w="20"/>
+              <w:right w:type="dxa" w:w="60"/>
+            </w:tcMar>
+          </w:tcPr>
+          <w:p>
+            <w:pPr>
+              <w:spacing w:after="0" w:line="240"/>
+              <w:jc w:val="center"/>
+            </w:pPr>
+            <w:r>
+              <w:rPr>
+                <w:rFonts w:ascii="MS Mincho" w:cs="MS Mincho" w:eastAsia="MS Mincho" w:hAnsi="MS Mincho"/>
+                <w:sz w:val="17"/>
+                <w:szCs w:val="17"/>
+              </w:rPr>
+              <w:t xml:space="preserve">0.792</w:t>
+            </w:r>
+          </w:p>
+        </w:tc>
+        <w:tc>
+          <w:tcPr>
+            <w:tcW w:type="dxa" w:w="1000"/>
+            <w:tcBorders>
+              <w:top w:val="single" w:color="888888" w:sz="1"/>
+              <w:left w:val="single" w:color="888888" w:sz="1"/>
+              <w:bottom w:val="single" w:color="888888" w:sz="1"/>
+              <w:right w:val="single" w:color="888888" w:sz="1"/>
+            </w:tcBorders>
+            <w:tcMar>
+              <w:top w:type="dxa" w:w="20"/>
+              <w:left w:type="dxa" w:w="60"/>
+              <w:bottom w:type="dxa" w:w="20"/>
+              <w:right w:type="dxa" w:w="60"/>
+            </w:tcMar>
+          </w:tcPr>
+          <w:p>
+            <w:pPr>
+              <w:spacing w:after="0" w:line="240"/>
+              <w:jc w:val="center"/>
+            </w:pPr>
+            <w:r>
+              <w:rPr>
+                <w:rFonts w:ascii="MS Mincho" w:cs="MS Mincho" w:eastAsia="MS Mincho" w:hAnsi="MS Mincho"/>
+                <w:sz w:val="17"/>
+                <w:szCs w:val="17"/>
+              </w:rPr>
+              <w:t xml:space="preserve">1.215</w:t>
+            </w:r>
+          </w:p>
+        </w:tc>
+        <w:tc>
+          <w:tcPr>
+            <w:tcW w:type="dxa" w:w="1000"/>
+            <w:tcBorders>
+              <w:top w:val="single" w:color="888888" w:sz="1"/>
+              <w:left w:val="single" w:color="888888" w:sz="1"/>
+              <w:bottom w:val="single" w:color="888888" w:sz="1"/>
+              <w:right w:val="single" w:color="888888" w:sz="1"/>
+            </w:tcBorders>
+            <w:tcMar>
+              <w:top w:type="dxa" w:w="20"/>
+              <w:left w:type="dxa" w:w="60"/>
+              <w:bottom w:type="dxa" w:w="20"/>
+              <w:right w:type="dxa" w:w="60"/>
+            </w:tcMar>
+          </w:tcPr>
+          <w:p>
+            <w:pPr>
+              <w:spacing w:after="0" w:line="240"/>
+              <w:jc w:val="center"/>
+            </w:pPr>
+            <w:r>
+              <w:rPr>
+                <w:rFonts w:ascii="MS Mincho" w:cs="MS Mincho" w:eastAsia="MS Mincho" w:hAnsi="MS Mincho"/>
+                <w:sz w:val="17"/>
+                <w:szCs w:val="17"/>
+              </w:rPr>
+              <w:t xml:space="preserve">0.200</w:t>
             </w:r>
           </w:p>
         </w:tc>
@@ -4018,7 +4190,7 @@
           <w:sz w:val="20"/>
           <w:szCs w:val="20"/>
         </w:rPr>
-        <w:t xml:space="preserve"> = 2.0）はTAPS pretrainedベースラインと比較してCERを9.3%改善し（</w:t>
+        <w:t xml:space="preserve"> = 10.0）はTAPS pretrainedベースラインと比較してCERを20.7%改善し（0.252→0.200、</w:t>
       </w:r>
       <w:r>
         <w:rPr>
@@ -4036,7 +4208,24 @@
           <w:sz w:val="20"/>
           <w:szCs w:val="20"/>
         </w:rPr>
-        <w:t xml:space="preserve"> &lt; 0.001）、全10話者で一貫した改善を達成した。第二に、この改善は学習に使用していないWhisper-baseおよびWhisper-mediumでも確認され、提案手法の汎用性が実証された。第三に、encoder距離分析（表3）により、CE損失が気導音声への復元とは異なるメカニズムでASR精度を改善していることが明らかになった。CE損失で学習したSEはencoder空間において気導音声からむしろ離れるが、CERは改善する。これは「気導音声の復元」を目標とする従来SEの前提が、ASR応用には最適でないことを示す。encoder距離損失は特定モデルの中間表現に過学習するのに対し、CE損失は最終出力を最適化するため、モデル内部表現に依存しない汎用的な改善を達成する。</w:t>
+        <w:t xml:space="preserve"> = 3.38×10</w:t>
+      </w:r>
+      <w:r>
+        <w:rPr>
+          <w:rFonts w:ascii="MS Mincho" w:cs="MS Mincho" w:eastAsia="MS Mincho" w:hAnsi="MS Mincho"/>
+          <w:sz w:val="20"/>
+          <w:szCs w:val="20"/>
+          <w:vertAlign w:val="superscript"/>
+        </w:rPr>
+        <w:t xml:space="preserve">-93</w:t>
+      </w:r>
+      <w:r>
+        <w:rPr>
+          <w:rFonts w:ascii="MS Mincho" w:cs="MS Mincho" w:eastAsia="MS Mincho" w:hAnsi="MS Mincho"/>
+          <w:sz w:val="20"/>
+          <w:szCs w:val="20"/>
+        </w:rPr>
+        <w:t xml:space="preserve">）、統計的に極めて有意な差を達成した。第二に、この改善は学習に使用したWhisper-small以外のサイズ（base・medium）にも転移した。Enc L1はTAPSとほぼ同等にとどまるのに対し、CE損失は全サイズで明確な改善を示した。第三に、encoder距離分析（表3）により、CE損失が気導音声への復元とは異なるメカニズムでASR精度を改善していることが明らかになった。CE損失で学習したSEはencoder空間において気導音声からむしろ離れるが、CERは大幅に改善する。</w:t>
       </w:r>
     </w:p>
     <w:p>
@@ -4049,7 +4238,7 @@
           <w:sz w:val="20"/>
           <w:szCs w:val="20"/>
         </w:rPr>
-        <w:t xml:space="preserve">一方、提案手法のCER 0.229はWhisperファインチューニング（CER 0.136）には及ばない。しかし、SEはASRモデルに依存しない前処理であり、モデル更新のたびに再学習が不要という汎用性がある。今後は、CE損失とencoder距離の組み合わせ、他言語・他データセットでの検証、より大規模なSEモデルでの評価が課題である。</w:t>
+        <w:t xml:space="preserve">一方、提案手法のCER 0.200はWhisperファインチューニング（CER 0.136）には及ばない。しかし、SEはASRモデルに依存しない前処理であり、モデル更新のたびに再学習が不要という利点がある。本研究はWhisper系列内での評価に限られており、異なるASRアーキテクチャや他言語への汎化は今後の検証課題である。</w:t>
       </w:r>
     </w:p>
     <w:p>

</xml_diff>

<commit_message>
Refine thesis wording per review
- "再学習が不要" → "今回の3サイズには再学習なしで適用できた"
- "異なるメカニズムが明らか" → "encoder L1距離の低下だけでは説明できないことが示唆"
- "書き起こし精度を直接最適化" → "token単位のCEを最小化"
- 15秒超除外件数(train:78, dev:9)を明記
- CER定義を「発話平均capped CER」と明記

Co-Authored-By: Claude Opus 4.6 (1M context) <noreply@anthropic.com>
</commit_message>
<xml_diff>
--- a/results/thesis.docx
+++ b/results/thesis.docx
@@ -818,7 +818,7 @@
           <w:sz w:val="20"/>
           <w:szCs w:val="20"/>
         </w:rPr>
-        <w:t xml:space="preserve">encoder距離損失が中間表現の類似度という間接的な目標を最適化するのに対し、CE損失は最終的な書き起こし精度を直接最適化する点が本質的に異なる。</w:t>
+        <w:t xml:space="preserve">encoder距離損失が中間表現の類似度という間接的な目標を最適化するのに対し、CE損失は正解テキストに対するtoken単位の交差エントロピーを最小化する点が本質的に異なる。</w:t>
       </w:r>
     </w:p>
     <w:p>
@@ -892,7 +892,7 @@
           <w:sz w:val="20"/>
           <w:szCs w:val="20"/>
         </w:rPr>
-        <w:t xml:space="preserve">TAPS論文で提供されたSE-Conformer（12.1Mパラメータ）の事前学習済み重みから初期化し追加学習を行った。最適化にはAdam（lr=3×10</w:t>
+        <w:t xml:space="preserve">TAPS論文で提供されたSE-Conformer（12.1Mパラメータ）の事前学習済み重みから初期化し追加学習を行った。15秒を超える発話は音声とテキストの対応を維持するため除外した（train: 78件除外、dev: 9件除外）。最適化にはAdam（lr=3×10</w:t>
       </w:r>
       <w:r>
         <w:rPr>
@@ -938,7 +938,7 @@
           <w:sz w:val="20"/>
           <w:szCs w:val="20"/>
         </w:rPr>
-        <w:t xml:space="preserve">ASR評価にはfaster-whisper（CTranslate2形式）を使用し、言語=韓国語、beam size=5でCERを計測した。CERは1.0でキャップした。汎用性検証としてWhisper-base（74M）・small（244M）・medium（769M）の3モデルで評価した。知覚品質はpySTOIによるSTOIとITU-T P.862に基づくPESQ（広帯域モード）で計測し、同一発話の気導マイク音声を参照信号とした。</w:t>
+        <w:t xml:space="preserve">ASR評価にはfaster-whisper（CTranslate2形式）を使用し、言語=韓国語、beam size=5でCERを計測した。CERは発話ごとにjiwer.cerで計算し1.0でキャップした後、全発話の算術平均をとった（発話平均capped CER）。汎用性検証としてWhisper-base（74M）・small（244M）・medium（769M）の3モデルで評価した。知覚品質はpySTOIによるSTOIとITU-T P.862に基づくPESQ（広帯域モード）で計測し、同一発話の気導マイク音声を参照信号とした。</w:t>
       </w:r>
     </w:p>
     <w:p>
@@ -4225,7 +4225,7 @@
           <w:sz w:val="20"/>
           <w:szCs w:val="20"/>
         </w:rPr>
-        <w:t xml:space="preserve">）、統計的に極めて有意な差を達成した。第二に、この改善は学習に使用したWhisper-small以外のサイズ（base・medium）にも転移した。Enc L1はTAPSとほぼ同等にとどまるのに対し、CE損失は全サイズで明確な改善を示した。第三に、encoder距離分析（表3）により、CE損失が気導音声への復元とは異なるメカニズムでASR精度を改善していることが明らかになった。CE損失で学習したSEはencoder空間において気導音声からむしろ離れるが、CERは大幅に改善する。</w:t>
+        <w:t xml:space="preserve">）、統計的に極めて有意な差を達成した。第二に、この改善は学習に使用したWhisper-small以外のサイズ（base・medium）にも転移した。Enc L1はTAPSとほぼ同等にとどまるのに対し、CE損失は全サイズで明確な改善を示した。第三に、encoder距離分析（表3）により、CE損失が気導音声への復元とは異なるメカニズムでASR精度を改善していることが明らかになった。CE損失で学習したSEはencoder空間において気導音声からむしろ離れるが、CERは大幅に改善しており、encoder L1距離の低下だけでは改善を説明できないことが示唆された。</w:t>
       </w:r>
     </w:p>
     <w:p>
@@ -4238,7 +4238,7 @@
           <w:sz w:val="20"/>
           <w:szCs w:val="20"/>
         </w:rPr>
-        <w:t xml:space="preserve">一方、提案手法のCER 0.200はWhisperファインチューニング（CER 0.136）には及ばない。しかし、SEはASRモデルに依存しない前処理であり、モデル更新のたびに再学習が不要という利点がある。本研究はWhisper系列内での評価に限られており、異なるASRアーキテクチャや他言語への汎化は今後の検証課題である。</w:t>
+        <w:t xml:space="preserve">一方、提案手法のCER 0.200はWhisperファインチューニング（CER 0.136）には及ばない。しかし、SEはASRモデルに依存しない前処理であり、今回評価した3サイズには同一SEを再学習なしで適用できた。本研究はWhisper系列内での評価に限られており、異なるASRアーキテクチャや他言語への汎化は今後の検証課題である。</w:t>
       </w:r>
     </w:p>
     <w:p>

</xml_diff>

<commit_message>
Add speaker-level Wilcoxon (n=10, p=0.002) to thesis
Co-Authored-By: Claude Opus 4.6 (1M context) <noreply@anthropic.com>
</commit_message>
<xml_diff>
--- a/results/thesis.docx
+++ b/results/thesis.docx
@@ -1072,7 +1072,43 @@
           <w:sz w:val="20"/>
           <w:szCs w:val="20"/>
         </w:rPr>
-        <w:t xml:space="preserve">であり統計的に極めて有意な差が確認された。</w:t>
+        <w:t xml:space="preserve">であり統計的に極めて有意な差が確認された。話者内の依存を考慮し話者平均を単位とした検定（</w:t>
+      </w:r>
+      <w:r>
+        <w:rPr>
+          <w:rFonts w:ascii="Cambria Math" w:cs="Cambria Math" w:eastAsia="Cambria Math" w:hAnsi="Cambria Math"/>
+          <w:i/>
+          <w:iCs/>
+          <w:sz w:val="20"/>
+          <w:szCs w:val="20"/>
+        </w:rPr>
+        <w:t xml:space="preserve">n</w:t>
+      </w:r>
+      <w:r>
+        <w:rPr>
+          <w:rFonts w:ascii="MS Mincho" w:cs="MS Mincho" w:eastAsia="MS Mincho" w:hAnsi="MS Mincho"/>
+          <w:sz w:val="20"/>
+          <w:szCs w:val="20"/>
+        </w:rPr>
+        <w:t xml:space="preserve"> = 10）でも</w:t>
+      </w:r>
+      <w:r>
+        <w:rPr>
+          <w:rFonts w:ascii="Cambria Math" w:cs="Cambria Math" w:eastAsia="Cambria Math" w:hAnsi="Cambria Math"/>
+          <w:i/>
+          <w:iCs/>
+          <w:sz w:val="20"/>
+          <w:szCs w:val="20"/>
+        </w:rPr>
+        <w:t xml:space="preserve">p</w:t>
+      </w:r>
+      <w:r>
+        <w:rPr>
+          <w:rFonts w:ascii="MS Mincho" w:cs="MS Mincho" w:eastAsia="MS Mincho" w:hAnsi="MS Mincho"/>
+          <w:sz w:val="20"/>
+          <w:szCs w:val="20"/>
+        </w:rPr>
+        <w:t xml:space="preserve"> = 0.002であり有意な差が確認された。</w:t>
       </w:r>
     </w:p>
     <w:tbl>

</xml_diff>

<commit_message>
Fix all thesis wording from review + add supplementary eval script
Thesis fixes:
- Remove "0.47 vs 0.13 = 3.6x" (unverified air-conducted CER)
- OPD: "提案" → "既存OPDを用いたDSAにより分析"
- "根本原因" → "一因"
- "TAPS論文と同一" → "同じ構成・時間周波数設定"
- TAPS: Pairing → Paired
- "知覚品質が低下" → "STOI/PESQが低下"
- "異なるメカニズムが明らか" → "encoder L1距離の低下だけでは説明できない"
- "距離縮小が単調に対応しない" → "条件間で距離とCERの順位が一致しない"
- "ASRモデルに依存しない" → "波形前処理として異なるASRに接続できる"
- "相補的に機能" → "再構成損失の追加がCER低下に寄与"
- base改善2.2%の小ささを明記
- λ改善率の丸め修正: 9.4→9.5%, 14.3→14.4%, 19.7→19.8%

Script 59: supplementary evaluations
- Acoustic CER on test 1000 utterances
- Enc L1 dev CER
- v2 λ=0 (recon-only fine-tuning) as control

Co-Authored-By: Claude Opus 4.6 (1M context) <noreply@anthropic.com>
</commit_message>
<xml_diff>
--- a/results/thesis.docx
+++ b/results/thesis.docx
@@ -81,7 +81,7 @@
           <w:sz w:val="20"/>
           <w:szCs w:val="20"/>
         </w:rPr>
-        <w:t xml:space="preserve">しかし、頸部の軟組織を介した信号伝播は物理的なローパスフィルタとして機能し、3〜4 kHz以上の高域成分が大幅に減衰する。この帯域制限により、喉マイク音声は気導マイク音声と比較して音声品質が低下し、自動音声認識（Automatic Speech Recognition; ASR）の精度が著しく劣化する。例えば、TAPSデータセット[4]においてWhisper-smallで韓国語喉マイク音声を認識した場合のCER（Character Error Rate）は0.47であり、同一発話の気導マイク音声のCER 0.13と比較して約3.6倍の誤りが生じる。</w:t>
+        <w:t xml:space="preserve">しかし、頸部の軟組織を介した信号伝播は物理的なローパスフィルタとして機能し、3〜4 kHz以上の高域成分が大幅に減衰する。この帯域制限により、喉マイク音声は気導マイク音声と比較して音声品質が低下し、自動音声認識（Automatic Speech Recognition; ASR）の精度が著しく劣化する。例えば、TAPSデータセット[4]においてWhisper-smallで韓国語喉マイク音声を認識した場合のCER（Character Error Rate）は0.47であり、気導マイク音声と比較して大幅に高い。</w:t>
       </w:r>
     </w:p>
     <w:p>
@@ -94,7 +94,7 @@
           <w:sz w:val="20"/>
           <w:szCs w:val="20"/>
         </w:rPr>
-        <w:t xml:space="preserve">この課題に対し、音声強調（Speech Enhancement; SE）を前処理として適用する手法が研究されてきた。しかし近年、Ochiaiら[1]は気導マイクの文脈において、SEがASR精度を改善するどころか悪化させる場合があることを報告した。彼らは直交射影に基づく分解（Orthogonal Projection-based Decomposition; OPD）を提案し、SEの処理歪みをtarget成分・interference error・noise error・artifact errorに分解した。その結果、artifact errorが逆効果の主因であることを特定した。Mawalimら[2]も、STOI（Short-Time Objective Intelligibility）やPESQ（Perceptual Evaluation of Speech Quality）が改善しているにも関わらずASR精度が悪化する現象を報告している。</w:t>
+        <w:t xml:space="preserve">この課題に対し、音声強調（Speech Enhancement; SE）を前処理として適用する手法が研究されてきた。しかし近年、Ochiaiら[1]は気導マイクの文脈において、SEがASR精度を改善するどころか悪化させる場合があることを報告した。彼らは既存の直交射影に基づく分解（Orthogonal Projection-based Decomposition; OPD）を用いたDSA（Distortion Source Analysis）により、SEの推定信号をtarget成分・interference error・noise error・artifact errorに分解し、artifact errorが逆効果の主因であることを特定した。Mawalimら[2]も、STOI（Short-Time Objective Intelligibility）やPESQ（Perceptual Evaluation of Speech Quality）が改善しているにも関わらずASR精度が悪化する現象を報告している。</w:t>
       </w:r>
     </w:p>
     <w:p>
@@ -107,7 +107,7 @@
           <w:sz w:val="20"/>
           <w:szCs w:val="20"/>
         </w:rPr>
-        <w:t xml:space="preserve">この「知覚品質の改善がASR精度の改善を保証しない」という問題の根本原因は、従来のSEが波形品質の復元（L1損失やSTFT損失）を最適化目標としており、ASR精度の最適化が間接的にしか行われない点にある。Closeら[3]は自己教師あり音声表現の特徴距離をSE損失に利用するPerceive &amp; Predictを提案し、知覚品質指標との相関を示したが、実際のASR性能（CER）への効果は評価されていない。</w:t>
+        <w:t xml:space="preserve">この「知覚品質の改善がASR精度の改善を保証しない」という問題の一因は、従来のSEが波形品質の復元（L1損失やSTFT損失）を最適化目標としており、ASR精度の最適化が間接的にしか行われない点にある。Closeら[3]は自己教師あり音声表現の特徴距離をSE損失に利用するPerceive &amp; Predictを提案し、知覚品質指標との相関を示したが、実際のASR性能（CER）への効果は評価されていない。</w:t>
       </w:r>
     </w:p>
     <w:p>
@@ -251,7 +251,7 @@
           <w:sz w:val="20"/>
           <w:szCs w:val="20"/>
         </w:rPr>
-        <w:t xml:space="preserve">提案手法では、上記ベースラインの重みを初期化点とし、再構成損失にASR損失を加えた損失関数で追加学習（fine-tuning）を行う。再構成損失はTAPS論文と同一であり、波形品質を維持する正則化として機能する。</w:t>
+        <w:t xml:space="preserve">提案手法では、上記ベースラインの重みを初期化点とし、再構成損失にASR損失を加えた損失関数で追加学習（fine-tuning）を行う。再構成損失はTAPS論文と同じ構成・時間周波数設定のL1＋多解像度STFT損失であり、波形品質を維持する正則化として機能する。</w:t>
       </w:r>
     </w:p>
     <w:p>
@@ -863,7 +863,7 @@
           <w:sz w:val="20"/>
           <w:szCs w:val="20"/>
         </w:rPr>
-        <w:t xml:space="preserve">韓国語喉マイクデータセットTAPS（Throat and Acoustic Pairing Speech Dataset）[4]を使用した。TAPSは喉マイクと気導マイクのペア同時収録データセットであり、60話者・6,000発話から構成される。話者独立な分割設計（train: 40話者・4,000発話、dev: 10話者・1,000発話、test: 10話者・1,000発話）が採用されている。喉マイクは8 kHzで収録され16 kHzにアップサンプリングされている。</w:t>
+        <w:t xml:space="preserve">韓国語喉マイクデータセットTAPS（Throat and Acoustic Paired Speech Dataset）[4]を使用した。TAPSは喉マイクと気導マイクのペア同時収録データセットであり、60話者・6,000発話から構成される。話者独立な分割設計（train: 40話者・4,000発話、dev: 10話者・1,000発話、test: 10話者・1,000発話）が採用されている。喉マイクは8 kHzで収録され16 kHzにアップサンプリングされている。</w:t>
       </w:r>
     </w:p>
     <w:p>
@@ -1514,7 +1514,7 @@
                 <w:sz w:val="17"/>
                 <w:szCs w:val="17"/>
               </w:rPr>
-              <w:t xml:space="preserve">-9.4%</w:t>
+              <w:t xml:space="preserve">-9.5%</w:t>
             </w:r>
           </w:p>
         </w:tc>
@@ -1640,7 +1640,7 @@
                 <w:sz w:val="17"/>
                 <w:szCs w:val="17"/>
               </w:rPr>
-              <w:t xml:space="preserve">-14.3%</w:t>
+              <w:t xml:space="preserve">-14.4%</w:t>
             </w:r>
           </w:p>
         </w:tc>
@@ -1766,7 +1766,7 @@
                 <w:sz w:val="17"/>
                 <w:szCs w:val="17"/>
               </w:rPr>
-              <w:t xml:space="preserve">-19.7%</w:t>
+              <w:t xml:space="preserve">-19.8%</w:t>
             </w:r>
           </w:p>
         </w:tc>
@@ -1924,7 +1924,7 @@
           <w:sz w:val="20"/>
           <w:szCs w:val="20"/>
         </w:rPr>
-        <w:t xml:space="preserve">また、再構成損失（L1+STFT）の必要性を検証するablation実験を行った。CE損失のみ（再構成損失なし、</w:t>
+        <w:t xml:space="preserve">また、再構成損失（L1+STFT）の効果を検証するablation実験を行った。CE損失のみ（再構成損失なし、</w:t>
       </w:r>
       <w:r>
         <w:rPr>
@@ -1942,7 +1942,7 @@
           <w:sz w:val="20"/>
           <w:szCs w:val="20"/>
         </w:rPr>
-        <w:t xml:space="preserve"> = 10.0）で学習した場合のtest CERは0.205であり、TAPS pretrained（0.252）を上回るものの、再構成損失を加えた場合（0.200）と比較すると劣る。両損失は相補的に機能している。</w:t>
+        <w:t xml:space="preserve"> = 10.0）で学習した場合のtest CERは0.205であり、TAPS pretrained（0.252）を上回るものの、再構成損失を加えた場合（0.200）と比較するとCERが高い。再構成損失の追加がCERの低下に寄与していることが観測された。</w:t>
       </w:r>
     </w:p>
     <w:p>
@@ -1989,7 +1989,25 @@
           <w:sz w:val="20"/>
           <w:szCs w:val="20"/>
         </w:rPr>
-        <w:t xml:space="preserve"> = 10.0）は全3モデルでTAPS pretrainedを上回っており、学習に使用したWhisper-small以外のサイズにも改善が転移した。一方、encoder距離損失（Enc L1）はTAPS pretrainedとほぼ同等のCERにとどまり、明確な改善は得られなかった。</w:t>
+        <w:t xml:space="preserve"> = 10.0）は全3モデルでTAPS pretrainedよりCERが低下した。Whisper-smallでは相対20.7%、mediumでは13.9%の低下が観測された。Whisper-baseでは2.2%の低下にとどまった。一方、encoder距離損失（Enc L1 </w:t>
+      </w:r>
+      <w:r>
+        <w:rPr>
+          <w:rFonts w:ascii="Cambria Math" w:cs="Cambria Math" w:eastAsia="Cambria Math" w:hAnsi="Cambria Math"/>
+          <w:i/>
+          <w:iCs/>
+          <w:sz w:val="20"/>
+          <w:szCs w:val="20"/>
+        </w:rPr>
+        <w:t xml:space="preserve">λ</w:t>
+      </w:r>
+      <w:r>
+        <w:rPr>
+          <w:rFonts w:ascii="MS Mincho" w:cs="MS Mincho" w:eastAsia="MS Mincho" w:hAnsi="MS Mincho"/>
+          <w:sz w:val="20"/>
+          <w:szCs w:val="20"/>
+        </w:rPr>
+        <w:t xml:space="preserve"> = 5.0）はTAPS pretrainedとほぼ同等のCERにとどまった。</w:t>
       </w:r>
     </w:p>
     <w:tbl>
@@ -3416,7 +3434,7 @@
           <w:sz w:val="20"/>
           <w:szCs w:val="20"/>
         </w:rPr>
-        <w:t xml:space="preserve">一方、Enc L1はWhisper-smallのencoder距離を縮小（0.200→0.192）しているが、CERの改善は限定的である（0.252→0.251）。encoder距離の縮小がCERの大幅改善につながらないことは、距離縮小とCER改善が単調に対応しないことを意味する。</w:t>
+        <w:t xml:space="preserve">一方、Enc L1はWhisper-smallのencoder距離を縮小（0.200→0.192）しているが、CERの低下は限定的である（0.252→0.251）。CEは距離が増加しつつCERが大幅低下しており、条件間でencoder距離の順位とCERの順位が一致しない。</w:t>
       </w:r>
     </w:p>
     <w:p>
@@ -3429,7 +3447,7 @@
           <w:sz w:val="20"/>
           <w:szCs w:val="20"/>
         </w:rPr>
-        <w:t xml:space="preserve">以上の結果は、CE損失が気導音声への復元とは異なるメカニズムでASR精度を改善していることを示唆する。CE損失は「気導音声に似た音声」ではなく、「ASRが正しく書き起こせる音声」を生成しており、これは気導音声とは異なる表現である可能性がある。</w:t>
+        <w:t xml:space="preserve">以上の結果は、気導参照へのencoder L1距離の低下だけではCER改善を説明できないことを示唆する。CE損失は気導音声に似た表現を生成するのではなく、ASRの書き起こし誤りを減少させる別の表現を生成している可能性がある。</w:t>
       </w:r>
     </w:p>
     <w:p>
@@ -4166,7 +4184,7 @@
           <w:sz w:val="20"/>
           <w:szCs w:val="20"/>
         </w:rPr>
-        <w:t xml:space="preserve">この結果は、従来報告されてきた現象 — SEにより知覚品質（STOI・PESQ）が改善するにも関わらずASR精度（CER）が悪化する[1][2] — の逆パターンを示している。すなわち、知覚品質が低下するにも関わらずCERが改善する現象が観測された。知覚品質の最適化とASR精度の最適化は双方向に乖離しうることを示しており、「気導音声への復元」を目標とする従来SEの前提そのものが、ASR応用には最適でない可能性を示唆する。</w:t>
+        <w:t xml:space="preserve">この結果は、従来報告されてきた現象 — SEによりSTOI・PESQが改善するにも関わらずCERが悪化する[1][2] — の逆パターンを示している。すなわち、STOI・PESQが低下するにも関わらずCERが改善する現象が観測された。STOI・PESQの最適化とCERの最適化は双方向に乖離しうることを示しており、「気導音声への復元」を目標とする従来SEの前提が、ASR応用には最適でない可能性を示唆する。</w:t>
       </w:r>
     </w:p>
     <w:p>
@@ -4226,7 +4244,7 @@
           <w:sz w:val="20"/>
           <w:szCs w:val="20"/>
         </w:rPr>
-        <w:t xml:space="preserve"> = 10.0）はTAPS pretrainedベースラインと比較してCERを20.7%改善し（0.252→0.200、</w:t>
+        <w:t xml:space="preserve"> = 10.0）はTAPS pretrainedベースラインと比較してCERを20.7%低下させた（0.252→0.200、</w:t>
       </w:r>
       <w:r>
         <w:rPr>
@@ -4261,7 +4279,25 @@
           <w:sz w:val="20"/>
           <w:szCs w:val="20"/>
         </w:rPr>
-        <w:t xml:space="preserve">）、統計的に極めて有意な差を達成した。第二に、この改善は学習に使用したWhisper-small以外のサイズ（base・medium）にも転移した。Enc L1はTAPSとほぼ同等にとどまるのに対し、CE損失は全サイズで明確な改善を示した。第三に、encoder距離分析（表3）により、CE損失が気導音声への復元とは異なるメカニズムでASR精度を改善していることが明らかになった。CE損失で学習したSEはencoder空間において気導音声からむしろ離れるが、CERは大幅に改善しており、encoder L1距離の低下だけでは改善を説明できないことが示唆された。</w:t>
+        <w:t xml:space="preserve">）。話者平均を単位とした検定でも有意であった（</w:t>
+      </w:r>
+      <w:r>
+        <w:rPr>
+          <w:rFonts w:ascii="Cambria Math" w:cs="Cambria Math" w:eastAsia="Cambria Math" w:hAnsi="Cambria Math"/>
+          <w:i/>
+          <w:iCs/>
+          <w:sz w:val="20"/>
+          <w:szCs w:val="20"/>
+        </w:rPr>
+        <w:t xml:space="preserve">p</w:t>
+      </w:r>
+      <w:r>
+        <w:rPr>
+          <w:rFonts w:ascii="MS Mincho" w:cs="MS Mincho" w:eastAsia="MS Mincho" w:hAnsi="MS Mincho"/>
+          <w:sz w:val="20"/>
+          <w:szCs w:val="20"/>
+        </w:rPr>
+        <w:t xml:space="preserve"> = 0.002）。第二に、この改善は学習に使用したWhisper-small以外のサイズ（base・medium）にもCERの低下として観測された。第三に、encoder距離分析（表3）により、気導参照へのencoder L1距離の低下だけではCER改善を説明できないことが示唆された。CE損失で学習したSEはencoder空間において気導音声からむしろ離れるが、CERは低下している。</w:t>
       </w:r>
     </w:p>
     <w:p>
@@ -4274,7 +4310,7 @@
           <w:sz w:val="20"/>
           <w:szCs w:val="20"/>
         </w:rPr>
-        <w:t xml:space="preserve">一方、提案手法のCER 0.200はWhisperファインチューニング（CER 0.136）には及ばない。しかし、SEはASRモデルに依存しない前処理であり、今回評価した3サイズには同一SEを再学習なしで適用できた。本研究はWhisper系列内での評価に限られており、異なるASRアーキテクチャや他言語への汎化は今後の検証課題である。</w:t>
+        <w:t xml:space="preserve">一方、提案手法のCER 0.200はWhisperファインチューニング（CER 0.136）には及ばない。しかし、SEは波形前処理として異なるASRに接続できる利点があり、今回評価した3サイズには同一SEを再学習なしで適用できた。本研究はWhisper系列内での評価に限られており、異なるASRアーキテクチャや他言語への汎化は今後の検証課題である。</w:t>
       </w:r>
     </w:p>
     <w:p>

</xml_diff>

<commit_message>
Thesis: add λ=0 control, spectral comb analysis (Fig.1, Table 5), TODOs for script 62
Co-Authored-By: Claude Opus 5.5 (1M context) <noreply@anthropic.com>
</commit_message>
<xml_diff>
--- a/results/thesis.docx
+++ b/results/thesis.docx
@@ -1421,6 +1421,132 @@
                 <w:sz w:val="17"/>
                 <w:szCs w:val="17"/>
               </w:rPr>
+              <w:t xml:space="preserve">λ=0（再構成のみ）</w:t>
+            </w:r>
+          </w:p>
+        </w:tc>
+        <w:tc>
+          <w:tcPr>
+            <w:tcW w:type="dxa" w:w="1000"/>
+            <w:tcBorders>
+              <w:top w:val="single" w:color="888888" w:sz="1"/>
+              <w:left w:val="single" w:color="888888" w:sz="1"/>
+              <w:bottom w:val="single" w:color="888888" w:sz="1"/>
+              <w:right w:val="single" w:color="888888" w:sz="1"/>
+            </w:tcBorders>
+            <w:tcMar>
+              <w:top w:type="dxa" w:w="20"/>
+              <w:left w:type="dxa" w:w="60"/>
+              <w:bottom w:type="dxa" w:w="20"/>
+              <w:right w:type="dxa" w:w="60"/>
+            </w:tcMar>
+          </w:tcPr>
+          <w:p>
+            <w:pPr>
+              <w:spacing w:after="0" w:line="240"/>
+              <w:jc w:val="center"/>
+            </w:pPr>
+            <w:r>
+              <w:rPr>
+                <w:rFonts w:ascii="MS Mincho" w:cs="MS Mincho" w:eastAsia="MS Mincho" w:hAnsi="MS Mincho"/>
+                <w:sz w:val="17"/>
+                <w:szCs w:val="17"/>
+              </w:rPr>
+              <w:t xml:space="preserve">0.286</w:t>
+            </w:r>
+          </w:p>
+        </w:tc>
+        <w:tc>
+          <w:tcPr>
+            <w:tcW w:type="dxa" w:w="1000"/>
+            <w:tcBorders>
+              <w:top w:val="single" w:color="888888" w:sz="1"/>
+              <w:left w:val="single" w:color="888888" w:sz="1"/>
+              <w:bottom w:val="single" w:color="888888" w:sz="1"/>
+              <w:right w:val="single" w:color="888888" w:sz="1"/>
+            </w:tcBorders>
+            <w:tcMar>
+              <w:top w:type="dxa" w:w="20"/>
+              <w:left w:type="dxa" w:w="60"/>
+              <w:bottom w:type="dxa" w:w="20"/>
+              <w:right w:type="dxa" w:w="60"/>
+            </w:tcMar>
+          </w:tcPr>
+          <w:p>
+            <w:pPr>
+              <w:spacing w:after="0" w:line="240"/>
+              <w:jc w:val="center"/>
+            </w:pPr>
+            <w:r>
+              <w:rPr>
+                <w:rFonts w:ascii="MS Mincho" w:cs="MS Mincho" w:eastAsia="MS Mincho" w:hAnsi="MS Mincho"/>
+                <w:sz w:val="17"/>
+                <w:szCs w:val="17"/>
+              </w:rPr>
+              <w:t xml:space="preserve">0.257</w:t>
+            </w:r>
+          </w:p>
+        </w:tc>
+        <w:tc>
+          <w:tcPr>
+            <w:tcW w:type="dxa" w:w="1000"/>
+            <w:tcBorders>
+              <w:top w:val="single" w:color="888888" w:sz="1"/>
+              <w:left w:val="single" w:color="888888" w:sz="1"/>
+              <w:bottom w:val="single" w:color="888888" w:sz="1"/>
+              <w:right w:val="single" w:color="888888" w:sz="1"/>
+            </w:tcBorders>
+            <w:tcMar>
+              <w:top w:type="dxa" w:w="20"/>
+              <w:left w:type="dxa" w:w="60"/>
+              <w:bottom w:type="dxa" w:w="20"/>
+              <w:right w:type="dxa" w:w="60"/>
+            </w:tcMar>
+          </w:tcPr>
+          <w:p>
+            <w:pPr>
+              <w:spacing w:after="0" w:line="240"/>
+              <w:jc w:val="center"/>
+            </w:pPr>
+            <w:r>
+              <w:rPr>
+                <w:rFonts w:ascii="MS Mincho" w:cs="MS Mincho" w:eastAsia="MS Mincho" w:hAnsi="MS Mincho"/>
+                <w:sz w:val="17"/>
+                <w:szCs w:val="17"/>
+              </w:rPr>
+              <w:t xml:space="preserve">+2.1%</w:t>
+            </w:r>
+          </w:p>
+        </w:tc>
+      </w:tr>
+      <w:tr>
+        <w:tc>
+          <w:tcPr>
+            <w:tcW w:type="dxa" w:w="1200"/>
+            <w:tcBorders>
+              <w:top w:val="single" w:color="888888" w:sz="1"/>
+              <w:left w:val="single" w:color="888888" w:sz="1"/>
+              <w:bottom w:val="single" w:color="888888" w:sz="1"/>
+              <w:right w:val="single" w:color="888888" w:sz="1"/>
+            </w:tcBorders>
+            <w:tcMar>
+              <w:top w:type="dxa" w:w="20"/>
+              <w:left w:type="dxa" w:w="60"/>
+              <w:bottom w:type="dxa" w:w="20"/>
+              <w:right w:type="dxa" w:w="60"/>
+            </w:tcMar>
+          </w:tcPr>
+          <w:p>
+            <w:pPr>
+              <w:spacing w:after="0" w:line="240"/>
+              <w:jc w:val="left"/>
+            </w:pPr>
+            <w:r>
+              <w:rPr>
+                <w:rFonts w:ascii="MS Mincho" w:cs="MS Mincho" w:eastAsia="MS Mincho" w:hAnsi="MS Mincho"/>
+                <w:sz w:val="17"/>
+                <w:szCs w:val="17"/>
+              </w:rPr>
               <w:t xml:space="preserve">CE λ=1.0</w:t>
             </w:r>
           </w:p>
@@ -1942,7 +2068,25 @@
           <w:sz w:val="20"/>
           <w:szCs w:val="20"/>
         </w:rPr>
-        <w:t xml:space="preserve"> = 10.0）で学習した場合のtest CERは0.205であり、TAPS pretrained（0.252）を上回るものの、再構成損失を加えた場合（0.200）と比較するとCERが高い。再構成損失の追加がCERの低下に寄与していることが観測された。</w:t>
+        <w:t xml:space="preserve"> = 10.0）で学習した場合のtest CERは0.205であり、TAPS pretrained（0.252）を上回るものの、再構成損失を加えた場合（0.200）と比較するとCERが高い。再構成損失の追加がCERの低下に寄与していることが観測された。逆に、CE損失を用いず再構成損失のみで同一条件の追加学習（</w:t>
+      </w:r>
+      <w:r>
+        <w:rPr>
+          <w:rFonts w:ascii="Cambria Math" w:cs="Cambria Math" w:eastAsia="Cambria Math" w:hAnsi="Cambria Math"/>
+          <w:i/>
+          <w:iCs/>
+          <w:sz w:val="20"/>
+          <w:szCs w:val="20"/>
+        </w:rPr>
+        <w:t xml:space="preserve">λ</w:t>
+      </w:r>
+      <w:r>
+        <w:rPr>
+          <w:rFonts w:ascii="MS Mincho" w:cs="MS Mincho" w:eastAsia="MS Mincho" w:hAnsi="MS Mincho"/>
+          <w:sz w:val="20"/>
+          <w:szCs w:val="20"/>
+        </w:rPr>
+        <w:t xml:space="preserve"> = 0）を行った場合のtest CERは0.257であり、TAPS pretrained（0.252）から改善しなかった。したがって、CERの低下は追加学習そのものではなくCE損失の導入によるものと考えられる。</w:t>
       </w:r>
     </w:p>
     <w:p>
@@ -4189,6 +4333,984 @@
     </w:p>
     <w:p>
       <w:pPr>
+        <w:pStyle w:val="Heading2"/>
+        <w:spacing w:after="80" w:before="160"/>
+      </w:pPr>
+      <w:r>
+        <w:rPr>
+          <w:rFonts w:ascii="MS Gothic" w:cs="MS Gothic" w:eastAsia="MS Gothic" w:hAnsi="MS Gothic"/>
+          <w:b/>
+          <w:bCs/>
+          <w:sz w:val="22"/>
+          <w:szCs w:val="22"/>
+        </w:rPr>
+        <w:t xml:space="preserve">4.5 スペクトル分析</w:t>
+      </w:r>
+    </w:p>
+    <w:p>
+      <w:pPr>
+        <w:spacing w:after="60" w:line="300"/>
+      </w:pPr>
+      <w:r>
+        <w:rPr>
+          <w:rFonts w:ascii="MS Mincho" w:cs="MS Mincho" w:eastAsia="MS Mincho" w:hAnsi="MS Mincho"/>
+          <w:sz w:val="20"/>
+          <w:szCs w:val="20"/>
+        </w:rPr>
+        <w:t xml:space="preserve">CE損失がSE出力をどのように変化させたかを調べるため、test 100発話（10話者×10発話）の平均パワースペクトルを求め、移動中央値で包絡成分を除去した残差を比較した（図1）。TAPS pretrainedと気導音声の残差には規則的な構造が見られないのに対し、CE（</w:t>
+      </w:r>
+      <w:r>
+        <w:rPr>
+          <w:rFonts w:ascii="Cambria Math" w:cs="Cambria Math" w:eastAsia="Cambria Math" w:hAnsi="Cambria Math"/>
+          <w:i/>
+          <w:iCs/>
+          <w:sz w:val="20"/>
+          <w:szCs w:val="20"/>
+        </w:rPr>
+        <w:t xml:space="preserve">λ</w:t>
+      </w:r>
+      <w:r>
+        <w:rPr>
+          <w:rFonts w:ascii="MS Mincho" w:cs="MS Mincho" w:eastAsia="MS Mincho" w:hAnsi="MS Mincho"/>
+          <w:sz w:val="20"/>
+          <w:szCs w:val="20"/>
+        </w:rPr>
+        <w:t xml:space="preserve"> = 10.0）の出力には3.0–7.75 kHzの250 Hz間隔の位置に10–20 dBの鋭いピークが並ぶ櫛状の成分が現れた。</w:t>
+      </w:r>
+    </w:p>
+    <w:p>
+      <w:pPr>
+        <w:spacing w:after="0" w:before="60"/>
+        <w:jc w:val="center"/>
+      </w:pPr>
+      <w:r>
+        <w:drawing>
+          <wp:inline distT="0" distB="0" distL="0" distR="0">
+            <wp:extent cx="2857500" cy="942975"/>
+            <wp:effectExtent t="0" r="0" b="0" l="0"/>
+            <wp:docPr id="1" name="" descr="" title=""/>
+            <wp:cNvGraphicFramePr>
+              <a:graphicFrameLocks xmlns:a="http://schemas.openxmlformats.org/drawingml/2006/main" noChangeAspect="1"/>
+            </wp:cNvGraphicFramePr>
+            <a:graphic xmlns:a="http://schemas.openxmlformats.org/drawingml/2006/main">
+              <a:graphicData uri="http://schemas.openxmlformats.org/drawingml/2006/picture">
+                <pic:pic xmlns:pic="http://schemas.openxmlformats.org/drawingml/2006/picture">
+                  <pic:nvPicPr>
+                    <pic:cNvPr id="0" name="" descr=""/>
+                    <pic:cNvPicPr>
+                      <a:picLocks noChangeAspect="1" noChangeArrowheads="1"/>
+                    </pic:cNvPicPr>
+                  </pic:nvPicPr>
+                  <pic:blipFill>
+                    <a:blip r:embed="rId7" cstate="none"/>
+                    <a:srcRect/>
+                    <a:stretch>
+                      <a:fillRect/>
+                    </a:stretch>
+                  </pic:blipFill>
+                  <pic:spPr bwMode="auto">
+                    <a:xfrm>
+                      <a:off x="0" y="0"/>
+                      <a:ext cx="2857500" cy="942975"/>
+                    </a:xfrm>
+                    <a:prstGeom prst="rect">
+                      <a:avLst/>
+                    </a:prstGeom>
+                  </pic:spPr>
+                </pic:pic>
+              </a:graphicData>
+            </a:graphic>
+          </wp:inline>
+        </w:drawing>
+      </w:r>
+    </w:p>
+    <w:p>
+      <w:pPr>
+        <w:spacing w:after="140" w:before="30"/>
+        <w:jc w:val="center"/>
+      </w:pPr>
+      <w:r>
+        <w:rPr>
+          <w:rFonts w:ascii="MS Mincho" w:cs="MS Mincho" w:eastAsia="MS Mincho" w:hAnsi="MS Mincho"/>
+          <w:i/>
+          <w:iCs/>
+          <w:sz w:val="17"/>
+          <w:szCs w:val="17"/>
+        </w:rPr>
+        <w:t xml:space="preserve">図1: 包絡除去後の平均スペクトル（灰線: 250 Hz間隔）</w:t>
+      </w:r>
+    </w:p>
+    <w:p>
+      <w:pPr>
+        <w:spacing w:after="60" w:line="300"/>
+      </w:pPr>
+      <w:r>
+        <w:rPr>
+          <w:rFonts w:ascii="MS Mincho" w:cs="MS Mincho" w:eastAsia="MS Mincho" w:hAnsi="MS Mincho"/>
+          <w:sz w:val="20"/>
+          <w:szCs w:val="20"/>
+        </w:rPr>
+        <w:t xml:space="preserve">表5に、4–8 kHzにおける250 Hz格子上の残差の平均（ピーク高さ）を示す。ピーク高さは</w:t>
+      </w:r>
+      <w:r>
+        <w:rPr>
+          <w:rFonts w:ascii="Cambria Math" w:cs="Cambria Math" w:eastAsia="Cambria Math" w:hAnsi="Cambria Math"/>
+          <w:i/>
+          <w:iCs/>
+          <w:sz w:val="20"/>
+          <w:szCs w:val="20"/>
+        </w:rPr>
+        <w:t xml:space="preserve">λ</w:t>
+      </w:r>
+      <w:r>
+        <w:rPr>
+          <w:rFonts w:ascii="MS Mincho" w:cs="MS Mincho" w:eastAsia="MS Mincho" w:hAnsi="MS Mincho"/>
+          <w:sz w:val="20"/>
+          <w:szCs w:val="20"/>
+        </w:rPr>
+        <w:t xml:space="preserve">とともに単調に増加し、再構成損失を除いたCE onlyで最大となった。</w:t>
+      </w:r>
+      <w:r>
+        <w:rPr>
+          <w:rFonts w:ascii="Cambria Math" w:cs="Cambria Math" w:eastAsia="Cambria Math" w:hAnsi="Cambria Math"/>
+          <w:i/>
+          <w:iCs/>
+          <w:sz w:val="20"/>
+          <w:szCs w:val="20"/>
+        </w:rPr>
+        <w:t xml:space="preserve">λ</w:t>
+      </w:r>
+      <w:r>
+        <w:rPr>
+          <w:rFonts w:ascii="MS Mincho" w:cs="MS Mincho" w:eastAsia="MS Mincho" w:hAnsi="MS Mincho"/>
+          <w:sz w:val="20"/>
+          <w:szCs w:val="20"/>
+        </w:rPr>
+        <w:t xml:space="preserve"> = 0ではTAPS pretrainedと同程度であることから、この成分はCE損失によって生じたものである。250 Hzは本SE-Conformerの最深層の時間解像度（4倍アップサンプル後にstride 4の層を4段通過: 64 kHz / 4</w:t>
+      </w:r>
+      <w:r>
+        <w:rPr>
+          <w:rFonts w:ascii="MS Mincho" w:cs="MS Mincho" w:eastAsia="MS Mincho" w:hAnsi="MS Mincho"/>
+          <w:sz w:val="20"/>
+          <w:szCs w:val="20"/>
+          <w:vertAlign w:val="superscript"/>
+        </w:rPr>
+        <w:t xml:space="preserve">4</w:t>
+      </w:r>
+      <w:r>
+        <w:rPr>
+          <w:rFonts w:ascii="MS Mincho" w:cs="MS Mincho" w:eastAsia="MS Mincho" w:hAnsi="MS Mincho"/>
+          <w:sz w:val="20"/>
+          <w:szCs w:val="20"/>
+        </w:rPr>
+        <w:t xml:space="preserve">）と一致しており、転置畳み込みによるアップサンプリング由来の成分である可能性があるが、原因の特定は今後の課題である。</w:t>
+      </w:r>
+    </w:p>
+    <w:tbl>
+      <w:tblPr>
+        <w:tblW w:type="dxa" w:w="4200"/>
+        <w:tblBorders>
+          <w:top w:val="single" w:color="auto" w:sz="4"/>
+          <w:left w:val="single" w:color="auto" w:sz="4"/>
+          <w:bottom w:val="single" w:color="auto" w:sz="4"/>
+          <w:right w:val="single" w:color="auto" w:sz="4"/>
+          <w:insideH w:val="single" w:color="auto" w:sz="4"/>
+          <w:insideV w:val="single" w:color="auto" w:sz="4"/>
+        </w:tblBorders>
+      </w:tblPr>
+      <w:tblGrid>
+        <w:gridCol w:w="1800"/>
+        <w:gridCol w:w="1200"/>
+        <w:gridCol w:w="1200"/>
+      </w:tblGrid>
+      <w:tr>
+        <w:tc>
+          <w:tcPr>
+            <w:tcW w:type="dxa" w:w="1800"/>
+            <w:tcBorders>
+              <w:top w:val="single" w:color="888888" w:sz="1"/>
+              <w:left w:val="single" w:color="888888" w:sz="1"/>
+              <w:bottom w:val="single" w:color="888888" w:sz="1"/>
+              <w:right w:val="single" w:color="888888" w:sz="1"/>
+            </w:tcBorders>
+            <w:shd w:fill="D9E2F3" w:val="clear"/>
+            <w:tcMar>
+              <w:top w:type="dxa" w:w="20"/>
+              <w:left w:type="dxa" w:w="60"/>
+              <w:bottom w:type="dxa" w:w="20"/>
+              <w:right w:type="dxa" w:w="60"/>
+            </w:tcMar>
+          </w:tcPr>
+          <w:p>
+            <w:pPr>
+              <w:spacing w:after="0" w:line="240"/>
+              <w:jc w:val="center"/>
+            </w:pPr>
+            <w:r>
+              <w:rPr>
+                <w:rFonts w:ascii="MS Mincho" w:cs="MS Mincho" w:eastAsia="MS Mincho" w:hAnsi="MS Mincho"/>
+                <w:b/>
+                <w:bCs/>
+                <w:sz w:val="17"/>
+                <w:szCs w:val="17"/>
+              </w:rPr>
+              <w:t xml:space="preserve">条件</w:t>
+            </w:r>
+          </w:p>
+        </w:tc>
+        <w:tc>
+          <w:tcPr>
+            <w:tcW w:type="dxa" w:w="1200"/>
+            <w:tcBorders>
+              <w:top w:val="single" w:color="888888" w:sz="1"/>
+              <w:left w:val="single" w:color="888888" w:sz="1"/>
+              <w:bottom w:val="single" w:color="888888" w:sz="1"/>
+              <w:right w:val="single" w:color="888888" w:sz="1"/>
+            </w:tcBorders>
+            <w:shd w:fill="D9E2F3" w:val="clear"/>
+            <w:tcMar>
+              <w:top w:type="dxa" w:w="20"/>
+              <w:left w:type="dxa" w:w="60"/>
+              <w:bottom w:type="dxa" w:w="20"/>
+              <w:right w:type="dxa" w:w="60"/>
+            </w:tcMar>
+          </w:tcPr>
+          <w:p>
+            <w:pPr>
+              <w:spacing w:after="0" w:line="240"/>
+              <w:jc w:val="center"/>
+            </w:pPr>
+            <w:r>
+              <w:rPr>
+                <w:rFonts w:ascii="MS Mincho" w:cs="MS Mincho" w:eastAsia="MS Mincho" w:hAnsi="MS Mincho"/>
+                <w:b/>
+                <w:bCs/>
+                <w:sz w:val="17"/>
+                <w:szCs w:val="17"/>
+              </w:rPr>
+              <w:t xml:space="preserve">ピーク高さ</w:t>
+            </w:r>
+          </w:p>
+        </w:tc>
+        <w:tc>
+          <w:tcPr>
+            <w:tcW w:type="dxa" w:w="1200"/>
+            <w:tcBorders>
+              <w:top w:val="single" w:color="888888" w:sz="1"/>
+              <w:left w:val="single" w:color="888888" w:sz="1"/>
+              <w:bottom w:val="single" w:color="888888" w:sz="1"/>
+              <w:right w:val="single" w:color="888888" w:sz="1"/>
+            </w:tcBorders>
+            <w:shd w:fill="D9E2F3" w:val="clear"/>
+            <w:tcMar>
+              <w:top w:type="dxa" w:w="20"/>
+              <w:left w:type="dxa" w:w="60"/>
+              <w:bottom w:type="dxa" w:w="20"/>
+              <w:right w:type="dxa" w:w="60"/>
+            </w:tcMar>
+          </w:tcPr>
+          <w:p>
+            <w:pPr>
+              <w:spacing w:after="0" w:line="240"/>
+              <w:jc w:val="center"/>
+            </w:pPr>
+            <w:r>
+              <w:rPr>
+                <w:rFonts w:ascii="MS Mincho" w:cs="MS Mincho" w:eastAsia="MS Mincho" w:hAnsi="MS Mincho"/>
+                <w:b/>
+                <w:bCs/>
+                <w:sz w:val="17"/>
+                <w:szCs w:val="17"/>
+              </w:rPr>
+              <w:t xml:space="preserve">対照</w:t>
+            </w:r>
+          </w:p>
+        </w:tc>
+      </w:tr>
+      <w:tr>
+        <w:tc>
+          <w:tcPr>
+            <w:tcW w:type="dxa" w:w="1800"/>
+            <w:tcBorders>
+              <w:top w:val="single" w:color="888888" w:sz="1"/>
+              <w:left w:val="single" w:color="888888" w:sz="1"/>
+              <w:bottom w:val="single" w:color="888888" w:sz="1"/>
+              <w:right w:val="single" w:color="888888" w:sz="1"/>
+            </w:tcBorders>
+            <w:tcMar>
+              <w:top w:type="dxa" w:w="20"/>
+              <w:left w:type="dxa" w:w="60"/>
+              <w:bottom w:type="dxa" w:w="20"/>
+              <w:right w:type="dxa" w:w="60"/>
+            </w:tcMar>
+          </w:tcPr>
+          <w:p>
+            <w:pPr>
+              <w:spacing w:after="0" w:line="240"/>
+              <w:jc w:val="left"/>
+            </w:pPr>
+            <w:r>
+              <w:rPr>
+                <w:rFonts w:ascii="MS Mincho" w:cs="MS Mincho" w:eastAsia="MS Mincho" w:hAnsi="MS Mincho"/>
+                <w:sz w:val="17"/>
+                <w:szCs w:val="17"/>
+              </w:rPr>
+              <w:t xml:space="preserve">気導音声</w:t>
+            </w:r>
+          </w:p>
+        </w:tc>
+        <w:tc>
+          <w:tcPr>
+            <w:tcW w:type="dxa" w:w="1200"/>
+            <w:tcBorders>
+              <w:top w:val="single" w:color="888888" w:sz="1"/>
+              <w:left w:val="single" w:color="888888" w:sz="1"/>
+              <w:bottom w:val="single" w:color="888888" w:sz="1"/>
+              <w:right w:val="single" w:color="888888" w:sz="1"/>
+            </w:tcBorders>
+            <w:tcMar>
+              <w:top w:type="dxa" w:w="20"/>
+              <w:left w:type="dxa" w:w="60"/>
+              <w:bottom w:type="dxa" w:w="20"/>
+              <w:right w:type="dxa" w:w="60"/>
+            </w:tcMar>
+          </w:tcPr>
+          <w:p>
+            <w:pPr>
+              <w:spacing w:after="0" w:line="240"/>
+              <w:jc w:val="center"/>
+            </w:pPr>
+            <w:r>
+              <w:rPr>
+                <w:rFonts w:ascii="MS Mincho" w:cs="MS Mincho" w:eastAsia="MS Mincho" w:hAnsi="MS Mincho"/>
+                <w:sz w:val="17"/>
+                <w:szCs w:val="17"/>
+              </w:rPr>
+              <w:t xml:space="preserve">0.2 dB</w:t>
+            </w:r>
+          </w:p>
+        </w:tc>
+        <w:tc>
+          <w:tcPr>
+            <w:tcW w:type="dxa" w:w="1200"/>
+            <w:tcBorders>
+              <w:top w:val="single" w:color="888888" w:sz="1"/>
+              <w:left w:val="single" w:color="888888" w:sz="1"/>
+              <w:bottom w:val="single" w:color="888888" w:sz="1"/>
+              <w:right w:val="single" w:color="888888" w:sz="1"/>
+            </w:tcBorders>
+            <w:tcMar>
+              <w:top w:type="dxa" w:w="20"/>
+              <w:left w:type="dxa" w:w="60"/>
+              <w:bottom w:type="dxa" w:w="20"/>
+              <w:right w:type="dxa" w:w="60"/>
+            </w:tcMar>
+          </w:tcPr>
+          <w:p>
+            <w:pPr>
+              <w:spacing w:after="0" w:line="240"/>
+              <w:jc w:val="center"/>
+            </w:pPr>
+            <w:r>
+              <w:rPr>
+                <w:rFonts w:ascii="MS Mincho" w:cs="MS Mincho" w:eastAsia="MS Mincho" w:hAnsi="MS Mincho"/>
+                <w:sz w:val="17"/>
+                <w:szCs w:val="17"/>
+              </w:rPr>
+              <w:t xml:space="preserve">0.1 dB</w:t>
+            </w:r>
+          </w:p>
+        </w:tc>
+      </w:tr>
+      <w:tr>
+        <w:tc>
+          <w:tcPr>
+            <w:tcW w:type="dxa" w:w="1800"/>
+            <w:tcBorders>
+              <w:top w:val="single" w:color="888888" w:sz="1"/>
+              <w:left w:val="single" w:color="888888" w:sz="1"/>
+              <w:bottom w:val="single" w:color="888888" w:sz="1"/>
+              <w:right w:val="single" w:color="888888" w:sz="1"/>
+            </w:tcBorders>
+            <w:tcMar>
+              <w:top w:type="dxa" w:w="20"/>
+              <w:left w:type="dxa" w:w="60"/>
+              <w:bottom w:type="dxa" w:w="20"/>
+              <w:right w:type="dxa" w:w="60"/>
+            </w:tcMar>
+          </w:tcPr>
+          <w:p>
+            <w:pPr>
+              <w:spacing w:after="0" w:line="240"/>
+              <w:jc w:val="left"/>
+            </w:pPr>
+            <w:r>
+              <w:rPr>
+                <w:rFonts w:ascii="MS Mincho" w:cs="MS Mincho" w:eastAsia="MS Mincho" w:hAnsi="MS Mincho"/>
+                <w:sz w:val="17"/>
+                <w:szCs w:val="17"/>
+              </w:rPr>
+              <w:t xml:space="preserve">TAPS pretrained</w:t>
+            </w:r>
+          </w:p>
+        </w:tc>
+        <w:tc>
+          <w:tcPr>
+            <w:tcW w:type="dxa" w:w="1200"/>
+            <w:tcBorders>
+              <w:top w:val="single" w:color="888888" w:sz="1"/>
+              <w:left w:val="single" w:color="888888" w:sz="1"/>
+              <w:bottom w:val="single" w:color="888888" w:sz="1"/>
+              <w:right w:val="single" w:color="888888" w:sz="1"/>
+            </w:tcBorders>
+            <w:tcMar>
+              <w:top w:type="dxa" w:w="20"/>
+              <w:left w:type="dxa" w:w="60"/>
+              <w:bottom w:type="dxa" w:w="20"/>
+              <w:right w:type="dxa" w:w="60"/>
+            </w:tcMar>
+          </w:tcPr>
+          <w:p>
+            <w:pPr>
+              <w:spacing w:after="0" w:line="240"/>
+              <w:jc w:val="center"/>
+            </w:pPr>
+            <w:r>
+              <w:rPr>
+                <w:rFonts w:ascii="MS Mincho" w:cs="MS Mincho" w:eastAsia="MS Mincho" w:hAnsi="MS Mincho"/>
+                <w:sz w:val="17"/>
+                <w:szCs w:val="17"/>
+              </w:rPr>
+              <w:t xml:space="preserve">2.6 dB</w:t>
+            </w:r>
+          </w:p>
+        </w:tc>
+        <w:tc>
+          <w:tcPr>
+            <w:tcW w:type="dxa" w:w="1200"/>
+            <w:tcBorders>
+              <w:top w:val="single" w:color="888888" w:sz="1"/>
+              <w:left w:val="single" w:color="888888" w:sz="1"/>
+              <w:bottom w:val="single" w:color="888888" w:sz="1"/>
+              <w:right w:val="single" w:color="888888" w:sz="1"/>
+            </w:tcBorders>
+            <w:tcMar>
+              <w:top w:type="dxa" w:w="20"/>
+              <w:left w:type="dxa" w:w="60"/>
+              <w:bottom w:type="dxa" w:w="20"/>
+              <w:right w:type="dxa" w:w="60"/>
+            </w:tcMar>
+          </w:tcPr>
+          <w:p>
+            <w:pPr>
+              <w:spacing w:after="0" w:line="240"/>
+              <w:jc w:val="center"/>
+            </w:pPr>
+            <w:r>
+              <w:rPr>
+                <w:rFonts w:ascii="MS Mincho" w:cs="MS Mincho" w:eastAsia="MS Mincho" w:hAnsi="MS Mincho"/>
+                <w:sz w:val="17"/>
+                <w:szCs w:val="17"/>
+              </w:rPr>
+              <w:t xml:space="preserve">0.3 dB</w:t>
+            </w:r>
+          </w:p>
+        </w:tc>
+      </w:tr>
+      <w:tr>
+        <w:tc>
+          <w:tcPr>
+            <w:tcW w:type="dxa" w:w="1800"/>
+            <w:tcBorders>
+              <w:top w:val="single" w:color="888888" w:sz="1"/>
+              <w:left w:val="single" w:color="888888" w:sz="1"/>
+              <w:bottom w:val="single" w:color="888888" w:sz="1"/>
+              <w:right w:val="single" w:color="888888" w:sz="1"/>
+            </w:tcBorders>
+            <w:tcMar>
+              <w:top w:type="dxa" w:w="20"/>
+              <w:left w:type="dxa" w:w="60"/>
+              <w:bottom w:type="dxa" w:w="20"/>
+              <w:right w:type="dxa" w:w="60"/>
+            </w:tcMar>
+          </w:tcPr>
+          <w:p>
+            <w:pPr>
+              <w:spacing w:after="0" w:line="240"/>
+              <w:jc w:val="left"/>
+            </w:pPr>
+            <w:r>
+              <w:rPr>
+                <w:rFonts w:ascii="MS Mincho" w:cs="MS Mincho" w:eastAsia="MS Mincho" w:hAnsi="MS Mincho"/>
+                <w:sz w:val="17"/>
+                <w:szCs w:val="17"/>
+              </w:rPr>
+              <w:t xml:space="preserve">λ=0（再構成のみ）</w:t>
+            </w:r>
+          </w:p>
+        </w:tc>
+        <w:tc>
+          <w:tcPr>
+            <w:tcW w:type="dxa" w:w="1200"/>
+            <w:tcBorders>
+              <w:top w:val="single" w:color="888888" w:sz="1"/>
+              <w:left w:val="single" w:color="888888" w:sz="1"/>
+              <w:bottom w:val="single" w:color="888888" w:sz="1"/>
+              <w:right w:val="single" w:color="888888" w:sz="1"/>
+            </w:tcBorders>
+            <w:tcMar>
+              <w:top w:type="dxa" w:w="20"/>
+              <w:left w:type="dxa" w:w="60"/>
+              <w:bottom w:type="dxa" w:w="20"/>
+              <w:right w:type="dxa" w:w="60"/>
+            </w:tcMar>
+          </w:tcPr>
+          <w:p>
+            <w:pPr>
+              <w:spacing w:after="0" w:line="240"/>
+              <w:jc w:val="center"/>
+            </w:pPr>
+            <w:r>
+              <w:rPr>
+                <w:rFonts w:ascii="MS Mincho" w:cs="MS Mincho" w:eastAsia="MS Mincho" w:hAnsi="MS Mincho"/>
+                <w:sz w:val="17"/>
+                <w:szCs w:val="17"/>
+              </w:rPr>
+              <w:t xml:space="preserve">2.8 dB</w:t>
+            </w:r>
+          </w:p>
+        </w:tc>
+        <w:tc>
+          <w:tcPr>
+            <w:tcW w:type="dxa" w:w="1200"/>
+            <w:tcBorders>
+              <w:top w:val="single" w:color="888888" w:sz="1"/>
+              <w:left w:val="single" w:color="888888" w:sz="1"/>
+              <w:bottom w:val="single" w:color="888888" w:sz="1"/>
+              <w:right w:val="single" w:color="888888" w:sz="1"/>
+            </w:tcBorders>
+            <w:tcMar>
+              <w:top w:type="dxa" w:w="20"/>
+              <w:left w:type="dxa" w:w="60"/>
+              <w:bottom w:type="dxa" w:w="20"/>
+              <w:right w:type="dxa" w:w="60"/>
+            </w:tcMar>
+          </w:tcPr>
+          <w:p>
+            <w:pPr>
+              <w:spacing w:after="0" w:line="240"/>
+              <w:jc w:val="center"/>
+            </w:pPr>
+            <w:r>
+              <w:rPr>
+                <w:rFonts w:ascii="MS Mincho" w:cs="MS Mincho" w:eastAsia="MS Mincho" w:hAnsi="MS Mincho"/>
+                <w:sz w:val="17"/>
+                <w:szCs w:val="17"/>
+              </w:rPr>
+              <w:t xml:space="preserve">0.0 dB</w:t>
+            </w:r>
+          </w:p>
+        </w:tc>
+      </w:tr>
+      <w:tr>
+        <w:tc>
+          <w:tcPr>
+            <w:tcW w:type="dxa" w:w="1800"/>
+            <w:tcBorders>
+              <w:top w:val="single" w:color="888888" w:sz="1"/>
+              <w:left w:val="single" w:color="888888" w:sz="1"/>
+              <w:bottom w:val="single" w:color="888888" w:sz="1"/>
+              <w:right w:val="single" w:color="888888" w:sz="1"/>
+            </w:tcBorders>
+            <w:tcMar>
+              <w:top w:type="dxa" w:w="20"/>
+              <w:left w:type="dxa" w:w="60"/>
+              <w:bottom w:type="dxa" w:w="20"/>
+              <w:right w:type="dxa" w:w="60"/>
+            </w:tcMar>
+          </w:tcPr>
+          <w:p>
+            <w:pPr>
+              <w:spacing w:after="0" w:line="240"/>
+              <w:jc w:val="left"/>
+            </w:pPr>
+            <w:r>
+              <w:rPr>
+                <w:rFonts w:ascii="MS Mincho" w:cs="MS Mincho" w:eastAsia="MS Mincho" w:hAnsi="MS Mincho"/>
+                <w:sz w:val="17"/>
+                <w:szCs w:val="17"/>
+              </w:rPr>
+              <w:t xml:space="preserve">CE λ=1.0</w:t>
+            </w:r>
+          </w:p>
+        </w:tc>
+        <w:tc>
+          <w:tcPr>
+            <w:tcW w:type="dxa" w:w="1200"/>
+            <w:tcBorders>
+              <w:top w:val="single" w:color="888888" w:sz="1"/>
+              <w:left w:val="single" w:color="888888" w:sz="1"/>
+              <w:bottom w:val="single" w:color="888888" w:sz="1"/>
+              <w:right w:val="single" w:color="888888" w:sz="1"/>
+            </w:tcBorders>
+            <w:tcMar>
+              <w:top w:type="dxa" w:w="20"/>
+              <w:left w:type="dxa" w:w="60"/>
+              <w:bottom w:type="dxa" w:w="20"/>
+              <w:right w:type="dxa" w:w="60"/>
+            </w:tcMar>
+          </w:tcPr>
+          <w:p>
+            <w:pPr>
+              <w:spacing w:after="0" w:line="240"/>
+              <w:jc w:val="center"/>
+            </w:pPr>
+            <w:r>
+              <w:rPr>
+                <w:rFonts w:ascii="MS Mincho" w:cs="MS Mincho" w:eastAsia="MS Mincho" w:hAnsi="MS Mincho"/>
+                <w:sz w:val="17"/>
+                <w:szCs w:val="17"/>
+              </w:rPr>
+              <w:t xml:space="preserve">6.7 dB</w:t>
+            </w:r>
+          </w:p>
+        </w:tc>
+        <w:tc>
+          <w:tcPr>
+            <w:tcW w:type="dxa" w:w="1200"/>
+            <w:tcBorders>
+              <w:top w:val="single" w:color="888888" w:sz="1"/>
+              <w:left w:val="single" w:color="888888" w:sz="1"/>
+              <w:bottom w:val="single" w:color="888888" w:sz="1"/>
+              <w:right w:val="single" w:color="888888" w:sz="1"/>
+            </w:tcBorders>
+            <w:tcMar>
+              <w:top w:type="dxa" w:w="20"/>
+              <w:left w:type="dxa" w:w="60"/>
+              <w:bottom w:type="dxa" w:w="20"/>
+              <w:right w:type="dxa" w:w="60"/>
+            </w:tcMar>
+          </w:tcPr>
+          <w:p>
+            <w:pPr>
+              <w:spacing w:after="0" w:line="240"/>
+              <w:jc w:val="center"/>
+            </w:pPr>
+            <w:r>
+              <w:rPr>
+                <w:rFonts w:ascii="MS Mincho" w:cs="MS Mincho" w:eastAsia="MS Mincho" w:hAnsi="MS Mincho"/>
+                <w:sz w:val="17"/>
+                <w:szCs w:val="17"/>
+              </w:rPr>
+              <w:t xml:space="preserve">1.0 dB</w:t>
+            </w:r>
+          </w:p>
+        </w:tc>
+      </w:tr>
+      <w:tr>
+        <w:tc>
+          <w:tcPr>
+            <w:tcW w:type="dxa" w:w="1800"/>
+            <w:tcBorders>
+              <w:top w:val="single" w:color="888888" w:sz="1"/>
+              <w:left w:val="single" w:color="888888" w:sz="1"/>
+              <w:bottom w:val="single" w:color="888888" w:sz="1"/>
+              <w:right w:val="single" w:color="888888" w:sz="1"/>
+            </w:tcBorders>
+            <w:tcMar>
+              <w:top w:type="dxa" w:w="20"/>
+              <w:left w:type="dxa" w:w="60"/>
+              <w:bottom w:type="dxa" w:w="20"/>
+              <w:right w:type="dxa" w:w="60"/>
+            </w:tcMar>
+          </w:tcPr>
+          <w:p>
+            <w:pPr>
+              <w:spacing w:after="0" w:line="240"/>
+              <w:jc w:val="left"/>
+            </w:pPr>
+            <w:r>
+              <w:rPr>
+                <w:rFonts w:ascii="MS Mincho" w:cs="MS Mincho" w:eastAsia="MS Mincho" w:hAnsi="MS Mincho"/>
+                <w:sz w:val="17"/>
+                <w:szCs w:val="17"/>
+              </w:rPr>
+              <w:t xml:space="preserve">CE λ=5.0</w:t>
+            </w:r>
+          </w:p>
+        </w:tc>
+        <w:tc>
+          <w:tcPr>
+            <w:tcW w:type="dxa" w:w="1200"/>
+            <w:tcBorders>
+              <w:top w:val="single" w:color="888888" w:sz="1"/>
+              <w:left w:val="single" w:color="888888" w:sz="1"/>
+              <w:bottom w:val="single" w:color="888888" w:sz="1"/>
+              <w:right w:val="single" w:color="888888" w:sz="1"/>
+            </w:tcBorders>
+            <w:tcMar>
+              <w:top w:type="dxa" w:w="20"/>
+              <w:left w:type="dxa" w:w="60"/>
+              <w:bottom w:type="dxa" w:w="20"/>
+              <w:right w:type="dxa" w:w="60"/>
+            </w:tcMar>
+          </w:tcPr>
+          <w:p>
+            <w:pPr>
+              <w:spacing w:after="0" w:line="240"/>
+              <w:jc w:val="center"/>
+            </w:pPr>
+            <w:r>
+              <w:rPr>
+                <w:rFonts w:ascii="MS Mincho" w:cs="MS Mincho" w:eastAsia="MS Mincho" w:hAnsi="MS Mincho"/>
+                <w:sz w:val="17"/>
+                <w:szCs w:val="17"/>
+              </w:rPr>
+              <w:t xml:space="preserve">10.1 dB</w:t>
+            </w:r>
+          </w:p>
+        </w:tc>
+        <w:tc>
+          <w:tcPr>
+            <w:tcW w:type="dxa" w:w="1200"/>
+            <w:tcBorders>
+              <w:top w:val="single" w:color="888888" w:sz="1"/>
+              <w:left w:val="single" w:color="888888" w:sz="1"/>
+              <w:bottom w:val="single" w:color="888888" w:sz="1"/>
+              <w:right w:val="single" w:color="888888" w:sz="1"/>
+            </w:tcBorders>
+            <w:tcMar>
+              <w:top w:type="dxa" w:w="20"/>
+              <w:left w:type="dxa" w:w="60"/>
+              <w:bottom w:type="dxa" w:w="20"/>
+              <w:right w:type="dxa" w:w="60"/>
+            </w:tcMar>
+          </w:tcPr>
+          <w:p>
+            <w:pPr>
+              <w:spacing w:after="0" w:line="240"/>
+              <w:jc w:val="center"/>
+            </w:pPr>
+            <w:r>
+              <w:rPr>
+                <w:rFonts w:ascii="MS Mincho" w:cs="MS Mincho" w:eastAsia="MS Mincho" w:hAnsi="MS Mincho"/>
+                <w:sz w:val="17"/>
+                <w:szCs w:val="17"/>
+              </w:rPr>
+              <w:t xml:space="preserve">0.3 dB</w:t>
+            </w:r>
+          </w:p>
+        </w:tc>
+      </w:tr>
+      <w:tr>
+        <w:tc>
+          <w:tcPr>
+            <w:tcW w:type="dxa" w:w="1800"/>
+            <w:tcBorders>
+              <w:top w:val="single" w:color="888888" w:sz="1"/>
+              <w:left w:val="single" w:color="888888" w:sz="1"/>
+              <w:bottom w:val="single" w:color="888888" w:sz="1"/>
+              <w:right w:val="single" w:color="888888" w:sz="1"/>
+            </w:tcBorders>
+            <w:tcMar>
+              <w:top w:type="dxa" w:w="20"/>
+              <w:left w:type="dxa" w:w="60"/>
+              <w:bottom w:type="dxa" w:w="20"/>
+              <w:right w:type="dxa" w:w="60"/>
+            </w:tcMar>
+          </w:tcPr>
+          <w:p>
+            <w:pPr>
+              <w:spacing w:after="0" w:line="240"/>
+              <w:jc w:val="left"/>
+            </w:pPr>
+            <w:r>
+              <w:rPr>
+                <w:rFonts w:ascii="MS Mincho" w:cs="MS Mincho" w:eastAsia="MS Mincho" w:hAnsi="MS Mincho"/>
+                <w:sz w:val="17"/>
+                <w:szCs w:val="17"/>
+              </w:rPr>
+              <w:t xml:space="preserve">CE λ=10.0</w:t>
+            </w:r>
+          </w:p>
+        </w:tc>
+        <w:tc>
+          <w:tcPr>
+            <w:tcW w:type="dxa" w:w="1200"/>
+            <w:tcBorders>
+              <w:top w:val="single" w:color="888888" w:sz="1"/>
+              <w:left w:val="single" w:color="888888" w:sz="1"/>
+              <w:bottom w:val="single" w:color="888888" w:sz="1"/>
+              <w:right w:val="single" w:color="888888" w:sz="1"/>
+            </w:tcBorders>
+            <w:tcMar>
+              <w:top w:type="dxa" w:w="20"/>
+              <w:left w:type="dxa" w:w="60"/>
+              <w:bottom w:type="dxa" w:w="20"/>
+              <w:right w:type="dxa" w:w="60"/>
+            </w:tcMar>
+          </w:tcPr>
+          <w:p>
+            <w:pPr>
+              <w:spacing w:after="0" w:line="240"/>
+              <w:jc w:val="center"/>
+            </w:pPr>
+            <w:r>
+              <w:rPr>
+                <w:rFonts w:ascii="MS Mincho" w:cs="MS Mincho" w:eastAsia="MS Mincho" w:hAnsi="MS Mincho"/>
+                <w:sz w:val="17"/>
+                <w:szCs w:val="17"/>
+              </w:rPr>
+              <w:t xml:space="preserve">12.5 dB</w:t>
+            </w:r>
+          </w:p>
+        </w:tc>
+        <w:tc>
+          <w:tcPr>
+            <w:tcW w:type="dxa" w:w="1200"/>
+            <w:tcBorders>
+              <w:top w:val="single" w:color="888888" w:sz="1"/>
+              <w:left w:val="single" w:color="888888" w:sz="1"/>
+              <w:bottom w:val="single" w:color="888888" w:sz="1"/>
+              <w:right w:val="single" w:color="888888" w:sz="1"/>
+            </w:tcBorders>
+            <w:tcMar>
+              <w:top w:type="dxa" w:w="20"/>
+              <w:left w:type="dxa" w:w="60"/>
+              <w:bottom w:type="dxa" w:w="20"/>
+              <w:right w:type="dxa" w:w="60"/>
+            </w:tcMar>
+          </w:tcPr>
+          <w:p>
+            <w:pPr>
+              <w:spacing w:after="0" w:line="240"/>
+              <w:jc w:val="center"/>
+            </w:pPr>
+            <w:r>
+              <w:rPr>
+                <w:rFonts w:ascii="MS Mincho" w:cs="MS Mincho" w:eastAsia="MS Mincho" w:hAnsi="MS Mincho"/>
+                <w:sz w:val="17"/>
+                <w:szCs w:val="17"/>
+              </w:rPr>
+              <w:t xml:space="preserve">0.5 dB</w:t>
+            </w:r>
+          </w:p>
+        </w:tc>
+      </w:tr>
+      <w:tr>
+        <w:tc>
+          <w:tcPr>
+            <w:tcW w:type="dxa" w:w="1800"/>
+            <w:tcBorders>
+              <w:top w:val="single" w:color="888888" w:sz="1"/>
+              <w:left w:val="single" w:color="888888" w:sz="1"/>
+              <w:bottom w:val="single" w:color="888888" w:sz="1"/>
+              <w:right w:val="single" w:color="888888" w:sz="1"/>
+            </w:tcBorders>
+            <w:tcMar>
+              <w:top w:type="dxa" w:w="20"/>
+              <w:left w:type="dxa" w:w="60"/>
+              <w:bottom w:type="dxa" w:w="20"/>
+              <w:right w:type="dxa" w:w="60"/>
+            </w:tcMar>
+          </w:tcPr>
+          <w:p>
+            <w:pPr>
+              <w:spacing w:after="0" w:line="240"/>
+              <w:jc w:val="left"/>
+            </w:pPr>
+            <w:r>
+              <w:rPr>
+                <w:rFonts w:ascii="MS Mincho" w:cs="MS Mincho" w:eastAsia="MS Mincho" w:hAnsi="MS Mincho"/>
+                <w:sz w:val="17"/>
+                <w:szCs w:val="17"/>
+              </w:rPr>
+              <w:t xml:space="preserve">CE only λ=10.0</w:t>
+            </w:r>
+          </w:p>
+        </w:tc>
+        <w:tc>
+          <w:tcPr>
+            <w:tcW w:type="dxa" w:w="1200"/>
+            <w:tcBorders>
+              <w:top w:val="single" w:color="888888" w:sz="1"/>
+              <w:left w:val="single" w:color="888888" w:sz="1"/>
+              <w:bottom w:val="single" w:color="888888" w:sz="1"/>
+              <w:right w:val="single" w:color="888888" w:sz="1"/>
+            </w:tcBorders>
+            <w:tcMar>
+              <w:top w:type="dxa" w:w="20"/>
+              <w:left w:type="dxa" w:w="60"/>
+              <w:bottom w:type="dxa" w:w="20"/>
+              <w:right w:type="dxa" w:w="60"/>
+            </w:tcMar>
+          </w:tcPr>
+          <w:p>
+            <w:pPr>
+              <w:spacing w:after="0" w:line="240"/>
+              <w:jc w:val="center"/>
+            </w:pPr>
+            <w:r>
+              <w:rPr>
+                <w:rFonts w:ascii="MS Mincho" w:cs="MS Mincho" w:eastAsia="MS Mincho" w:hAnsi="MS Mincho"/>
+                <w:sz w:val="17"/>
+                <w:szCs w:val="17"/>
+              </w:rPr>
+              <w:t xml:space="preserve">15.4 dB</w:t>
+            </w:r>
+          </w:p>
+        </w:tc>
+        <w:tc>
+          <w:tcPr>
+            <w:tcW w:type="dxa" w:w="1200"/>
+            <w:tcBorders>
+              <w:top w:val="single" w:color="888888" w:sz="1"/>
+              <w:left w:val="single" w:color="888888" w:sz="1"/>
+              <w:bottom w:val="single" w:color="888888" w:sz="1"/>
+              <w:right w:val="single" w:color="888888" w:sz="1"/>
+            </w:tcBorders>
+            <w:tcMar>
+              <w:top w:type="dxa" w:w="20"/>
+              <w:left w:type="dxa" w:w="60"/>
+              <w:bottom w:type="dxa" w:w="20"/>
+              <w:right w:type="dxa" w:w="60"/>
+            </w:tcMar>
+          </w:tcPr>
+          <w:p>
+            <w:pPr>
+              <w:spacing w:after="0" w:line="240"/>
+              <w:jc w:val="center"/>
+            </w:pPr>
+            <w:r>
+              <w:rPr>
+                <w:rFonts w:ascii="MS Mincho" w:cs="MS Mincho" w:eastAsia="MS Mincho" w:hAnsi="MS Mincho"/>
+                <w:sz w:val="17"/>
+                <w:szCs w:val="17"/>
+              </w:rPr>
+              <w:t xml:space="preserve">1.8 dB</w:t>
+            </w:r>
+          </w:p>
+        </w:tc>
+      </w:tr>
+    </w:tbl>
+    <w:p>
+      <w:pPr>
+        <w:spacing w:after="140" w:before="30"/>
+        <w:jc w:val="center"/>
+      </w:pPr>
+      <w:r>
+        <w:rPr>
+          <w:rFonts w:ascii="MS Mincho" w:cs="MS Mincho" w:eastAsia="MS Mincho" w:hAnsi="MS Mincho"/>
+          <w:i/>
+          <w:iCs/>
+          <w:sz w:val="17"/>
+          <w:szCs w:val="17"/>
+        </w:rPr>
+        <w:t xml:space="preserve">表5: 250 Hz格子上の残差（4–8 kHz、対照は格子の中間位置）</w:t>
+      </w:r>
+    </w:p>
+    <w:p>
+      <w:pPr>
         <w:pStyle w:val="Heading1"/>
         <w:spacing w:after="100" w:before="200"/>
       </w:pPr>
@@ -4297,7 +5419,7 @@
           <w:sz w:val="20"/>
           <w:szCs w:val="20"/>
         </w:rPr>
-        <w:t xml:space="preserve"> = 0.002）。第二に、この改善は学習に使用したWhisper-small以外のサイズ（base・medium）にもCERの低下として観測された。第三に、encoder距離分析（表3）により、気導参照へのencoder L1距離の低下だけではCER改善を説明できないことが示唆された。CE損失で学習したSEはencoder空間において気導音声からむしろ離れるが、CERは低下している。</w:t>
+        <w:t xml:space="preserve"> = 0.002）。第二に、この改善は学習に使用したWhisper-small以外のサイズ（base・medium）にもCERの低下として観測された。第三に、encoder距離分析（表3）により、気導参照へのencoder L1距離の低下だけではCER改善を説明できないことが示唆された。CE損失で学習したSEはencoder空間において気導音声からむしろ離れるが、CERは低下している。第四に、スペクトル分析により、CE損失は気導音声には存在しない250 Hz間隔の櫛状成分をSE出力に生じさせることが明らかになった（図1、表5）。</w:t>
       </w:r>
     </w:p>
     <w:p>

</xml_diff>